<commit_message>
Address verified BMT review and align manuscript disclosures
</commit_message>
<xml_diff>
--- a/manuscript/discovery_revision_20261027/BMT_Manuscript_Review.docx
+++ b/manuscript/discovery_revision_20261027/BMT_Manuscript_Review.docx
@@ -2,7 +2,7 @@
 <file path=word/document.xml><?xml version="1.0" encoding="utf-8"?>
 <w:document xmlns:w="http://schemas.openxmlformats.org/wordprocessingml/2006/main" xmlns:m="http://schemas.openxmlformats.org/officeDocument/2006/math" xmlns:r="http://schemas.openxmlformats.org/officeDocument/2006/relationships" xmlns:o="urn:schemas-microsoft-com:office:office" xmlns:v="urn:schemas-microsoft-com:vml" xmlns:w10="urn:schemas-microsoft-com:office:word" xmlns:a="http://schemas.openxmlformats.org/drawingml/2006/main" xmlns:pic="http://schemas.openxmlformats.org/drawingml/2006/picture" xmlns:wp="http://schemas.openxmlformats.org/drawingml/2006/wordprocessingDrawing">
   <w:body>
-    <w:bookmarkStart w:id="105" w:name="Xd5ee45a240f1906734d08c103182a2bfbacc3be"/>
+    <w:bookmarkStart w:id="107" w:name="Xd5ee45a240f1906734d08c103182a2bfbacc3be"/>
     <w:p>
       <w:pPr>
         <w:pStyle w:val="Heading1"/>
@@ -112,7 +112,7 @@
         <w:t xml:space="preserve"> </w:t>
       </w:r>
       <w:r>
-        <w:t xml:space="preserve">To quantify the additional value of spatial-filter refitting beyond classifier recalibration when approximately 20 current-session labels are available.</w:t>
+        <w:t xml:space="preserve">To quantify the added value of spatial-filter refitting beyond classifier recalibration with approximately 20 current-session labels.</w:t>
       </w:r>
     </w:p>
     <w:p>
@@ -130,7 +130,7 @@
         <w:t xml:space="preserve"> </w:t>
       </w:r>
       <w:r>
-        <w:t xml:space="preserve">We compared frozen common spatial patterns and linear discriminant analysis (CSP/LDA), classifier-only recalibration and full refitting in 18 participants across six Kumar2024 sessions. The predefined primary cohort contained 12 participants. Both updating methods used identical source and current-session labels. Later component experiments used the six previously exposed development participants.</w:t>
+        <w:t xml:space="preserve">We compared frozen common spatial patterns and linear discriminant analysis (CSP/LDA), classifier-only recalibration and full refitting in 18 participants across six Kumar2024 sessions. The predefined primary cohort contained 12 participants. The two updating methods received identical source and current-session labels. Later component experiments used the six development participants.</w:t>
       </w:r>
     </w:p>
     <w:p>
@@ -148,7 +148,7 @@
         <w:t xml:space="preserve"> </w:t>
       </w:r>
       <w:r>
-        <w:t xml:space="preserve">Full refitting achieved 65.36% balanced accuracy, exceeding freezing by 7.42 percentage points (95% participant-bootstrap interval 2.49–12.48). The secondary, matched-label full-minus-classifier-only gain was 5.47 points (2.17–8.91), accounting for 73.7% of the mean total gain. It was positive in ten of 12 participant averages and all five target-session averages. Neural adaptation with fixed normalization exceeded adaptive normalization by 1.50–1.91 points at the 20-label cap, with different smaller-budget profiles. The geometric candidate underperformed ordinary tangent refitting and Euclidean-aligned CSP; source-functional constraints added little benefit.</w:t>
+        <w:t xml:space="preserve">Full refitting achieved 65.36% balanced accuracy, 7.42 percentage points above freezing (95% participant-bootstrap interval 2.49–12.48). The secondary, matched-label full-minus-classifier-only gain was 5.47 points (2.17–8.91), accounting for 73.7% of the mean total gain. It was positive in ten of 12 participant averages and all five target-session averages. At the 20-label cap, fixed-normalization neural adaptation was 1.50–1.91 points higher than adaptive normalization and produced fewer single-class predictions. Smaller-budget profiles differed. Strong-reference comparisons favored simpler geometric decoders; source-functional constraints changed accuracy little.</w:t>
       </w:r>
     </w:p>
     <w:p>
@@ -166,7 +166,7 @@
         <w:t xml:space="preserve"> </w:t>
       </w:r>
       <w:r>
-        <w:t xml:space="preserve">Spatial-filter refitting supplied most of the observed recalibration gain under matched labels. The component comparisons identify spatial updating and normalization mode as distinct design choices for limited-label longitudinal decoding.</w:t>
+        <w:t xml:space="preserve">Matched-label component analysis identified spatial-filter refitting as the main contributor to the observed recalibration gain. It separates the value of updating the representation from the value of recalibrating its classifier.</w:t>
       </w:r>
     </w:p>
     <w:p>
@@ -202,7 +202,7 @@
         <w:pStyle w:val="FirstParagraph"/>
       </w:pPr>
       <w:r>
-        <w:t xml:space="preserve">A longitudinal motor-imagery brain–computer interface (BCI) must use a short run of new labeled EEG effectively. Between-session changes can affect signal distributions, spatial representations and class decisions. Calibration can update the classifier, the representation, or both, with each fitted component depending on a small number of new observations</w:t>
+        <w:t xml:space="preserve">A decoder trained in the first Kumar2024 session must serve five later sessions. At the start of each later session, a short calibration run supplies only 19 or 20 complete labeled trials. Should these labels recalibrate the classifier, relearn its spatial filters, or update both? This practical choice links longitudinal motor-imagery brain–computer interfaces (BCIs) to the limited-sample estimation problem: each updated component must be learned from the available new observations</w:t>
       </w:r>
       <w:r>
         <w:t xml:space="preserve"> </w:t>
@@ -219,7 +219,7 @@
         <w:pStyle w:val="BodyText"/>
       </w:pPr>
       <w:r>
-        <w:t xml:space="preserve">Common spatial patterns (CSP) and linear discriminant analysis (LDA) make these choices directly testable</w:t>
+        <w:t xml:space="preserve">Common spatial patterns (CSP) and linear discriminant analysis (LDA) make the component question directly testable</w:t>
       </w:r>
       <w:r>
         <w:t xml:space="preserve"> </w:t>
@@ -228,7 +228,7 @@
         <w:t xml:space="preserve">[2, 3]</w:t>
       </w:r>
       <w:r>
-        <w:t xml:space="preserve">. CSP extracts class-discriminative spatial power features; LDA maps them to decisions. Re-estimating LDA changes classification in the source feature space. Refitting both stages also changes that space. When the two updates receive identical labels, their difference quantifies the added spatial update within the pipeline.</w:t>
+        <w:t xml:space="preserve">. CSP extracts class-discriminative spatial power features; LDA maps them to decisions. Re-estimating LDA changes classification in the source feature space. Refitting both stages also changes that space. Giving the two updates identical labels isolates the added spatial update within the evaluated pipeline. The distinction matters for the broader instruction to adapt a representation: supervised spatial-filter refitting and repeated neural normalization are different operations with different estimation demands.</w:t>
       </w:r>
     </w:p>
     <w:p>
@@ -254,15 +254,15 @@
         <w:t xml:space="preserve">[9, 10]</w:t>
       </w:r>
       <w:r>
-        <w:t xml:space="preserve">. These precedents motivate a component question: how much does relearning spatial filters contribute when classifier recalibration already receives the same new labels?</w:t>
-      </w:r>
-    </w:p>
-    <w:p>
-      <w:pPr>
-        <w:pStyle w:val="BodyText"/>
-      </w:pPr>
-      <w:r>
-        <w:t xml:space="preserve">Neural adaptation introduces further choices. Updating weights can accompany changes in normalization statistics, affine parameters and Dropout. Adaptive batch normalization (BN) is established</w:t>
+        <w:t xml:space="preserve">. These precedents motivate a quantitative question: how much does relearning spatial filters add when classifier recalibration already receives the same new labels?</w:t>
+      </w:r>
+    </w:p>
+    <w:p>
+      <w:pPr>
+        <w:pStyle w:val="BodyText"/>
+      </w:pPr>
+      <w:r>
+        <w:t xml:space="preserve">Kozyrskiy et al. benchmarked label-revealed online updates across four EEG datasets</w:t>
       </w:r>
       <w:r>
         <w:t xml:space="preserve"> </w:t>
@@ -271,13 +271,30 @@
         <w:t xml:space="preserve">[11]</w:t>
       </w:r>
       <w:r>
+        <w:t xml:space="preserve">. Their prequential procedure predicts a trial, reveals its label, then refits CSP or Riemannian pipelines using expanding, rolling or cold-start histories. Here, each later session is recalibrated from the source-training set and a fixed current-session support run, and full CSP/LDA refitting is compared directly with LDA-only recalibration using identical trial identities. The online benchmark evaluates how revealed label histories support continuing updates; our fixed-budget comparison measures the additional spatial component.</w:t>
+      </w:r>
+    </w:p>
+    <w:p>
+      <w:pPr>
+        <w:pStyle w:val="BodyText"/>
+      </w:pPr>
+      <w:r>
+        <w:t xml:space="preserve">Neural adaptation introduces further choices. Weight updates can accompany changes in normalization statistics, affine parameters and Dropout. Adaptive batch normalization (BN) is established</w:t>
+      </w:r>
+      <w:r>
+        <w:t xml:space="preserve"> </w:t>
+      </w:r>
+      <w:r>
+        <w:t xml:space="preserve">[12]</w:t>
+      </w:r>
+      <w:r>
         <w:t xml:space="preserve">, and longitudinal EEG studies have combined fine-tuning with alignment and normalization updates</w:t>
       </w:r>
       <w:r>
         <w:t xml:space="preserve"> </w:t>
       </w:r>
       <w:r>
-        <w:t xml:space="preserve">[12]</w:t>
+        <w:t xml:space="preserve">[13]</w:t>
       </w:r>
       <w:r>
         <w:t xml:space="preserve">. Weight and functional constraints offer other ways to preserve source information</w:t>
@@ -286,18 +303,100 @@
         <w:t xml:space="preserve"> </w:t>
       </w:r>
       <w:r>
-        <w:t xml:space="preserve">[13–15]</w:t>
-      </w:r>
-      <w:r>
-        <w:t xml:space="preserve">. Separating these actions helps explain which part of adaptation delivers a gain.</w:t>
-      </w:r>
-    </w:p>
-    <w:p>
-      <w:pPr>
-        <w:pStyle w:val="BodyText"/>
-      </w:pPr>
-      <w:r>
-        <w:t xml:space="preserve">We first compared frozen CSP/LDA, LDA-only recalibration and full refitting across six Kumar2024 sessions. Both updates used 40 source-training labels and 19 or 20 current-session labels. The predefined primary contrast was full refitting versus freezing in a 12-participant cohort; full versus LDA-only was secondary. We then examined conventional alignment, geometric estimation and controlled neural modes in the six previously exposed development participants. The paper connects the matched-label spatial gain to its prediction transitions and longitudinal consistency, while the later experiments locate useful normalization choices and the limits of added candidate machinery.</w:t>
+        <w:t xml:space="preserve">[14–16]</w:t>
+      </w:r>
+      <w:r>
+        <w:t xml:space="preserve">. Explicitly separating these actions helps explain the resulting predictions.</w:t>
+      </w:r>
+    </w:p>
+    <w:p>
+      <w:pPr>
+        <w:pStyle w:val="BodyText"/>
+      </w:pPr>
+      <w:r>
+        <w:t xml:space="preserve">We use</w:t>
+      </w:r>
+      <w:r>
+        <w:t xml:space="preserve"> </w:t>
+      </w:r>
+      <w:r>
+        <w:rPr>
+          <w:b/>
+          <w:bCs/>
+        </w:rPr>
+        <w:t xml:space="preserve">matched-label component analysis</w:t>
+      </w:r>
+      <w:r>
+        <w:t xml:space="preserve"> </w:t>
+      </w:r>
+      <w:r>
+        <w:t xml:space="preserve">to connect three contributions:</w:t>
+      </w:r>
+    </w:p>
+    <w:p>
+      <w:pPr>
+        <w:pStyle w:val="Compact"/>
+        <w:numPr>
+          <w:ilvl w:val="0"/>
+          <w:numId w:val="1001"/>
+        </w:numPr>
+      </w:pPr>
+      <w:r>
+        <w:rPr>
+          <w:b/>
+          <w:bCs/>
+        </w:rPr>
+        <w:t xml:space="preserve">A controlled spatial-component comparison.</w:t>
+      </w:r>
+      <w:r>
+        <w:t xml:space="preserve"> </w:t>
+      </w:r>
+      <w:r>
+        <w:t xml:space="preserve">LDA-only recalibration and full CSP/LDA refitting use the same 40 source-training labels, 19 or 20 current-session labels and query trials. Their difference measures the additional spatial update after classifier recalibration. A separate frozen arm measures the total benefit of receiving support labels and refitting.</w:t>
+      </w:r>
+    </w:p>
+    <w:p>
+      <w:pPr>
+        <w:pStyle w:val="Compact"/>
+        <w:numPr>
+          <w:ilvl w:val="0"/>
+          <w:numId w:val="1001"/>
+        </w:numPr>
+      </w:pPr>
+      <w:r>
+        <w:rPr>
+          <w:b/>
+          <w:bCs/>
+        </w:rPr>
+        <w:t xml:space="preserve">Prediction-level and longitudinal attribution.</w:t>
+      </w:r>
+      <w:r>
+        <w:t xml:space="preserve"> </w:t>
+      </w:r>
+      <w:r>
+        <w:t xml:space="preserve">Corrected and newly introduced errors reconstruct the component gain, while class recalls, target-session profiles and participant-deletion summaries locate that gain across the longitudinal data. The original full-minus-frozen comparison remains primary and full-minus-LDA-only secondary.</w:t>
+      </w:r>
+    </w:p>
+    <w:p>
+      <w:pPr>
+        <w:pStyle w:val="Compact"/>
+        <w:numPr>
+          <w:ilvl w:val="0"/>
+          <w:numId w:val="1001"/>
+        </w:numPr>
+      </w:pPr>
+      <w:r>
+        <w:rPr>
+          <w:b/>
+          <w:bCs/>
+        </w:rPr>
+        <w:t xml:space="preserve">Matched mechanism controls.</w:t>
+      </w:r>
+      <w:r>
+        <w:t xml:space="preserve"> </w:t>
+      </w:r>
+      <w:r>
+        <w:t xml:space="preserve">Conventional alignment, geometric uncertainty and neural update modes test which additional operations affect decoding under explicit information budgets. Complete strong-reference and ablation results connect the spatial gain to practical update choices.</w:t>
       </w:r>
     </w:p>
     <w:bookmarkEnd w:id="21"/>
@@ -330,7 +429,7 @@
         <w:t xml:space="preserve"> </w:t>
       </w:r>
       <w:r>
-        <w:t xml:space="preserve">[16]</w:t>
+        <w:t xml:space="preserve">[17]</w:t>
       </w:r>
       <w:r>
         <w:t xml:space="preserve">, associated with the original study and its correction</w:t>
@@ -372,7 +471,7 @@
         <w:t xml:space="preserve"> </w:t>
       </w:r>
       <w:r>
-        <w:t xml:space="preserve">[17]</w:t>
+        <w:t xml:space="preserve">[18]</w:t>
       </w:r>
       <w:r>
         <w:t xml:space="preserve">. It used lawfully obtained publicly available data, caused no harm to participants, and did not involve sensitive personal information or commercial interests.</w:t>
@@ -415,7 +514,7 @@
         <w:t xml:space="preserve"> </w:t>
       </w:r>
       <w:r>
-        <w:t xml:space="preserve">[18]</w:t>
+        <w:t xml:space="preserve">[19]</w:t>
       </w:r>
       <w:r>
         <w:t xml:space="preserve">; the documented MOABB adapter maps cues to a [0, 5]-second interval</w:t>
@@ -424,18 +523,18 @@
         <w:t xml:space="preserve"> </w:t>
       </w:r>
       <w:r>
-        <w:t xml:space="preserve">[19]</w:t>
-      </w:r>
-      <w:r>
-        <w:t xml:space="preserve">. The original procedure included a 1.5-second cue preceding feedback and variable online feedback duration. Our endpoint is therefore task-label decoding over released cue-anchored windows. Full trial-level phase composition remained unresolved.</w:t>
-      </w:r>
-    </w:p>
-    <w:p>
-      <w:pPr>
-        <w:pStyle w:val="BodyText"/>
-      </w:pPr>
-      <w:r>
-        <w:t xml:space="preserve">Preprocessing used common-average referencing across 22 channels, fourth-order 8–30 Hz zero-phase Butterworth filtering, and resampling from 512 to 128 Hz, yielding 22×640 float32 values in volts. Learned transforms used training partitions.</w:t>
+        <w:t xml:space="preserve">[20]</w:t>
+      </w:r>
+      <w:r>
+        <w:t xml:space="preserve">. The original procedure included a 1.5-second cue preceding feedback and variable online feedback duration. Our endpoint is therefore task-label decoding over released cue-anchored windows. Original trial-level task-end and feedback markers were unavailable for phase reconstruction.</w:t>
+      </w:r>
+    </w:p>
+    <w:p>
+      <w:pPr>
+        <w:pStyle w:val="BodyText"/>
+      </w:pPr>
+      <w:r>
+        <w:t xml:space="preserve">Preprocessing used common-average referencing across 22 channels, fourth-order 8–30 Hz zero-phase Butterworth filtering, and resampling from 512 to 128 Hz, producing 22×640 float32 values in volts. Learned transforms used training partitions.</w:t>
       </w:r>
     </w:p>
     <w:p>
@@ -475,7 +574,7 @@
         <w:t xml:space="preserve"> </w:t>
       </w:r>
       <w:r>
-        <w:t xml:space="preserve">[20]</w:t>
+        <w:t xml:space="preserve">[21]</w:t>
       </w:r>
       <w:r>
         <w:t xml:space="preserve">. Frozen decoding used 40 source-training trials. LDA-only retained source CSP and refitted LDA on source training plus current support; full refitting re-estimated both components on that same union. Their difference measures the added spatial update and classifier fit in the revised feature space.</w:t>
@@ -492,7 +591,7 @@
         <w:t xml:space="preserve"> </w:t>
       </w:r>
       <w:r>
-        <w:t xml:space="preserve">[21, 22]</w:t>
+        <w:t xml:space="preserve">[22, 23]</w:t>
       </w:r>
       <w:r>
         <w:t xml:space="preserve">. All 54 models and seed outcomes were retained. The HPC extension used the separately specified compact architecture below.</w:t>
@@ -507,13 +606,13 @@
       </w:r>
     </w:p>
     <w:bookmarkEnd w:id="24"/>
-    <w:bookmarkStart w:id="25" w:name="X2715eda2745805e6c9593e76843897c60bf97fa"/>
+    <w:bookmarkStart w:id="25" w:name="extension-design-and-comparison-roles"/>
     <w:p>
       <w:pPr>
         <w:pStyle w:val="Heading3"/>
       </w:pPr>
       <w:r>
-        <w:t xml:space="preserve">Discovery extensions and frozen comparison roles</w:t>
+        <w:t xml:space="preserve">Extension design and comparison roles</w:t>
       </w:r>
     </w:p>
     <w:p>
@@ -629,7 +728,7 @@
         <w:t xml:space="preserve"> </w:t>
       </w:r>
       <w:r>
-        <w:t xml:space="preserve">[14, 15]</w:t>
+        <w:t xml:space="preserve">[15, 16]</w:t>
       </w:r>
       <w:r>
         <w:t xml:space="preserve">.</w:t>
@@ -684,7 +783,7 @@
         <w:pStyle w:val="FirstParagraph"/>
       </w:pPr>
       <w:r>
-        <w:t xml:space="preserve">BA averaged the two true-class recalls. Seeds were averaged within session, five target sessions within participant, then participants within cohort. Paired contrasts used matched endpoints and 10,000 participant-bootstrap resamples: seed 42 for the original comparison and 20261023 for the extensions. The six-person discovery intervals are pointwise summaries.</w:t>
+        <w:t xml:space="preserve">BA averaged the two true-class recalls. Seeds were averaged within session, five target sessions within participant, then participants within cohort. Paired contrasts used matched endpoints and 10,000 participant-bootstrap resamples: seed 42 for the original comparison and 20261023 for the extensions. Extension intervals use the six participants as resampling units and are pointwise summaries. A post-hoc check enumerated every sign assignment of the observed participant differences, preserving their magnitudes, using the absolute mean as the statistic. Holm adjustment covered four saved contrasts: full-minus-frozen, full-minus-LDA-only and LDA-only-minus-frozen in the primary cohort, plus full-minus-frozen in the eligible unflagged subset. These family-adjusted tests accompany the original pointwise bootstrap intervals.</w:t>
       </w:r>
     </w:p>
     <w:p>
@@ -754,12 +853,13 @@
         <w:pStyle w:val="FirstParagraph"/>
       </w:pPr>
       <w:r>
-        <w:t xml:space="preserve">Full CSP/LDA refitting achieved 65.36% target BA in the original 12-participant primary cohort, compared with 57.94% for frozen decoding and 59.89% for LDA-only recalibration. The predefined primary full-minus-frozen gain was 7.42 percentage points (95% interval 2.49–12.48). With identical fitting labels, the secondary full-minus-LDA-only gain was 5.47 points (2.17–8.91), while LDA-only minus frozen was 1.95 points (−0.98–5.09). The spatial-component contrast accounted for 73.7% of the mean total gain (Table 1; Figure 1).</w:t>
-      </w:r>
-    </w:p>
-    <w:p>
-      <w:pPr>
-        <w:pStyle w:val="BodyText"/>
+        <w:t xml:space="preserve">Full CSP/LDA refitting achieved 65.36% target BA in the original 12-participant primary cohort, compared with 57.94% for frozen decoding and 59.89% for LDA-only recalibration. The predefined primary full-minus-frozen gain was 7.42 percentage points (95% interval 2.49–12.48). With identical fitting labels, the secondary full-minus-LDA-only gain was 5.47 points (2.17–8.91), while LDA-only minus frozen was 1.95 points (−0.98–5.09). The spatial-component contrast accounted for 73.7% of the mean total gain (Table 1; Figure 1). The exact sign-flip p value was 0.01025 for the matched-label component contrast (Holm-adjusted p=0.04102) and 0.01953 for the primary full-minus-frozen contrast (Holm-adjusted p=0.05859). The bootstrap intervals estimate paired effects without a family adjustment; the sign-flip tests use a sign-symmetric reference and four-comparison error control.</w:t>
+      </w:r>
+    </w:p>
+    <w:p>
+      <w:pPr>
+        <w:pStyle w:val="BodyText"/>
+        <w:keepNext/>
       </w:pPr>
       <w:r>
         <w:rPr>
@@ -1258,7 +1358,7 @@
         <w:pStyle w:val="BodyText"/>
       </w:pPr>
       <w:r>
-        <w:t xml:space="preserve">The two updating methods used the same source-training/current-support union. Values average five sessions within participants. Full refitting versus freezing in the 12-participant cohort was the predefined primary comparison; full versus LDA-only was secondary.</w:t>
+        <w:t xml:space="preserve">BA, balanced accuracy; pp, percentage points. The two updating methods used the same source-training/current-support union. Values average five sessions within participants. Full refitting versus freezing in the 12-participant cohort was the predefined primary comparison; full versus LDA-only was secondary. The six-person development row remains separate from the primary cohort and includes its negative component mean.</w:t>
       </w:r>
     </w:p>
     <w:p>
@@ -1274,7 +1374,7 @@
         <w:pStyle w:val="BodyText"/>
       </w:pPr>
       <w:r>
-        <w:t xml:space="preserve">Full refitting exceeded freezing for nine of 12 primary participants. The three decreases were −5.82, −0.67 and −0.20 points. In the ten participants retaining both query classes across all five unflagged sessions, full-minus-frozen was +5.96 points (0.99–11.24) and full-minus-LDA-only +3.82 (1.11–6.72). This query restriction left original training and support data unchanged. The retained cohort and amplitude-conditional endpoint differ from the complete primary analysis.</w:t>
+        <w:t xml:space="preserve">Full refitting gave higher BA than frozen decoding for nine of 12 primary participants. The three decreases were −5.82, −0.67 and −0.20 points. In the ten participants retaining both query classes across all five unflagged sessions, full-minus-frozen was +5.96 points (0.99–11.24) and full-minus-LDA-only +3.82 (1.11–6.72). This query restriction left original training and support data unchanged. The retained cohort and amplitude-conditional endpoint differ from the complete primary analysis.</w:t>
       </w:r>
     </w:p>
     <w:p>
@@ -1343,13 +1443,13 @@
       </w:r>
     </w:p>
     <w:bookmarkEnd w:id="33"/>
-    <w:bookmarkStart w:id="34" w:name="X3acbe782c0310254d2ad887e038860115f57f72"/>
+    <w:bookmarkStart w:id="34" w:name="Xdafc897e219783402c84ca3b110848a0a40ca9f"/>
     <w:p>
       <w:pPr>
         <w:pStyle w:val="Heading3"/>
       </w:pPr>
       <w:r>
-        <w:t xml:space="preserve">Strong alignment controls changed the interpretation of a positive frozen-reference gain</w:t>
+        <w:t xml:space="preserve">EA-CSP provided a strong conventional reference</w:t>
       </w:r>
     </w:p>
     <w:p>
@@ -1365,17 +1465,17 @@
         <w:pStyle w:val="BodyText"/>
       </w:pPr>
       <w:r>
-        <w:t xml:space="preserve">This pattern motivated the more controlled V3 decomposition. V2 compared separately versioned conventional methods within the exposed development group.</w:t>
+        <w:t xml:space="preserve">These results motivated the source-fixed feature and component controls in V3.</w:t>
       </w:r>
     </w:p>
     <w:bookmarkEnd w:id="34"/>
-    <w:bookmarkStart w:id="38" w:name="X52f84741972b8ce85162069be3c971b5c03d986"/>
+    <w:bookmarkStart w:id="38" w:name="Xec716033d9fb495497d1014a38015ddbbc180ea"/>
     <w:p>
       <w:pPr>
         <w:pStyle w:val="Heading3"/>
       </w:pPr>
       <w:r>
-        <w:t xml:space="preserve">The uncertainty-aware geometric candidate failed its strong comparisons</w:t>
+        <w:t xml:space="preserve">Tangent refitting and EA-CSP gave higher geometric-decoder accuracy</w:t>
       </w:r>
     </w:p>
     <w:p>
@@ -1389,6 +1489,7 @@
     <w:p>
       <w:pPr>
         <w:pStyle w:val="BodyText"/>
+        <w:keepNext/>
       </w:pPr>
       <w:r>
         <w:rPr>
@@ -1773,15 +1874,15 @@
         <w:pStyle w:val="BodyText"/>
       </w:pPr>
       <w:r>
-        <w:t xml:space="preserve">Ordinary tangent refitting was the frozen primary comparator. The same-query EA-CSP reference was imported from saved V2 predictions after ordered trial/label verification. All results use the same six discovery participants. Candidate ablations and every budget are retained in the supplementary methods and the machine-readable tables.</w:t>
-      </w:r>
-    </w:p>
-    <w:p>
-      <w:pPr>
-        <w:pStyle w:val="BodyText"/>
-      </w:pPr>
-      <w:r>
-        <w:t xml:space="preserve">Some internal components carried useful information: separating common and discriminative variation and retaining source-mean noise improved the cap-20 candidate mean over their respective ablations. However, propagating the estimated posterior covariance into prediction reduced BA relative to using the same posterior means with point prediction. Estimated common-location variation exceeded discriminative-contrast variation in every cap-20 session, a descriptive feature of these support-derived estimates. The ablations separate the contributions of mean estimation, variation scales and predictive covariance.</w:t>
+        <w:t xml:space="preserve">BA, balanced accuracy; pp, percentage points. Ordinary tangent refitting was the frozen primary comparator. The same-query EA-CSP reference was imported from saved V2 predictions after ordered trial/label verification. Candidate ablations and every budget are retained in the supplementary methods and machine-readable tables.</w:t>
+      </w:r>
+    </w:p>
+    <w:p>
+      <w:pPr>
+        <w:pStyle w:val="BodyText"/>
+      </w:pPr>
+      <w:r>
+        <w:t xml:space="preserve">The matched ablations distinguish three operations. Separating common and discriminative variation and retaining source-mean noise improved the cap-20 candidate over their respective ablations. Adding posterior covariance to the same posterior means reduced BA by 1.84 points relative to point prediction. The estimated common-location variation was larger than discriminative-contrast variation in every cap-20 support set. These observations distinguish changes in the estimated means from changes in predictive covariance.</w:t>
       </w:r>
     </w:p>
     <w:p>
@@ -1846,17 +1947,17 @@
         <w:t xml:space="preserve"> </w:t>
       </w:r>
       <w:r>
-        <w:t xml:space="preserve">Full support-budget profiles and cap-20 paired contrasts retain ordinary tangent refitting and EA-CSP as strong references. Ablations separate posterior mean estimation, prediction covariance, source-mean noise and common/contrast variation scales. All candidate-versus-ablation and strong-reference contrasts are displayed together; intervals are pointwise participant-bootstrap summaries from the exposed discovery group.</w:t>
+        <w:t xml:space="preserve">Full support-budget profiles and cap-20 paired contrasts retain ordinary tangent refitting and EA-CSP as strong references. Ablations separate posterior mean estimation, prediction covariance, source-mean noise and common/contrast variation scales. All candidate-versus-ablation and strong-reference contrasts are displayed together; intervals use participant-bootstrap resampling.</w:t>
       </w:r>
     </w:p>
     <w:bookmarkEnd w:id="38"/>
-    <w:bookmarkStart w:id="42" w:name="X7273f392485ac7a9d377e1fa2e295c664b059eb"/>
+    <w:bookmarkStart w:id="42" w:name="X8394cadf07058e2aec1a2af99d9e9f678aa0369"/>
     <w:p>
       <w:pPr>
         <w:pStyle w:val="Heading3"/>
       </w:pPr>
       <w:r>
-        <w:t xml:space="preserve">Fixed source normalization improved the 20-label neural comparison</w:t>
+        <w:t xml:space="preserve">Fixed source normalization reduced single-class predictions at the 20-label cap</w:t>
       </w:r>
     </w:p>
     <w:p>
@@ -1864,12 +1965,13 @@
         <w:pStyle w:val="FirstParagraph"/>
       </w:pPr>
       <w:r>
-        <w:t xml:space="preserve">At the 20-label cap, ordinary all-parameter adaptation with fixed BN achieved 57.51% BA for individual sources, versus 56.01% with adaptive BN, yielding +1.50 points (0.33–2.74). For pooled sources, the corresponding values were 56.22% and 54.31%, a difference of +1.91 points (0.76–3.24; Table 3). Five of six participant differences favored fixed BN in each regime; the remaining difference was negative for individual sources and approximately zero for pooled sources. All participant-deletion mean contrasts stayed positive at this cap.</w:t>
-      </w:r>
-    </w:p>
-    <w:p>
-      <w:pPr>
-        <w:pStyle w:val="BodyText"/>
+        <w:t xml:space="preserve">At the 20-label cap, fixed-BN full updates produced eight single-class query predictions among 90 nested participant-by-seed-by-session outcomes, compared with 16 under adaptive BN. Pooled-source counts were zero and 18, respectively. Fixed-BN BA was 57.51%, versus 56.01% for adaptive BN with individual sources, a difference of 1.50 points (0.33–2.74). Pooled-source values were 56.22% and 54.31%, a difference of 1.91 points (0.76–3.24; Table 3). Five of six participant differences favored fixed BN in each regime; the remaining difference was negative for individual sources and approximately zero for pooled sources. All participant-deletion mean contrasts stayed positive at this cap.</w:t>
+      </w:r>
+    </w:p>
+    <w:p>
+      <w:pPr>
+        <w:pStyle w:val="BodyText"/>
+        <w:keepNext/>
       </w:pPr>
       <w:r>
         <w:rPr>
@@ -2027,7 +2129,7 @@
               <w:rPr>
                 <w:sz w:val="18"/>
               </w:rPr>
-              <w:t xml:space="preserve">Exploratory BN-mode comparison</w:t>
+              <w:t xml:space="preserve">BN-mode comparison</w:t>
             </w:r>
           </w:p>
         </w:tc>
@@ -2193,7 +2295,7 @@
               <w:rPr>
                 <w:sz w:val="18"/>
               </w:rPr>
-              <w:t xml:space="preserve">−0.006 [−0.111, 0.092] pp</w:t>
+              <w:t xml:space="preserve">−0.01 [−0.11, 0.09] pp</w:t>
             </w:r>
           </w:p>
         </w:tc>
@@ -2209,7 +2311,7 @@
               <w:rPr>
                 <w:sz w:val="18"/>
               </w:rPr>
-              <w:t xml:space="preserve">+0.029 [0.000, 0.088] pp</w:t>
+              <w:t xml:space="preserve">+0.03 [0.00, 0.09] pp</w:t>
             </w:r>
           </w:p>
         </w:tc>
@@ -2291,7 +2393,7 @@
               <w:rPr>
                 <w:sz w:val="18"/>
               </w:rPr>
-              <w:t xml:space="preserve">Exploratory Dropout comparison</w:t>
+              <w:t xml:space="preserve">Dropout comparison</w:t>
             </w:r>
           </w:p>
         </w:tc>
@@ -2302,23 +2404,15 @@
         <w:pStyle w:val="BodyText"/>
       </w:pPr>
       <w:r>
-        <w:t xml:space="preserve">All intervals summarize six participants after averaging fixed seeds and target sessions. Both source regimes use the same participants. The functional-constraint row retains its frozen primary role and shows effects below 0.03 percentage points. The BN-mode contrast changes optimization-time normalization as well as the running state used at inference.</w:t>
-      </w:r>
-    </w:p>
-    <w:p>
-      <w:pPr>
-        <w:pStyle w:val="BodyText"/>
-      </w:pPr>
-      <w:r>
-        <w:t xml:space="preserve">The cap-specific positive contrast accompanied fewer single-class query predictions. Among 90 nested seed-by-session outcomes, individual-source fixed-BN full updates had eight collapsed predictions versus 16 with adaptive BN; pooled-source counts were zero versus 18. These 90 seed/session observations are nested within six participants.</w:t>
-      </w:r>
-    </w:p>
-    <w:p>
-      <w:pPr>
-        <w:pStyle w:val="BodyText"/>
-      </w:pPr>
-      <w:r>
-        <w:t xml:space="preserve">The budget curves show the scope of the finding (Figure 3). Individual-source fixed-minus-adaptive BN differences were −0.18, −0.34, −0.46, −0.04 and +1.50 points across caps 4–20. Pooled-source differences were +0.75, +0.01, +0.48, +1.31 and +1.91 points. The endpoint contrast emerged at the final support cap. With batch size 16, the final cap also changed the number and size of minibatches: up to 16 support trials supplied one batch per epoch, whereas 19/20 supplied two. Three BN modules recorded 60 versus 120 cumulative batch-counter increments over 20 epochs. Cross-budget changes combine sample quantity, class composition and the normalization-update schedule.</w:t>
+        <w:t xml:space="preserve">BN, batch normalization; KL, Kullback–Leibler divergence; pp, percentage points. Intervals summarize six participants after averaging fixed seeds and target sessions. Single-class prediction counts include 90 nested outcomes per arm. The functional-constraint row retains its predefined primary role. BN mode changes optimization-time normalization and the resulting inference state.</w:t>
+      </w:r>
+    </w:p>
+    <w:p>
+      <w:pPr>
+        <w:pStyle w:val="BodyText"/>
+      </w:pPr>
+      <w:r>
+        <w:t xml:space="preserve">The full budget curves show how this contrast changes (Figure 3). Individual-source fixed-minus-adaptive BN differences were −0.18, −0.34, −0.46, −0.04 and +1.50 points across caps 4–20. Pooled-source differences were +0.75, +0.01, +0.48, +1.31 and +1.91 points. At the final support cap, batch size 16 also changed the number and size of minibatches: up to 16 support trials supplied one batch per epoch, whereas 19/20 supplied two. Three BN modules recorded 60 versus 120 cumulative batch-counter increments over 20 epochs. Within a support cap, the BN comparison holds minibatches and optimization exposure fixed. Across caps, label quantity, class composition and the normalization-update schedule change together.</w:t>
       </w:r>
     </w:p>
     <w:p>
@@ -2387,13 +2481,13 @@
       </w:r>
     </w:p>
     <w:bookmarkEnd w:id="42"/>
-    <w:bookmarkStart w:id="43" w:name="X343bb11412b7fc06cf42c26135d973a80d59d8a"/>
+    <w:bookmarkStart w:id="43" w:name="Xbec4234a1587e7acd3e4c84752377a905b27c4a"/>
     <w:p>
       <w:pPr>
         <w:pStyle w:val="Heading3"/>
       </w:pPr>
       <w:r>
-        <w:t xml:space="preserve">Source pooling and functional preservation did not deliver additional target gains</w:t>
+        <w:t xml:space="preserve">Source discrimination and functional-constraint effects</w:t>
       </w:r>
     </w:p>
     <w:p>
@@ -2401,7 +2495,7 @@
         <w:pStyle w:val="FirstParagraph"/>
       </w:pPr>
       <w:r>
-        <w:t xml:space="preserve">Frozen individual-source models achieved 56.74% target BA, compared with 55.26% for pooled-source models, a pooled-minus-individual difference of −1.48 points (−2.90 to −0.20). Source-query BA was 56.11% and 57.78%, respectively. Weak source discrimination was already present before target-session transfer. The pooled-source condition yielded a lower target mean in this architecture and training regime.</w:t>
+        <w:t xml:space="preserve">Frozen individual-source models achieved 56.74% target BA, compared with 55.26% for pooled-source models, a pooled-minus-individual difference of −1.48 points (−2.90 to −0.20). Source-query BA was 56.11% and 57.78%, respectively. Weak source discrimination was already present before target-session transfer. The pooled-source target mean was lower in this architecture and training regime.</w:t>
       </w:r>
     </w:p>
     <w:p>
@@ -2417,17 +2511,17 @@
         <w:pStyle w:val="BodyText"/>
       </w:pPr>
       <w:r>
-        <w:t xml:space="preserve">At the core KL bound 0.01, the functional constraint changed the cap-20 mean relative to ordinary fixed-BN adaptation by −0.006 points for individual sources and +0.029 points for pooled sources. At bound 0.1, BA matched the ordinary update in both regimes; bound 0.001 produced differences of −0.22 and −0.19 points, respectively, with intervals crossing zero. The complete dose profiles and accepted/rejected-step histories are retained.</w:t>
+        <w:t xml:space="preserve">At the core KL bound 0.01, the functional constraint changed the cap-20 mean relative to ordinary fixed-BN adaptation by −0.01 points for individual sources and +0.03 points for pooled sources. At bound 0.1, BA matched the ordinary update in both regimes; bound 0.001 produced differences of −0.22 and −0.19 points, respectively, with intervals crossing zero. The complete dose profiles and accepted/rejected-step histories are retained.</w:t>
       </w:r>
     </w:p>
     <w:bookmarkEnd w:id="43"/>
-    <w:bookmarkStart w:id="47" w:name="Xd9d6fe57f558d227f61edd57e42af574ff0a7fa"/>
+    <w:bookmarkStart w:id="47" w:name="Xc72e392fb25bf57866e321c383f7e8843555fd8"/>
     <w:p>
       <w:pPr>
         <w:pStyle w:val="Heading3"/>
       </w:pPr>
       <w:r>
-        <w:t xml:space="preserve">Mechanism simulations tested the estimator beyond the EEG comparison</w:t>
+        <w:t xml:space="preserve">Posterior covariance reduced simulated log loss with little change in accuracy</w:t>
       </w:r>
     </w:p>
     <w:p>
@@ -2435,7 +2529,7 @@
         <w:pStyle w:val="FirstParagraph"/>
       </w:pPr>
       <w:r>
-        <w:t xml:space="preserve">The full synthetic grid contained 172,800 numeric method-by-condition-by-repetition results. Equal-grid BA was 70.36% for the candidate and 76.19% for tangent refitting, a difference of−5.83 points; 376 of 384 scenario means favored refitting. Candidate feature-mean squared error was also larger. Adding posterior covariance to identical candidate means reduced mean cross entropy by 0.341 but changed BA by−0.04 points. Thus, the probability-score improvement and classification endpoint moved differently (Figure 4).</w:t>
+        <w:t xml:space="preserve">The full synthetic grid contained 172,800 numeric method-by-condition-by-repetition results. Equal-grid BA was 70.36% for the candidate and 76.19% for tangent refitting, a difference of −5.83 points; 376 of 384 scenario means favored refitting. Candidate feature-mean squared error was also larger. Adding posterior covariance to identical candidate means reduced mean cross entropy by 0.341 but changed BA by −0.04 points. Thus, the probability-score improvement and classification endpoint moved differently (Figure 4).</w:t>
       </w:r>
     </w:p>
     <w:p>
@@ -2514,13 +2608,13 @@
         <w:t xml:space="preserve">Discussion</w:t>
       </w:r>
     </w:p>
-    <w:bookmarkStart w:id="49" w:name="Xcee9c9eb3886f764d6147e22ac2a14af37e98f4"/>
+    <w:bookmarkStart w:id="49" w:name="X321fb6ee669b04d9d182a4aeaad63a66664a081"/>
     <w:p>
       <w:pPr>
         <w:pStyle w:val="Heading3"/>
       </w:pPr>
       <w:r>
-        <w:t xml:space="preserve">Updating the right component was more useful than updating every component</w:t>
+        <w:t xml:space="preserve">Matched-label analysis identifies the spatial contribution</w:t>
       </w:r>
     </w:p>
     <w:p>
@@ -2536,25 +2630,7 @@
         <w:pStyle w:val="BodyText"/>
       </w:pPr>
       <w:r>
-        <w:t xml:space="preserve">The neural extension adds a complementary observation. At the final support cap, fixed-source BN during full weight adaptation outperformed adaptive BN in both initialization regimes, with fewer collapsed seed/session predictions. This contrasts with the successful CSP spatial update. Together, the comparisons show why</w:t>
-      </w:r>
-      <w:r>
-        <w:t xml:space="preserve"> </w:t>
-      </w:r>
-      <w:r>
-        <w:t xml:space="preserve">“</w:t>
-      </w:r>
-      <w:r>
-        <w:t xml:space="preserve">adapt the representation</w:t>
-      </w:r>
-      <w:r>
-        <w:t xml:space="preserve">”</w:t>
-      </w:r>
-      <w:r>
-        <w:t xml:space="preserve"> </w:t>
-      </w:r>
-      <w:r>
-        <w:t xml:space="preserve">is too broad a prescription: a supervised spatial estimator and repeated neural normalization updates are different operations with different data requirements. The controlled comparison identifies which update supplied the gain in each evaluated setting.</w:t>
+        <w:t xml:space="preserve">The neural extension adds a complementary observation. At the final support cap, fixed-source BN during full weight adaptation outperformed adaptive BN in both initialization regimes, with fewer collapsed seed/session predictions. This contrasts with the successful CSP spatial update. The component analysis distinguishes a supervised spatial estimator from repeated normalization updates, making the observed gain attributable to a specific pipeline operation.</w:t>
       </w:r>
     </w:p>
     <w:p>
@@ -2566,13 +2642,13 @@
       </w:r>
     </w:p>
     <w:bookmarkEnd w:id="49"/>
-    <w:bookmarkStart w:id="50" w:name="X831fc0c928d34bfffde6899da5332b2ee1914bd"/>
+    <w:bookmarkStart w:id="50" w:name="X90e28b01f97b61fba2cce76bda988773ae15049"/>
     <w:p>
       <w:pPr>
         <w:pStyle w:val="Heading3"/>
       </w:pPr>
       <w:r>
-        <w:t xml:space="preserve">Normalization mode is a concrete, budget-dependent design variable</w:t>
+        <w:t xml:space="preserve">Normalization effects varied across support budgets</w:t>
       </w:r>
     </w:p>
     <w:p>
@@ -2580,7 +2656,7 @@
         <w:pStyle w:val="FirstParagraph"/>
       </w:pPr>
       <w:r>
-        <w:t xml:space="preserve">The BN comparison holds source initialization, support, trainable parameters, Dropout and optimizer schedule fixed within each budget. It identifies an implementation choice often bundled into fine-tuning. Both modes use identical support and optimization budgets. Their cap-20 difference isolates the BN-mode choice within this training procedure.</w:t>
+        <w:t xml:space="preserve">The BN comparison holds source initialization, support, trainable parameters, Dropout and optimizer schedule fixed within each budget. The cap-20 difference therefore identifies the BN-mode choice within the evaluated 20-epoch, batch-16 adaptation schedule.</w:t>
       </w:r>
     </w:p>
     <w:p>
@@ -2602,20 +2678,20 @@
         <w:t xml:space="preserve"> </w:t>
       </w:r>
       <w:r>
-        <w:t xml:space="preserve">[11, 12]</w:t>
+        <w:t xml:space="preserve">[12, 13]</w:t>
       </w:r>
       <w:r>
         <w:t xml:space="preserve">. They also give a focused next hypothesis: when adaptation repeatedly revisits a short support run, normalization mode and exposure count should be controlled independently of label count. A follow-up can vary the BN update schedule while preserving the trained sources, support identities and comparison hierarchy.</w:t>
       </w:r>
     </w:p>
     <w:bookmarkEnd w:id="50"/>
-    <w:bookmarkStart w:id="51" w:name="Xd8ff83f0f7e39846ffab1af369c32630db97a13"/>
+    <w:bookmarkStart w:id="51" w:name="X9bea0190cc77cd693194f258d1988f8b13583d2"/>
     <w:p>
       <w:pPr>
         <w:pStyle w:val="Heading3"/>
       </w:pPr>
       <w:r>
-        <w:t xml:space="preserve">Strong controls separated practical gains from candidate-method novelty</w:t>
+        <w:t xml:space="preserve">Strong references guide estimator comparisons</w:t>
       </w:r>
     </w:p>
     <w:p>
@@ -2623,7 +2699,7 @@
         <w:pStyle w:val="FirstParagraph"/>
       </w:pPr>
       <w:r>
-        <w:t xml:space="preserve">EA-CSP outperformed the V2 covariance-mixture candidate and the V3 uncertainty-aware candidate. The latter also underperformed ordinary tangent refitting in the same feature family. These comparisons distinguish the value of recalibration from the value of a particular new estimator.</w:t>
+        <w:t xml:space="preserve">EA-CSP had higher mean BA than the V2 covariance-mixture candidate and the V3 uncertainty-aware candidate. Ordinary tangent refitting also had higher BA in the candidate’s own feature family. EA-CSP and tangent refitting therefore provide practical references for evaluating additional adaptation machinery on these data.</w:t>
       </w:r>
     </w:p>
     <w:p>
@@ -2639,26 +2715,26 @@
         <w:pStyle w:val="BodyText"/>
       </w:pPr>
       <w:r>
-        <w:t xml:space="preserve">Similarly, source-anchor KL was enforced but changed cap-20 BA by less than 0.03 points. Alignment, source regularization and functional preservation are established</w:t>
-      </w:r>
-      <w:r>
-        <w:t xml:space="preserve"> </w:t>
-      </w:r>
-      <w:r>
-        <w:t xml:space="preserve">[7, 13–15]</w:t>
+        <w:t xml:space="preserve">The enforced source-anchor KL constraint changed cap-20 BA by −0.01 and +0.03 points in the two source regimes. Alignment, source regularization and functional preservation are established</w:t>
+      </w:r>
+      <w:r>
+        <w:t xml:space="preserve"> </w:t>
+      </w:r>
+      <w:r>
+        <w:t xml:space="preserve">[7, 14–16]</w:t>
       </w:r>
       <w:r>
         <w:t xml:space="preserve">. The present evidence identifies their value through explicit information budgets and matched component comparisons.</w:t>
       </w:r>
     </w:p>
     <w:bookmarkEnd w:id="51"/>
-    <w:bookmarkStart w:id="52" w:name="X3ff8633133947a2415b0afb3c89f74cc5858b37"/>
+    <w:bookmarkStart w:id="52" w:name="X591f6d5db673ac8c106611d036e275e1a7bcf46"/>
     <w:p>
       <w:pPr>
         <w:pStyle w:val="Heading3"/>
       </w:pPr>
       <w:r>
-        <w:t xml:space="preserve">Source quality and task measurement constrain interpretation</w:t>
+        <w:t xml:space="preserve">Source discrimination and calibration measurements</w:t>
       </w:r>
     </w:p>
     <w:p>
@@ -2692,7 +2768,7 @@
         <w:pStyle w:val="FirstParagraph"/>
       </w:pPr>
       <w:r>
-        <w:t xml:space="preserve">The study uses one public longitudinal cohort. The original primary hierarchy is retained; V2/V3, prediction transitions and sensitivity analyses used previously exposed data. Their intervals describe discovery-stage component effects. Pooled teachers share participants and change source-label budgets; the independent sample remains the participant cohort.</w:t>
+        <w:t xml:space="preserve">The study uses one public longitudinal cohort. The original primary hierarchy is retained; V2/V3, prediction transitions and sensitivity analyses used previously exposed data. The extension estimates are exploratory, conditional on the recorded source models and support schedules. Pooled teachers share participants and change source-label budgets; the independent sample remains the participant cohort.</w:t>
       </w:r>
     </w:p>
     <w:p>
@@ -2708,7 +2784,7 @@
         <w:pStyle w:val="BodyText"/>
       </w:pPr>
       <w:r>
-        <w:t xml:space="preserve">Independent longitudinal validation should freeze the matched-label spatial comparison and normalization-mode contrast before accessing new query outcomes. The current findings identify a substantial spatial-refitting increment and a distinct, budget-dependent normalization effect.</w:t>
+        <w:t xml:space="preserve">An independent longitudinal study can freeze the matched-label spatial comparison and separately control BN exposure count and minibatch size. These are specific hypotheses generated by the component results.</w:t>
       </w:r>
     </w:p>
     <w:bookmarkEnd w:id="53"/>
@@ -2727,7 +2803,7 @@
         <w:pStyle w:val="FirstParagraph"/>
       </w:pPr>
       <w:r>
-        <w:t xml:space="preserve">Under matched source and current-session labels, spatial-filter refitting supplied most of the observed conventional-decoder recalibration gain. The added spatial update improved BA by 5.47 points beyond LDA-only recalibration in the primary cohort and accounted for 73.7% of the 7.42-point total mean gain. In the later six-person discovery experiment, fixed-source BN improved the final-cap neural comparison by 1.50–1.91 points, with budget-dependent profiles. The uncertainty-aware and functional-constraint candidates added no strong-comparator benefit. The matched-label spatial gain identifies filter updating as the principal contributor to the original recalibration improvement, with normalization mode providing a distinct neural design variable.</w:t>
+        <w:t xml:space="preserve">Matched-label component analysis showed that relearning spatial filters added 5.47 balanced-accuracy points beyond classifier recalibration with the same source and approximately 20 current-session labels. This increment accounted for 73.7% of the 7.42-point total mean gain over freezing. Practitioners evaluating short-run recalibration should therefore compare classifier-only and full spatial updates under identical labels, with EA-CSP as a strong conventional reference. In the neural extension, fixed BN produced fewer single-class predictions under the 20-label, batch-16 schedule; the full budget profiles motivate independent control of normalization exposure. Posterior covariance improved simulated log loss while classification favored simpler geometric references. Independent longitudinal validation should retain the fixed label budget and component contrasts before selecting an update policy.</w:t>
       </w:r>
     </w:p>
     <w:bookmarkEnd w:id="55"/>
@@ -2751,7 +2827,7 @@
         <w:t xml:space="preserve"> </w:t>
       </w:r>
       <w:r>
-        <w:t xml:space="preserve">[16]</w:t>
+        <w:t xml:space="preserve">[17]</w:t>
       </w:r>
       <w:r>
         <w:t xml:space="preserve">. Code, configurations, original results and saved extension predictions are available at https://github.com/jackzhu119/few-shot-mi-eeg, research branch</w:t>
@@ -2784,11 +2860,11 @@
         <w:pStyle w:val="FirstParagraph"/>
       </w:pPr>
       <w:r>
-        <w:t xml:space="preserve">The author thanks the researchers who released Kumar2024. OpenAI ChatGPT/Codex assisted with code, saved-result checks, plotting code, reference checks, drafting, editing and document preparation. Checks included trial matching, checksum verification and endpoint reconstruction. The author is responsible for the content.</w:t>
+        <w:t xml:space="preserve">The author thanks the researchers who released Kumar2024. OpenAI ChatGPT/Codex assisted with grammar and language revision, GitHub file organization and uploading, manuscript formatting, and verification of saved results. This work included assistance with analysis and plotting code, statistical reconstruction, and manuscript drafting and revision. The author is responsible for the content and interpretation.</w:t>
       </w:r>
     </w:p>
     <w:bookmarkEnd w:id="57"/>
-    <w:bookmarkStart w:id="103" w:name="references"/>
+    <w:bookmarkStart w:id="105" w:name="references"/>
     <w:p>
       <w:pPr>
         <w:pStyle w:val="Heading2"/>
@@ -2797,7 +2873,7 @@
         <w:t xml:space="preserve">References</w:t>
       </w:r>
     </w:p>
-    <w:bookmarkStart w:id="102" w:name="refs"/>
+    <w:bookmarkStart w:id="104" w:name="refs"/>
     <w:bookmarkStart w:id="59" w:name="ref-lotte2018"/>
     <w:p>
       <w:pPr>
@@ -3152,7 +3228,7 @@
       </w:hyperlink>
     </w:p>
     <w:bookmarkEnd w:id="77"/>
-    <w:bookmarkStart w:id="79" w:name="ref-adabn2016"/>
+    <w:bookmarkStart w:id="79" w:name="ref-kozyrskiy2026updates"/>
     <w:p>
       <w:pPr>
         <w:pStyle w:val="Bibliography"/>
@@ -3167,6 +3243,45 @@
         <w:t xml:space="preserve">	</w:t>
       </w:r>
       <w:r>
+        <w:t xml:space="preserve">Kozyrskiy B, Grachev A, Camelo Guerrero AI.</w:t>
+      </w:r>
+      <w:r>
+        <w:t xml:space="preserve"> </w:t>
+      </w:r>
+      <w:r>
+        <w:t xml:space="preserve">Benchmarking Label-Revealed Online Updates for EEG BCI Decoding</w:t>
+      </w:r>
+      <w:r>
+        <w:t xml:space="preserve">. arXiv:2610.07420v1 [Preprint] 2026 [cited 27 Oct 2026]. Available:</w:t>
+      </w:r>
+      <w:r>
+        <w:t xml:space="preserve"> </w:t>
+      </w:r>
+      <w:hyperlink r:id="rId78">
+        <w:r>
+          <w:rPr>
+            <w:rStyle w:val="Hyperlink"/>
+          </w:rPr>
+          <w:t xml:space="preserve">https://arxiv.org/abs/2610.07420v1</w:t>
+        </w:r>
+      </w:hyperlink>
+    </w:p>
+    <w:bookmarkEnd w:id="79"/>
+    <w:bookmarkStart w:id="81" w:name="ref-adabn2016"/>
+    <w:p>
+      <w:pPr>
+        <w:pStyle w:val="Bibliography"/>
+      </w:pPr>
+      <w:r>
+        <w:t xml:space="preserve">12.</w:t>
+      </w:r>
+      <w:r>
+        <w:t xml:space="preserve"> </w:t>
+      </w:r>
+      <w:r>
+        <w:t xml:space="preserve">	</w:t>
+      </w:r>
+      <w:r>
         <w:t xml:space="preserve">Li Y, Wang N, Shi J, Liu J, Hou X.</w:t>
       </w:r>
       <w:r>
@@ -3181,7 +3296,7 @@
       <w:r>
         <w:t xml:space="preserve"> </w:t>
       </w:r>
-      <w:hyperlink r:id="rId78">
+      <w:hyperlink r:id="rId80">
         <w:r>
           <w:rPr>
             <w:rStyle w:val="Hyperlink"/>
@@ -3190,14 +3305,14 @@
         </w:r>
       </w:hyperlink>
     </w:p>
-    <w:bookmarkEnd w:id="79"/>
-    <w:bookmarkStart w:id="81" w:name="ref-wimpff2025continual"/>
+    <w:bookmarkEnd w:id="81"/>
+    <w:bookmarkStart w:id="83" w:name="ref-wimpff2025continual"/>
     <w:p>
       <w:pPr>
         <w:pStyle w:val="Bibliography"/>
       </w:pPr>
       <w:r>
-        <w:t xml:space="preserve">12.</w:t>
+        <w:t xml:space="preserve">13.</w:t>
       </w:r>
       <w:r>
         <w:t xml:space="preserve"> </w:t>
@@ -3229,7 +3344,7 @@
       <w:r>
         <w:t xml:space="preserve">IEEE; 2025. pp. 1–7. doi:</w:t>
       </w:r>
-      <w:hyperlink r:id="rId80">
+      <w:hyperlink r:id="rId82">
         <w:r>
           <w:rPr>
             <w:rStyle w:val="Hyperlink"/>
@@ -3238,14 +3353,14 @@
         </w:r>
       </w:hyperlink>
     </w:p>
-    <w:bookmarkEnd w:id="81"/>
-    <w:bookmarkStart w:id="83" w:name="ref-l2sp2018"/>
+    <w:bookmarkEnd w:id="83"/>
+    <w:bookmarkStart w:id="85" w:name="ref-l2sp2018"/>
     <w:p>
       <w:pPr>
         <w:pStyle w:val="Bibliography"/>
       </w:pPr>
       <w:r>
-        <w:t xml:space="preserve">13.</w:t>
+        <w:t xml:space="preserve">14.</w:t>
       </w:r>
       <w:r>
         <w:t xml:space="preserve"> </w:t>
@@ -3268,7 +3383,7 @@
       <w:r>
         <w:t xml:space="preserve"> </w:t>
       </w:r>
-      <w:hyperlink r:id="rId82">
+      <w:hyperlink r:id="rId84">
         <w:r>
           <w:rPr>
             <w:rStyle w:val="Hyperlink"/>
@@ -3277,14 +3392,14 @@
         </w:r>
       </w:hyperlink>
     </w:p>
-    <w:bookmarkEnd w:id="83"/>
-    <w:bookmarkStart w:id="85" w:name="ref-lwf2016"/>
+    <w:bookmarkEnd w:id="85"/>
+    <w:bookmarkStart w:id="87" w:name="ref-lwf2016"/>
     <w:p>
       <w:pPr>
         <w:pStyle w:val="Bibliography"/>
       </w:pPr>
       <w:r>
-        <w:t xml:space="preserve">14.</w:t>
+        <w:t xml:space="preserve">15.</w:t>
       </w:r>
       <w:r>
         <w:t xml:space="preserve"> </w:t>
@@ -3307,7 +3422,7 @@
       <w:r>
         <w:t xml:space="preserve"> </w:t>
       </w:r>
-      <w:hyperlink r:id="rId84">
+      <w:hyperlink r:id="rId86">
         <w:r>
           <w:rPr>
             <w:rStyle w:val="Hyperlink"/>
@@ -3316,14 +3431,14 @@
         </w:r>
       </w:hyperlink>
     </w:p>
-    <w:bookmarkEnd w:id="85"/>
-    <w:bookmarkStart w:id="87" w:name="ref-trpo2015"/>
+    <w:bookmarkEnd w:id="87"/>
+    <w:bookmarkStart w:id="89" w:name="ref-trpo2015"/>
     <w:p>
       <w:pPr>
         <w:pStyle w:val="Bibliography"/>
       </w:pPr>
       <w:r>
-        <w:t xml:space="preserve">15.</w:t>
+        <w:t xml:space="preserve">16.</w:t>
       </w:r>
       <w:r>
         <w:t xml:space="preserve"> </w:t>
@@ -3346,7 +3461,7 @@
       <w:r>
         <w:t xml:space="preserve"> </w:t>
       </w:r>
-      <w:hyperlink r:id="rId86">
+      <w:hyperlink r:id="rId88">
         <w:r>
           <w:rPr>
             <w:rStyle w:val="Hyperlink"/>
@@ -3355,14 +3470,14 @@
         </w:r>
       </w:hyperlink>
     </w:p>
-    <w:bookmarkEnd w:id="87"/>
-    <w:bookmarkStart w:id="89" w:name="ref-nemar177"/>
+    <w:bookmarkEnd w:id="89"/>
+    <w:bookmarkStart w:id="91" w:name="ref-nemar177"/>
     <w:p>
       <w:pPr>
         <w:pStyle w:val="Bibliography"/>
       </w:pPr>
       <w:r>
-        <w:t xml:space="preserve">16.</w:t>
+        <w:t xml:space="preserve">17.</w:t>
       </w:r>
       <w:r>
         <w:t xml:space="preserve"> </w:t>
@@ -3382,7 +3497,7 @@
       <w:r>
         <w:t xml:space="preserve">. NEMAR (Neuroelectromagnetic Data Archive; Tools Resource); 2026. doi:</w:t>
       </w:r>
-      <w:hyperlink r:id="rId88">
+      <w:hyperlink r:id="rId90">
         <w:r>
           <w:rPr>
             <w:rStyle w:val="Hyperlink"/>
@@ -3391,14 +3506,14 @@
         </w:r>
       </w:hyperlink>
     </w:p>
-    <w:bookmarkEnd w:id="89"/>
-    <w:bookmarkStart w:id="91" w:name="ref-china2023ethics"/>
+    <w:bookmarkEnd w:id="91"/>
+    <w:bookmarkStart w:id="93" w:name="ref-china2023ethics"/>
     <w:p>
       <w:pPr>
         <w:pStyle w:val="Bibliography"/>
       </w:pPr>
       <w:r>
-        <w:t xml:space="preserve">17.</w:t>
+        <w:t xml:space="preserve">18.</w:t>
       </w:r>
       <w:r>
         <w:t xml:space="preserve"> </w:t>
@@ -3421,7 +3536,7 @@
       <w:r>
         <w:t xml:space="preserve"> </w:t>
       </w:r>
-      <w:hyperlink r:id="rId90">
+      <w:hyperlink r:id="rId92">
         <w:r>
           <w:rPr>
             <w:rStyle w:val="Hyperlink"/>
@@ -3430,14 +3545,14 @@
         </w:r>
       </w:hyperlink>
     </w:p>
-    <w:bookmarkEnd w:id="91"/>
-    <w:bookmarkStart w:id="93" w:name="ref-kumarcodebook"/>
+    <w:bookmarkEnd w:id="93"/>
+    <w:bookmarkStart w:id="95" w:name="ref-kumarcodebook"/>
     <w:p>
       <w:pPr>
         <w:pStyle w:val="Bibliography"/>
       </w:pPr>
       <w:r>
-        <w:t xml:space="preserve">18.</w:t>
+        <w:t xml:space="preserve">19.</w:t>
       </w:r>
       <w:r>
         <w:t xml:space="preserve"> </w:t>
@@ -3466,7 +3581,7 @@
       <w:r>
         <w:t xml:space="preserve"> </w:t>
       </w:r>
-      <w:hyperlink r:id="rId92">
+      <w:hyperlink r:id="rId94">
         <w:r>
           <w:rPr>
             <w:rStyle w:val="Hyperlink"/>
@@ -3475,14 +3590,14 @@
         </w:r>
       </w:hyperlink>
     </w:p>
-    <w:bookmarkEnd w:id="93"/>
-    <w:bookmarkStart w:id="95" w:name="ref-jayaram2018"/>
+    <w:bookmarkEnd w:id="95"/>
+    <w:bookmarkStart w:id="97" w:name="ref-jayaram2018"/>
     <w:p>
       <w:pPr>
         <w:pStyle w:val="Bibliography"/>
       </w:pPr>
       <w:r>
-        <w:t xml:space="preserve">19.</w:t>
+        <w:t xml:space="preserve">20.</w:t>
       </w:r>
       <w:r>
         <w:t xml:space="preserve"> </w:t>
@@ -3502,7 +3617,7 @@
       <w:r>
         <w:t xml:space="preserve">. J Neural Eng 2018;15:066011. doi:</w:t>
       </w:r>
-      <w:hyperlink r:id="rId94">
+      <w:hyperlink r:id="rId96">
         <w:r>
           <w:rPr>
             <w:rStyle w:val="Hyperlink"/>
@@ -3511,14 +3626,14 @@
         </w:r>
       </w:hyperlink>
     </w:p>
-    <w:bookmarkEnd w:id="95"/>
-    <w:bookmarkStart w:id="97" w:name="ref-ledoit2004"/>
+    <w:bookmarkEnd w:id="97"/>
+    <w:bookmarkStart w:id="99" w:name="ref-ledoit2004"/>
     <w:p>
       <w:pPr>
         <w:pStyle w:val="Bibliography"/>
       </w:pPr>
       <w:r>
-        <w:t xml:space="preserve">20.</w:t>
+        <w:t xml:space="preserve">21.</w:t>
       </w:r>
       <w:r>
         <w:t xml:space="preserve"> </w:t>
@@ -3538,7 +3653,7 @@
       <w:r>
         <w:t xml:space="preserve">. J Multivar Anal 2004;88:365–411. doi:</w:t>
       </w:r>
-      <w:hyperlink r:id="rId96">
+      <w:hyperlink r:id="rId98">
         <w:r>
           <w:rPr>
             <w:rStyle w:val="Hyperlink"/>
@@ -3547,14 +3662,14 @@
         </w:r>
       </w:hyperlink>
     </w:p>
-    <w:bookmarkEnd w:id="97"/>
-    <w:bookmarkStart w:id="99" w:name="ref-lawhern2018"/>
+    <w:bookmarkEnd w:id="99"/>
+    <w:bookmarkStart w:id="101" w:name="ref-lawhern2018"/>
     <w:p>
       <w:pPr>
         <w:pStyle w:val="Bibliography"/>
       </w:pPr>
       <w:r>
-        <w:t xml:space="preserve">21.</w:t>
+        <w:t xml:space="preserve">22.</w:t>
       </w:r>
       <w:r>
         <w:t xml:space="preserve"> </w:t>
@@ -3574,7 +3689,7 @@
       <w:r>
         <w:t xml:space="preserve">. J Neural Eng 2018;15:056013. doi:</w:t>
       </w:r>
-      <w:hyperlink r:id="rId98">
+      <w:hyperlink r:id="rId100">
         <w:r>
           <w:rPr>
             <w:rStyle w:val="Hyperlink"/>
@@ -3583,14 +3698,14 @@
         </w:r>
       </w:hyperlink>
     </w:p>
-    <w:bookmarkEnd w:id="99"/>
-    <w:bookmarkStart w:id="101" w:name="ref-schirrmeister2017"/>
+    <w:bookmarkEnd w:id="101"/>
+    <w:bookmarkStart w:id="103" w:name="ref-schirrmeister2017"/>
     <w:p>
       <w:pPr>
         <w:pStyle w:val="Bibliography"/>
       </w:pPr>
       <w:r>
-        <w:t xml:space="preserve">22.</w:t>
+        <w:t xml:space="preserve">23.</w:t>
       </w:r>
       <w:r>
         <w:t xml:space="preserve"> </w:t>
@@ -3610,7 +3725,7 @@
       <w:r>
         <w:t xml:space="preserve">. Hum Brain Mapp 2017;38:5391–5420. doi:</w:t>
       </w:r>
-      <w:hyperlink r:id="rId100">
+      <w:hyperlink r:id="rId102">
         <w:r>
           <w:rPr>
             <w:rStyle w:val="Hyperlink"/>
@@ -3619,10 +3734,10 @@
         </w:r>
       </w:hyperlink>
     </w:p>
-    <w:bookmarkEnd w:id="101"/>
-    <w:bookmarkEnd w:id="102"/>
     <w:bookmarkEnd w:id="103"/>
-    <w:bookmarkStart w:id="104" w:name="supporting-information-captions"/>
+    <w:bookmarkEnd w:id="104"/>
+    <w:bookmarkEnd w:id="105"/>
+    <w:bookmarkStart w:id="106" w:name="supporting-information-captions"/>
     <w:p>
       <w:pPr>
         <w:pStyle w:val="Heading2"/>
@@ -3649,8 +3764,8 @@
         <w:t xml:space="preserve">Complete component definitions, mathematical assumptions, all methods/budgets/seeds, participant and scenario tables, original sensitivity analyses, prediction identities, provenance and saved-output reproduction instructions.</w:t>
       </w:r>
     </w:p>
-    <w:bookmarkEnd w:id="104"/>
-    <w:bookmarkEnd w:id="105"/>
+    <w:bookmarkEnd w:id="106"/>
+    <w:bookmarkEnd w:id="107"/>
     <w:sectPr>
       <w:footerReference w:type="default" r:id="rId9"/>
       <w:pgSz w:w="11906" w:h="16838"/>
@@ -3773,8 +3888,123 @@
       </w:pPr>
     </w:lvl>
   </w:abstractNum>
+  <w:abstractNum w:abstractNumId="99411">
+    <w:nsid w:val="00A99411"/>
+    <w:multiLevelType w:val="multilevel"/>
+    <w:lvl w:ilvl="0">
+      <w:start w:val="1"/>
+      <w:numFmt w:val="decimal"/>
+      <w:lvlText w:val="%1."/>
+      <w:lvlJc w:val="left"/>
+      <w:pPr>
+        <w:ind w:left="720" w:hanging="480"/>
+      </w:pPr>
+    </w:lvl>
+    <w:lvl w:ilvl="1">
+      <w:start w:val="1"/>
+      <w:numFmt w:val="decimal"/>
+      <w:lvlText w:val="%2."/>
+      <w:lvlJc w:val="left"/>
+      <w:pPr>
+        <w:ind w:left="1440" w:hanging="480"/>
+      </w:pPr>
+    </w:lvl>
+    <w:lvl w:ilvl="2">
+      <w:start w:val="1"/>
+      <w:numFmt w:val="decimal"/>
+      <w:lvlText w:val="%3."/>
+      <w:lvlJc w:val="left"/>
+      <w:pPr>
+        <w:ind w:left="2160" w:hanging="480"/>
+      </w:pPr>
+    </w:lvl>
+    <w:lvl w:ilvl="3">
+      <w:start w:val="1"/>
+      <w:numFmt w:val="decimal"/>
+      <w:lvlText w:val="%4."/>
+      <w:lvlJc w:val="left"/>
+      <w:pPr>
+        <w:ind w:left="2880" w:hanging="480"/>
+      </w:pPr>
+    </w:lvl>
+    <w:lvl w:ilvl="4">
+      <w:start w:val="1"/>
+      <w:numFmt w:val="decimal"/>
+      <w:lvlText w:val="%5."/>
+      <w:lvlJc w:val="left"/>
+      <w:pPr>
+        <w:ind w:left="3600" w:hanging="480"/>
+      </w:pPr>
+    </w:lvl>
+    <w:lvl w:ilvl="5">
+      <w:start w:val="1"/>
+      <w:numFmt w:val="decimal"/>
+      <w:lvlText w:val="%6."/>
+      <w:lvlJc w:val="left"/>
+      <w:pPr>
+        <w:ind w:left="4320" w:hanging="480"/>
+      </w:pPr>
+    </w:lvl>
+    <w:lvl w:ilvl="6">
+      <w:start w:val="1"/>
+      <w:numFmt w:val="decimal"/>
+      <w:lvlText w:val="%7."/>
+      <w:lvlJc w:val="left"/>
+      <w:pPr>
+        <w:ind w:left="5040" w:hanging="480"/>
+      </w:pPr>
+    </w:lvl>
+    <w:lvl w:ilvl="7">
+      <w:start w:val="1"/>
+      <w:numFmt w:val="decimal"/>
+      <w:lvlText w:val="%8."/>
+      <w:lvlJc w:val="left"/>
+      <w:pPr>
+        <w:ind w:left="5760" w:hanging="480"/>
+      </w:pPr>
+    </w:lvl>
+    <w:lvl w:ilvl="8">
+      <w:start w:val="1"/>
+      <w:numFmt w:val="decimal"/>
+      <w:lvlText w:val="%9."/>
+      <w:lvlJc w:val="left"/>
+      <w:pPr>
+        <w:ind w:left="6480" w:hanging="480"/>
+      </w:pPr>
+    </w:lvl>
+  </w:abstractNum>
   <w:num w:numId="1000">
     <w:abstractNumId w:val="990"/>
+  </w:num>
+  <w:num w:numId="1001">
+    <w:abstractNumId w:val="99411"/>
+    <w:lvlOverride w:ilvl="0">
+      <w:startOverride w:val="1"/>
+    </w:lvlOverride>
+    <w:lvlOverride w:ilvl="1">
+      <w:startOverride w:val="1"/>
+    </w:lvlOverride>
+    <w:lvlOverride w:ilvl="2">
+      <w:startOverride w:val="1"/>
+    </w:lvlOverride>
+    <w:lvlOverride w:ilvl="3">
+      <w:startOverride w:val="1"/>
+    </w:lvlOverride>
+    <w:lvlOverride w:ilvl="4">
+      <w:startOverride w:val="1"/>
+    </w:lvlOverride>
+    <w:lvlOverride w:ilvl="5">
+      <w:startOverride w:val="1"/>
+    </w:lvlOverride>
+    <w:lvlOverride w:ilvl="6">
+      <w:startOverride w:val="1"/>
+    </w:lvlOverride>
+    <w:lvlOverride w:ilvl="7">
+      <w:startOverride w:val="1"/>
+    </w:lvlOverride>
+    <w:lvlOverride w:ilvl="8">
+      <w:startOverride w:val="1"/>
+    </w:lvlOverride>
   </w:num>
 </w:numbering>
 </file>

</xml_diff>

<commit_message>
Add fixed external replication and clarify spatial-update manuscript evidence
</commit_message>
<xml_diff>
--- a/manuscript/discovery_revision_20261027/BMT_Manuscript_Review.docx
+++ b/manuscript/discovery_revision_20261027/BMT_Manuscript_Review.docx
@@ -2,13 +2,13 @@
 <file path=word/document.xml><?xml version="1.0" encoding="utf-8"?>
 <w:document xmlns:w="http://schemas.openxmlformats.org/wordprocessingml/2006/main" xmlns:m="http://schemas.openxmlformats.org/officeDocument/2006/math" xmlns:r="http://schemas.openxmlformats.org/officeDocument/2006/relationships" xmlns:o="urn:schemas-microsoft-com:office:office" xmlns:v="urn:schemas-microsoft-com:vml" xmlns:w10="urn:schemas-microsoft-com:office:word" xmlns:a="http://schemas.openxmlformats.org/drawingml/2006/main" xmlns:pic="http://schemas.openxmlformats.org/drawingml/2006/picture" xmlns:wp="http://schemas.openxmlformats.org/drawingml/2006/wordprocessingDrawing">
   <w:body>
-    <w:bookmarkStart w:id="107" w:name="Xd5ee45a240f1906734d08c103182a2bfbacc3be"/>
+    <w:bookmarkStart w:id="114" w:name="X49b58c788bf15f9a3c20fb3281ba874051f6f74"/>
     <w:p>
       <w:pPr>
         <w:pStyle w:val="Heading1"/>
       </w:pPr>
       <w:r>
-        <w:t xml:space="preserve">Spatial-filter refitting improves limited-label EEG decoding beyond classifier recalibration</w:t>
+        <w:t xml:space="preserve">Matched-label analysis identifies spatial refitting and alignment gains in motor-imagery EEG</w:t>
       </w:r>
     </w:p>
     <w:p>
@@ -26,7 +26,7 @@
         <w:t xml:space="preserve"> </w:t>
       </w:r>
       <w:r>
-        <w:t xml:space="preserve">Spatial refitting with limited calibration labels</w:t>
+        <w:t xml:space="preserve">Spatial updates with limited calibration labels</w:t>
       </w:r>
     </w:p>
     <w:p>
@@ -112,7 +112,7 @@
         <w:t xml:space="preserve"> </w:t>
       </w:r>
       <w:r>
-        <w:t xml:space="preserve">To quantify the added value of spatial-filter refitting beyond classifier recalibration with approximately 20 current-session labels.</w:t>
+        <w:t xml:space="preserve">To determine which spatial update adds value beyond classifier recalibration with 20 current-session labels.</w:t>
       </w:r>
     </w:p>
     <w:p>
@@ -130,7 +130,7 @@
         <w:t xml:space="preserve"> </w:t>
       </w:r>
       <w:r>
-        <w:t xml:space="preserve">We compared frozen common spatial patterns and linear discriminant analysis (CSP/LDA), classifier-only recalibration and full refitting in 18 participants across six Kumar2024 sessions. The predefined primary cohort contained 12 participants. The two updating methods received identical source and current-session labels. Later component experiments used the six development participants.</w:t>
+        <w:t xml:space="preserve">We compared frozen common spatial patterns and linear discriminant analysis (CSP/LDA), classifier-only recalibration and full refitting in 18 Kumar2024 participants across six sessions. The original primary cohort contained 12 participants. A fixed four-method replication added nine BNCI2014-001 participants and support-only Euclidean alignment (EA-CSP). Updating methods received identical labels within each dataset.</w:t>
       </w:r>
     </w:p>
     <w:p>
@@ -148,7 +148,7 @@
         <w:t xml:space="preserve"> </w:t>
       </w:r>
       <w:r>
-        <w:t xml:space="preserve">Full refitting achieved 65.36% balanced accuracy, 7.42 percentage points above freezing (95% participant-bootstrap interval 2.49–12.48). The secondary, matched-label full-minus-classifier-only gain was 5.47 points (2.17–8.91), accounting for 73.7% of the mean total gain. It was positive in ten of 12 participant averages and all five target-session averages. At the 20-label cap, fixed-normalization neural adaptation was 1.50–1.91 points higher than adaptive normalization and produced fewer single-class predictions. Smaller-budget profiles differed. Strong-reference comparisons favored simpler geometric decoders; source-functional constraints changed accuracy little.</w:t>
+        <w:t xml:space="preserve">In Kumar2024, full refitting achieved 65.36% balanced accuracy, 7.42 percentage points above freezing (95% participant-bootstrap interval 2.49–12.48). The secondary full-minus-classifier-only gain was 5.47 points (2.17–8.91), accounting for 73.7% of the mean total gain. In BNCI, full-minus-classifier-only was 0.19 points (−1.85 to 2.13). EA-CSP achieved 77.50%, improving on full refitting by 5.65 points (3.15–8.70; Holm-adjusted p=0.01172), with gains in all nine participants. Fixed source normalization also reduced single-class neural predictions at the 20-label cap.</w:t>
       </w:r>
     </w:p>
     <w:p>
@@ -166,7 +166,7 @@
         <w:t xml:space="preserve"> </w:t>
       </w:r>
       <w:r>
-        <w:t xml:space="preserve">Matched-label component analysis identified spatial-filter refitting as the main contributor to the observed recalibration gain. It separates the value of updating the representation from the value of recalibrating its classifier.</w:t>
+        <w:t xml:space="preserve">Matched-label comparisons distinguish the contributions of spatial refitting and support-only alignment. Their different effects across datasets make the update operation central to limited-label recalibration.</w:t>
       </w:r>
     </w:p>
     <w:p>
@@ -390,17 +390,17 @@
           <w:b/>
           <w:bCs/>
         </w:rPr>
-        <w:t xml:space="preserve">Matched mechanism controls.</w:t>
-      </w:r>
-      <w:r>
-        <w:t xml:space="preserve"> </w:t>
-      </w:r>
-      <w:r>
-        <w:t xml:space="preserve">Conventional alignment, geometric uncertainty and neural update modes test which additional operations affect decoding under explicit information budgets. Complete strong-reference and ablation results connect the spatial gain to practical update choices.</w:t>
+        <w:t xml:space="preserve">An external comparison of update operations.</w:t>
+      </w:r>
+      <w:r>
+        <w:t xml:space="preserve"> </w:t>
+      </w:r>
+      <w:r>
+        <w:t xml:space="preserve">A fixed nine-participant BNCI2014-001 replication compares the same component contrast with support-only EA-CSP under exactly 20 target labels. Neural normalization and geometric controls locate further operation-specific effects in the development cohort.</w:t>
       </w:r>
     </w:p>
     <w:bookmarkEnd w:id="21"/>
-    <w:bookmarkStart w:id="29" w:name="materials-and-methods"/>
+    <w:bookmarkStart w:id="30" w:name="materials-and-methods"/>
     <w:p>
       <w:pPr>
         <w:pStyle w:val="Heading2"/>
@@ -441,7 +441,16 @@
         <w:t xml:space="preserve">[9, 10]</w:t>
       </w:r>
       <w:r>
-        <w:t xml:space="preserve">. The original study reported University of Texas at Austin ethical approval under protocol 2020-03-0073 and written informed consent before data collection.</w:t>
+        <w:t xml:space="preserve">, and the original BNCI2014-001/BCI Competition IV 2a recordings</w:t>
+      </w:r>
+      <w:r>
+        <w:t xml:space="preserve"> </w:t>
+      </w:r>
+      <w:r>
+        <w:t xml:space="preserve">[18]</w:t>
+      </w:r>
+      <w:r>
+        <w:t xml:space="preserve">. The Kumar acquisition study reported University of Texas at Austin ethical approval under protocol 2020-03-0073 and written informed consent. These statements concern Kumar data collection. BNCI source documentation and its reported ethics information are identified separately in Supplementary Section S12.</w:t>
       </w:r>
     </w:p>
     <w:p>
@@ -471,7 +480,7 @@
         <w:t xml:space="preserve"> </w:t>
       </w:r>
       <w:r>
-        <w:t xml:space="preserve">[18]</w:t>
+        <w:t xml:space="preserve">[19]</w:t>
       </w:r>
       <w:r>
         <w:t xml:space="preserve">. It used lawfully obtained publicly available data, caused no harm to participants, and did not involve sensitive personal information or commercial interests.</w:t>
@@ -482,7 +491,7 @@
         <w:pStyle w:val="BodyText"/>
       </w:pPr>
       <w:r>
-        <w:t xml:space="preserve">Dataset metadata were accessed on 10 October 2026, and the selected EEG recordings and accompanying metadata were retrieved on 11 October 2026. This secondary analysis used the released coded participant identifiers; no participants were contacted and no re-identification was attempted. The author had no access to information that could identify individual participants during or after data collection. Original collection approval and consent and the regulatory basis for this secondary analysis are documented separately in the retained provenance materials.</w:t>
+        <w:t xml:space="preserve">Kumar dataset metadata were accessed on 10 October 2026, and the selected EEG recordings and accompanying metadata were retrieved on 11 October 2026. This secondary analysis used the released coded participant identifiers; no participants were contacted and no re-identification was attempted. The author had no access to information that could identify individual participants during or after data collection. Original collection approval and consent and the regulatory basis for this secondary analysis are documented separately in the retained provenance materials.</w:t>
       </w:r>
     </w:p>
     <w:bookmarkEnd w:id="22"/>
@@ -514,7 +523,7 @@
         <w:t xml:space="preserve"> </w:t>
       </w:r>
       <w:r>
-        <w:t xml:space="preserve">[19]</w:t>
+        <w:t xml:space="preserve">[20]</w:t>
       </w:r>
       <w:r>
         <w:t xml:space="preserve">; the documented MOABB adapter maps cues to a [0, 5]-second interval</w:t>
@@ -523,7 +532,7 @@
         <w:t xml:space="preserve"> </w:t>
       </w:r>
       <w:r>
-        <w:t xml:space="preserve">[20]</w:t>
+        <w:t xml:space="preserve">[21]</w:t>
       </w:r>
       <w:r>
         <w:t xml:space="preserve">. The original procedure included a 1.5-second cue preceding feedback and variable online feedback duration. Our endpoint is therefore task-label decoding over released cue-anchored windows. Original trial-level task-end and feedback markers were unavailable for phase reconstruction.</w:t>
@@ -574,7 +583,7 @@
         <w:t xml:space="preserve"> </w:t>
       </w:r>
       <w:r>
-        <w:t xml:space="preserve">[21]</w:t>
+        <w:t xml:space="preserve">[22]</w:t>
       </w:r>
       <w:r>
         <w:t xml:space="preserve">. Frozen decoding used 40 source-training trials. LDA-only retained source CSP and refitted LDA on source training plus current support; full refitting re-estimated both components on that same union. Their difference measures the added spatial update and classifier fit in the revised feature space.</w:t>
@@ -591,7 +600,7 @@
         <w:t xml:space="preserve"> </w:t>
       </w:r>
       <w:r>
-        <w:t xml:space="preserve">[22, 23]</w:t>
+        <w:t xml:space="preserve">[23, 24]</w:t>
       </w:r>
       <w:r>
         <w:t xml:space="preserve">. All 54 models and seed outcomes were retained. The HPC extension used the separately specified compact architecture below.</w:t>
@@ -632,7 +641,50 @@
       </w:r>
     </w:p>
     <w:bookmarkEnd w:id="25"/>
-    <w:bookmarkStart w:id="26" w:name="neural-update-mode-experiment"/>
+    <w:bookmarkStart w:id="26" w:name="external-fixed-budget-replication"/>
+    <w:p>
+      <w:pPr>
+        <w:pStyle w:val="Heading3"/>
+      </w:pPr>
+      <w:r>
+        <w:t xml:space="preserve">External fixed-budget replication</w:t>
+      </w:r>
+    </w:p>
+    <w:p>
+      <w:pPr>
+        <w:pStyle w:val="FirstParagraph"/>
+      </w:pPr>
+      <w:r>
+        <w:t xml:space="preserve">BNCI2014-001 contains nine participants, two different-day sessions and six runs per session</w:t>
+      </w:r>
+      <w:r>
+        <w:t xml:space="preserve"> </w:t>
+      </w:r>
+      <w:r>
+        <w:t xml:space="preserve">[18]</w:t>
+      </w:r>
+      <w:r>
+        <w:t xml:space="preserve">. We retained left/right imagery and the first 22 EEG channels. The MAT trial-start index precedes the cue by two seconds; epochs covered cue time [0,4) seconds at 250 Hz. A fourth-order 8–30 Hz Butterworth filter operated within each continuous run, with zero phase and the recorded reference. Original artifact flags were retained without trial rejection.</w:t>
+      </w:r>
+    </w:p>
+    <w:p>
+      <w:pPr>
+        <w:pStyle w:val="BodyText"/>
+      </w:pPr>
+      <w:r>
+        <w:t xml:space="preserve">Source runs 1–4 supplied 96 labels. Source runs 5–6 were withheld. The first 20 chronological hand trials of the first target run supplied support; its remaining four hand trials were withheld. Whole target runs 2–6 supplied 120 query trials. LDA-only, full CSP/LDA and EA-CSP used identical source/support trial identities. Frozen decoding received no target labels. EA estimated separate source and support covariance references; query signals did not estimate either reference.</w:t>
+      </w:r>
+    </w:p>
+    <w:p>
+      <w:pPr>
+        <w:pStyle w:val="BodyText"/>
+      </w:pPr>
+      <w:r>
+        <w:t xml:space="preserve">The existing V2 implementation used four CSP components and fixed covariance/LDA shrinkage of 0.1. This differs from the original Kumar MNE/Ledoit–Wolf implementation and its 40-label source budget. The external protocol fixed methods, inputs and endpoints before its predictions were generated; it performed no parameter search. BNCI had previously been used in the first-paper project; this is an independent-data replication of the component question. Supplementary Section S12 gives all partitions and the fixed execution version.</w:t>
+      </w:r>
+    </w:p>
+    <w:bookmarkEnd w:id="26"/>
+    <w:bookmarkStart w:id="27" w:name="neural-update-mode-experiment"/>
     <w:p>
       <w:pPr>
         <w:pStyle w:val="Heading3"/>
@@ -734,8 +786,8 @@
         <w:t xml:space="preserve">.</w:t>
       </w:r>
     </w:p>
-    <w:bookmarkEnd w:id="26"/>
-    <w:bookmarkStart w:id="27" w:name="geometric-estimator-and-matched-controls"/>
+    <w:bookmarkEnd w:id="27"/>
+    <w:bookmarkStart w:id="28" w:name="geometric-estimator-and-matched-controls"/>
     <w:p>
       <w:pPr>
         <w:pStyle w:val="Heading3"/>
@@ -768,8 +820,8 @@
         <w:t xml:space="preserve">Saved synthetic experiments tested all nine methods across 384 known-mechanism conditions and 50 paired repetitions, varying dimension, sample sizes, shift, anisotropy and serial correlation. These results were analyzed separately from EEG.</w:t>
       </w:r>
     </w:p>
-    <w:bookmarkEnd w:id="27"/>
-    <w:bookmarkStart w:id="28" w:name="Xd111514ca2d2af0cea73fe195b48d10f27a6c9e"/>
+    <w:bookmarkEnd w:id="28"/>
+    <w:bookmarkStart w:id="29" w:name="Xd111514ca2d2af0cea73fe195b48d10f27a6c9e"/>
     <w:p>
       <w:pPr>
         <w:pStyle w:val="Heading3"/>
@@ -825,12 +877,20 @@
         <w:pStyle w:val="BodyText"/>
       </w:pPr>
       <w:r>
-        <w:t xml:space="preserve">Saved trial identities, labels and metrics were checked before aggregation. The revision reused predictions and histories; no model fitting or new inference was required. The supplement identifies the full result packet, code and provenance checks.</w:t>
-      </w:r>
-    </w:p>
-    <w:bookmarkEnd w:id="28"/>
+        <w:t xml:space="preserve">The external replication had one fixed primary contrast, full CSP/LDA minus LDA-only. Its two-sided exact sign-flip test enumerated 512 sign assignments with the observed difference magnitudes. Three secondary contrasts (full minus frozen, LDA-only minus frozen, EA minus full) formed a separate Holm family. Paired participant-bootstrap intervals used 10,000 draws, seed 20261027 and participant order 1–9. Dataset cohorts were analyzed separately.</w:t>
+      </w:r>
+    </w:p>
+    <w:p>
+      <w:pPr>
+        <w:pStyle w:val="BodyText"/>
+      </w:pPr>
+      <w:r>
+        <w:t xml:space="preserve">Saved trial identities, labels and metrics were checked before aggregation. Kumar analyses reused predictions and histories; the external replication generated its own four-method predictions. All external BA values were independently reconstructed from the saved predictions without another model evaluation.</w:t>
+      </w:r>
+    </w:p>
     <w:bookmarkEnd w:id="29"/>
-    <w:bookmarkStart w:id="48" w:name="results"/>
+    <w:bookmarkEnd w:id="30"/>
+    <w:bookmarkStart w:id="53" w:name="results"/>
     <w:p>
       <w:pPr>
         <w:pStyle w:val="Heading2"/>
@@ -839,7 +899,7 @@
         <w:t xml:space="preserve">Results</w:t>
       </w:r>
     </w:p>
-    <w:bookmarkStart w:id="33" w:name="Xc8edcf379a78d5be36bb29daa3384fbc6b58e77"/>
+    <w:bookmarkStart w:id="34" w:name="Xc8edcf379a78d5be36bb29daa3384fbc6b58e77"/>
     <w:p>
       <w:pPr>
         <w:pStyle w:val="Heading3"/>
@@ -1386,18 +1446,18 @@
           <wp:inline>
             <wp:extent cx="5334000" cy="2795185"/>
             <wp:effectExtent b="0" l="0" r="0" t="0"/>
-            <wp:docPr descr="Figure 1" title="" id="31" name="Picture"/>
+            <wp:docPr descr="Figure 1" title="" id="32" name="Picture"/>
             <a:graphic>
               <a:graphicData uri="http://schemas.openxmlformats.org/drawingml/2006/picture">
                 <pic:pic>
                   <pic:nvPicPr>
-                    <pic:cNvPr descr="figures/Fig1_update_components.png" id="32" name="Picture"/>
+                    <pic:cNvPr descr="figures/Fig1_update_components.png" id="33" name="Picture"/>
                     <pic:cNvPicPr>
                       <a:picLocks noChangeArrowheads="1" noChangeAspect="1"/>
                     </pic:cNvPicPr>
                   </pic:nvPicPr>
                   <pic:blipFill>
-                    <a:blip r:embed="rId30"/>
+                    <a:blip r:embed="rId31"/>
                     <a:stretch>
                       <a:fillRect/>
                     </a:stretch>
@@ -1442,8 +1502,8 @@
         <w:t xml:space="preserve">Original primary-cohort component and total contrasts are displayed separately from the six-participant V2 budget profiles. Participant values, cohort means and participant-bootstrap intervals retain their original denominators and endpoint hierarchy. The original full-minus-LDA-only result compares matched labels; the V2 profiles compare separately versioned methods within the discovery cohort.</w:t>
       </w:r>
     </w:p>
-    <w:bookmarkEnd w:id="33"/>
-    <w:bookmarkStart w:id="34" w:name="Xdafc897e219783402c84ca3b110848a0a40ca9f"/>
+    <w:bookmarkEnd w:id="34"/>
+    <w:bookmarkStart w:id="35" w:name="Xdafc897e219783402c84ca3b110848a0a40ca9f"/>
     <w:p>
       <w:pPr>
         <w:pStyle w:val="Heading3"/>
@@ -1468,8 +1528,8 @@
         <w:t xml:space="preserve">These results motivated the source-fixed feature and component controls in V3.</w:t>
       </w:r>
     </w:p>
-    <w:bookmarkEnd w:id="34"/>
-    <w:bookmarkStart w:id="38" w:name="Xec716033d9fb495497d1014a38015ddbbc180ea"/>
+    <w:bookmarkEnd w:id="35"/>
+    <w:bookmarkStart w:id="39" w:name="Xec716033d9fb495497d1014a38015ddbbc180ea"/>
     <w:p>
       <w:pPr>
         <w:pStyle w:val="Heading3"/>
@@ -1894,18 +1954,18 @@
           <wp:inline>
             <wp:extent cx="5334000" cy="3376185"/>
             <wp:effectExtent b="0" l="0" r="0" t="0"/>
-            <wp:docPr descr="Figure 2" title="" id="36" name="Picture"/>
+            <wp:docPr descr="Figure 2" title="" id="37" name="Picture"/>
             <a:graphic>
               <a:graphicData uri="http://schemas.openxmlformats.org/drawingml/2006/picture">
                 <pic:pic>
                   <pic:nvPicPr>
-                    <pic:cNvPr descr="figures/Fig2_geometry.png" id="37" name="Picture"/>
+                    <pic:cNvPr descr="figures/Fig2_geometry.png" id="38" name="Picture"/>
                     <pic:cNvPicPr>
                       <a:picLocks noChangeArrowheads="1" noChangeAspect="1"/>
                     </pic:cNvPicPr>
                   </pic:nvPicPr>
                   <pic:blipFill>
-                    <a:blip r:embed="rId35"/>
+                    <a:blip r:embed="rId36"/>
                     <a:stretch>
                       <a:fillRect/>
                     </a:stretch>
@@ -1950,8 +2010,8 @@
         <w:t xml:space="preserve">Full support-budget profiles and cap-20 paired contrasts retain ordinary tangent refitting and EA-CSP as strong references. Ablations separate posterior mean estimation, prediction covariance, source-mean noise and common/contrast variation scales. All candidate-versus-ablation and strong-reference contrasts are displayed together; intervals use participant-bootstrap resampling.</w:t>
       </w:r>
     </w:p>
-    <w:bookmarkEnd w:id="38"/>
-    <w:bookmarkStart w:id="42" w:name="X8394cadf07058e2aec1a2af99d9e9f678aa0369"/>
+    <w:bookmarkEnd w:id="39"/>
+    <w:bookmarkStart w:id="43" w:name="X8394cadf07058e2aec1a2af99d9e9f678aa0369"/>
     <w:p>
       <w:pPr>
         <w:pStyle w:val="Heading3"/>
@@ -2424,18 +2484,18 @@
           <wp:inline>
             <wp:extent cx="5334000" cy="2692316"/>
             <wp:effectExtent b="0" l="0" r="0" t="0"/>
-            <wp:docPr descr="Figure 3" title="" id="40" name="Picture"/>
+            <wp:docPr descr="Figure 3" title="" id="41" name="Picture"/>
             <a:graphic>
               <a:graphicData uri="http://schemas.openxmlformats.org/drawingml/2006/picture">
                 <pic:pic>
                   <pic:nvPicPr>
-                    <pic:cNvPr descr="figures/Fig3_neural_normalization.png" id="41" name="Picture"/>
+                    <pic:cNvPr descr="figures/Fig3_neural_normalization.png" id="42" name="Picture"/>
                     <pic:cNvPicPr>
                       <a:picLocks noChangeArrowheads="1" noChangeAspect="1"/>
                     </pic:cNvPicPr>
                   </pic:nvPicPr>
                   <pic:blipFill>
-                    <a:blip r:embed="rId39"/>
+                    <a:blip r:embed="rId40"/>
                     <a:stretch>
                       <a:fillRect/>
                     </a:stretch>
@@ -2480,8 +2540,8 @@
         <w:t xml:space="preserve">Fixed-minus-adaptive BN contrasts are shown for both source regimes across all five caps, together with the cap-20 participant contrasts and single-class prediction counts. Fixed and adaptive BN use the same current support, initialization, optimizer budget and Dropout-off setting within each comparison. They differ in normalization during optimization and the resulting inference state. Collapse counts are nested seed/session observations; participant-level summaries define the uncertainty intervals.</w:t>
       </w:r>
     </w:p>
-    <w:bookmarkEnd w:id="42"/>
-    <w:bookmarkStart w:id="43" w:name="Xbec4234a1587e7acd3e4c84752377a905b27c4a"/>
+    <w:bookmarkEnd w:id="43"/>
+    <w:bookmarkStart w:id="44" w:name="Xbec4234a1587e7acd3e4c84752377a905b27c4a"/>
     <w:p>
       <w:pPr>
         <w:pStyle w:val="Heading3"/>
@@ -2514,8 +2574,8 @@
         <w:t xml:space="preserve">At the core KL bound 0.01, the functional constraint changed the cap-20 mean relative to ordinary fixed-BN adaptation by −0.01 points for individual sources and +0.03 points for pooled sources. At bound 0.1, BA matched the ordinary update in both regimes; bound 0.001 produced differences of −0.22 and −0.19 points, respectively, with intervals crossing zero. The complete dose profiles and accepted/rejected-step histories are retained.</w:t>
       </w:r>
     </w:p>
-    <w:bookmarkEnd w:id="43"/>
-    <w:bookmarkStart w:id="47" w:name="Xc72e392fb25bf57866e321c383f7e8843555fd8"/>
+    <w:bookmarkEnd w:id="44"/>
+    <w:bookmarkStart w:id="48" w:name="Xc72e392fb25bf57866e321c383f7e8843555fd8"/>
     <w:p>
       <w:pPr>
         <w:pStyle w:val="Heading3"/>
@@ -2541,18 +2601,18 @@
           <wp:inline>
             <wp:extent cx="5334000" cy="5077927"/>
             <wp:effectExtent b="0" l="0" r="0" t="0"/>
-            <wp:docPr descr="Figure 4" title="" id="45" name="Picture"/>
+            <wp:docPr descr="Figure 4" title="" id="46" name="Picture"/>
             <a:graphic>
               <a:graphicData uri="http://schemas.openxmlformats.org/drawingml/2006/picture">
                 <pic:pic>
                   <pic:nvPicPr>
-                    <pic:cNvPr descr="figures/Fig4_mechanisms.png" id="46" name="Picture"/>
+                    <pic:cNvPr descr="figures/Fig4_mechanisms.png" id="47" name="Picture"/>
                     <pic:cNvPicPr>
                       <a:picLocks noChangeArrowheads="1" noChangeAspect="1"/>
                     </pic:cNvPicPr>
                   </pic:nvPicPr>
                   <pic:blipFill>
-                    <a:blip r:embed="rId44"/>
+                    <a:blip r:embed="rId45"/>
                     <a:stretch>
                       <a:fillRect/>
                     </a:stretch>
@@ -2597,9 +2657,100 @@
         <w:t xml:space="preserve">All 384 conditions retain 50 paired repeats. Panels show candidate-minus-refit BA by source size/correlation, all generating shifts, paired scenario BA, and posterior-versus-point changes in cross entropy and BA. Synthetic results are separate from human EEG endpoints.</w:t>
       </w:r>
     </w:p>
-    <w:bookmarkEnd w:id="47"/>
     <w:bookmarkEnd w:id="48"/>
-    <w:bookmarkStart w:id="54" w:name="discussion"/>
+    <w:bookmarkStart w:id="52" w:name="X009f0f542f8674aff5b3ff877eb952a2336c86d"/>
+    <w:p>
+      <w:pPr>
+        <w:pStyle w:val="Heading3"/>
+      </w:pPr>
+      <w:r>
+        <w:t xml:space="preserve">Support-only alignment improved the external fixed-budget comparison</w:t>
+      </w:r>
+    </w:p>
+    <w:p>
+      <w:pPr>
+        <w:pStyle w:val="FirstParagraph"/>
+      </w:pPr>
+      <w:r>
+        <w:t xml:space="preserve">In BNCI2014-001, mean BA was 70.56% for frozen CSP/LDA, 71.67% for LDA-only, 71.85% for full refitting and 77.50% for EA-CSP (Figure 5). The fixed primary full-minus-LDA-only contrast was +0.19 points (95% interval −1.85 to 2.13; exact p=0.96875): three participants improved, three decreased and three were unchanged. Full-minus-frozen was +1.30 points (−1.76 to 3.98; Holm p=0.68750), while LDA-only-minus-frozen was +1.11 points (−0.46 to 2.96; Holm p=0.68750).</w:t>
+      </w:r>
+    </w:p>
+    <w:p>
+      <w:pPr>
+        <w:pStyle w:val="BodyText"/>
+      </w:pPr>
+      <w:r>
+        <w:t xml:space="preserve">EA-CSP improved on full refitting by 5.65 points (3.15–8.70; exact p=0.00391; Holm p=0.01172). All nine participant differences were positive, ranging from +0.83 to +15.83 points. The leave-one-participant-out mean ranged from +4.38 to +6.25 points. All five query-run cohort means favored EA over full refitting. These methods used the same 20 target labels and 120 query trials per participant; target alignment statistics came only from those support trials. Supplementary Section S12 reports every participant and contrast.</w:t>
+      </w:r>
+    </w:p>
+    <w:p>
+      <w:pPr>
+        <w:pStyle w:val="BodyText"/>
+      </w:pPr>
+      <w:r>
+        <w:drawing>
+          <wp:inline>
+            <wp:extent cx="5334000" cy="4436650"/>
+            <wp:effectExtent b="0" l="0" r="0" t="0"/>
+            <wp:docPr descr="Figure 5" title="" id="50" name="Picture"/>
+            <a:graphic>
+              <a:graphicData uri="http://schemas.openxmlformats.org/drawingml/2006/picture">
+                <pic:pic>
+                  <pic:nvPicPr>
+                    <pic:cNvPr descr="figures/Fig5_external_validation.png" id="51" name="Picture"/>
+                    <pic:cNvPicPr>
+                      <a:picLocks noChangeArrowheads="1" noChangeAspect="1"/>
+                    </pic:cNvPicPr>
+                  </pic:nvPicPr>
+                  <pic:blipFill>
+                    <a:blip r:embed="rId49"/>
+                    <a:stretch>
+                      <a:fillRect/>
+                    </a:stretch>
+                  </pic:blipFill>
+                  <pic:spPr bwMode="auto">
+                    <a:xfrm>
+                      <a:off x="0" y="0"/>
+                      <a:ext cx="5334000" cy="4436650"/>
+                    </a:xfrm>
+                    <a:prstGeom prst="rect">
+                      <a:avLst/>
+                    </a:prstGeom>
+                    <a:noFill/>
+                    <a:ln w="9525">
+                      <a:noFill/>
+                      <a:headEnd/>
+                      <a:tailEnd/>
+                    </a:ln>
+                  </pic:spPr>
+                </pic:pic>
+              </a:graphicData>
+            </a:graphic>
+          </wp:inline>
+        </w:drawing>
+      </w:r>
+    </w:p>
+    <w:p>
+      <w:pPr>
+        <w:pStyle w:val="BodyText"/>
+      </w:pPr>
+      <w:r>
+        <w:rPr>
+          <w:b/>
+          <w:bCs/>
+        </w:rPr>
+        <w:t xml:space="preserve">Figure 5. External fixed-budget comparison.</w:t>
+      </w:r>
+      <w:r>
+        <w:t xml:space="preserve"> </w:t>
+      </w:r>
+      <w:r>
+        <w:t xml:space="preserve">A: participant BA and cohort means. B: participant differences and pointwise 95% bootstrap intervals. C–D: paired differences across five whole query runs. Nine participants contributed 120 query trials each. Updating methods shared 20 support labels; EA references used source/support only.</w:t>
+      </w:r>
+    </w:p>
+    <w:bookmarkEnd w:id="52"/>
+    <w:bookmarkEnd w:id="53"/>
+    <w:bookmarkStart w:id="59" w:name="discussion"/>
     <w:p>
       <w:pPr>
         <w:pStyle w:val="Heading2"/>
@@ -2608,7 +2759,7 @@
         <w:t xml:space="preserve">Discussion</w:t>
       </w:r>
     </w:p>
-    <w:bookmarkStart w:id="49" w:name="X321fb6ee669b04d9d182a4aeaad63a66664a081"/>
+    <w:bookmarkStart w:id="54" w:name="X321fb6ee669b04d9d182a4aeaad63a66664a081"/>
     <w:p>
       <w:pPr>
         <w:pStyle w:val="Heading3"/>
@@ -2630,6 +2781,14 @@
         <w:pStyle w:val="BodyText"/>
       </w:pPr>
       <w:r>
+        <w:t xml:space="preserve">The external experiment separates spatial refitting from alignment. With the same 20 current labels, ordinary full refitting was close to classifier-only recalibration, whereas support-only EA improved on full refitting in all nine participants. This places the original 5.47-point gain in context: its magnitude did not recur under the external data and implementation. An operation-level comparison, rather than a blanket instruction to update spatial filters, captures both findings. Acquisition, source budget, referencing and covariance estimators differed between datasets, so their individual contributions to this difference remain unresolved.</w:t>
+      </w:r>
+    </w:p>
+    <w:p>
+      <w:pPr>
+        <w:pStyle w:val="BodyText"/>
+      </w:pPr>
+      <w:r>
         <w:t xml:space="preserve">The neural extension adds a complementary observation. At the final support cap, fixed-source BN during full weight adaptation outperformed adaptive BN in both initialization regimes, with fewer collapsed seed/session predictions. This contrasts with the successful CSP spatial update. The component analysis distinguishes a supervised spatial estimator from repeated normalization updates, making the observed gain attributable to a specific pipeline operation.</w:t>
       </w:r>
     </w:p>
@@ -2641,8 +2800,8 @@
         <w:t xml:space="preserve">The principal conventional result also has a direct trial-level explanation. The added spatial update corrected more class-balanced errors than it introduced, and its mean benefit involved both labels. Positive session means and participant-deletion summaries show that its cohort average was not supplied by a single participant or only one point in the session sequence. The participant and development-cohort results document variation around this positive primary-cohort mean.</w:t>
       </w:r>
     </w:p>
-    <w:bookmarkEnd w:id="49"/>
-    <w:bookmarkStart w:id="50" w:name="X90e28b01f97b61fba2cce76bda988773ae15049"/>
+    <w:bookmarkEnd w:id="54"/>
+    <w:bookmarkStart w:id="55" w:name="X90e28b01f97b61fba2cce76bda988773ae15049"/>
     <w:p>
       <w:pPr>
         <w:pStyle w:val="Heading3"/>
@@ -2684,8 +2843,8 @@
         <w:t xml:space="preserve">. They also give a focused next hypothesis: when adaptation repeatedly revisits a short support run, normalization mode and exposure count should be controlled independently of label count. A follow-up can vary the BN update schedule while preserving the trained sources, support identities and comparison hierarchy.</w:t>
       </w:r>
     </w:p>
-    <w:bookmarkEnd w:id="50"/>
-    <w:bookmarkStart w:id="51" w:name="X9bea0190cc77cd693194f258d1988f8b13583d2"/>
+    <w:bookmarkEnd w:id="55"/>
+    <w:bookmarkStart w:id="56" w:name="X9bea0190cc77cd693194f258d1988f8b13583d2"/>
     <w:p>
       <w:pPr>
         <w:pStyle w:val="Heading3"/>
@@ -2727,8 +2886,8 @@
         <w:t xml:space="preserve">. The present evidence identifies their value through explicit information budgets and matched component comparisons.</w:t>
       </w:r>
     </w:p>
-    <w:bookmarkEnd w:id="51"/>
-    <w:bookmarkStart w:id="52" w:name="X591f6d5db673ac8c106611d036e275e1a7bcf46"/>
+    <w:bookmarkEnd w:id="56"/>
+    <w:bookmarkStart w:id="57" w:name="X591f6d5db673ac8c106611d036e275e1a7bcf46"/>
     <w:p>
       <w:pPr>
         <w:pStyle w:val="Heading3"/>
@@ -2753,8 +2912,8 @@
         <w:t xml:space="preserve">The original source/support probes also distinguished calibration agreement from correct task orientation. Of 30 development support sessions, 19 had positive source-score contrasts in both chronological halves, two were negative in both, and nine changed sign. Agreement can coexist with reversed orientation. These findings motivate testing support-driven selection among fixed component choices in an independent evaluation.</w:t>
       </w:r>
     </w:p>
-    <w:bookmarkEnd w:id="52"/>
-    <w:bookmarkStart w:id="53" w:name="scope-and-next-validation"/>
+    <w:bookmarkEnd w:id="57"/>
+    <w:bookmarkStart w:id="58" w:name="scope-and-next-validation"/>
     <w:p>
       <w:pPr>
         <w:pStyle w:val="Heading3"/>
@@ -2768,28 +2927,28 @@
         <w:pStyle w:val="FirstParagraph"/>
       </w:pPr>
       <w:r>
-        <w:t xml:space="preserve">The study uses one public longitudinal cohort. The original primary hierarchy is retained; V2/V3, prediction transitions and sensitivity analyses used previously exposed data. The extension estimates are exploratory, conditional on the recorded source models and support schedules. Pooled teachers share participants and change source-label budgets; the independent sample remains the participant cohort.</w:t>
-      </w:r>
-    </w:p>
-    <w:p>
-      <w:pPr>
-        <w:pStyle w:val="BodyText"/>
-      </w:pPr>
-      <w:r>
-        <w:t xml:space="preserve">Cue-anchored windows may contain cue, imagery, feedback or post-task activity. Phase-specific decoding requires original marker-level reconstruction. Amplitude-restricted queries retained positive spatial gains in eligible participants, while training/support artifacts and other query artifacts remain possible. Zero-phase filtering makes the present endpoint offline.</w:t>
-      </w:r>
-    </w:p>
-    <w:p>
-      <w:pPr>
-        <w:pStyle w:val="BodyText"/>
-      </w:pPr>
-      <w:r>
-        <w:t xml:space="preserve">An independent longitudinal study can freeze the matched-label spatial comparison and separately control BN exposure count and minibatch size. These are specific hypotheses generated by the component results.</w:t>
-      </w:r>
-    </w:p>
-    <w:bookmarkEnd w:id="53"/>
-    <w:bookmarkEnd w:id="54"/>
-    <w:bookmarkStart w:id="55" w:name="conclusions"/>
+        <w:t xml:space="preserve">The study uses Kumar2024 and the independent BNCI2014-001 acquisition. The external dataset provides two days, whereas Kumar provides six sessions. The original primary hierarchy is retained; V2/V3, prediction transitions and sensitivity analyses used previously exposed data. The extension estimates are exploratory, conditional on the recorded source models and support schedules. Pooled teachers share participants and change source-label budgets; the independent sample remains the participant cohort.</w:t>
+      </w:r>
+    </w:p>
+    <w:p>
+      <w:pPr>
+        <w:pStyle w:val="BodyText"/>
+      </w:pPr>
+      <w:r>
+        <w:t xml:space="preserve">Kumar cue-anchored windows may contain cue, imagery, feedback or post-task activity. Phase-specific decoding requires original marker-level reconstruction. Amplitude-restricted queries retained positive spatial gains in eligible participants, while training/support artifacts and other query artifacts remain possible. Zero-phase filtering makes the present endpoint offline.</w:t>
+      </w:r>
+    </w:p>
+    <w:p>
+      <w:pPr>
+        <w:pStyle w:val="BodyText"/>
+      </w:pPr>
+      <w:r>
+        <w:t xml:space="preserve">A larger repeated-session validation can separate source-label amount, covariance estimator and alignment from acquisition differences. Neural follow-up can independently control BN exposure count and minibatch size.</w:t>
+      </w:r>
+    </w:p>
+    <w:bookmarkEnd w:id="58"/>
+    <w:bookmarkEnd w:id="59"/>
+    <w:bookmarkStart w:id="60" w:name="conclusions"/>
     <w:p>
       <w:pPr>
         <w:pStyle w:val="Heading2"/>
@@ -2803,11 +2962,11 @@
         <w:pStyle w:val="FirstParagraph"/>
       </w:pPr>
       <w:r>
-        <w:t xml:space="preserve">Matched-label component analysis showed that relearning spatial filters added 5.47 balanced-accuracy points beyond classifier recalibration with the same source and approximately 20 current-session labels. This increment accounted for 73.7% of the 7.42-point total mean gain over freezing. Practitioners evaluating short-run recalibration should therefore compare classifier-only and full spatial updates under identical labels, with EA-CSP as a strong conventional reference. In the neural extension, fixed BN produced fewer single-class predictions under the 20-label, batch-16 schedule; the full budget profiles motivate independent control of normalization exposure. Posterior covariance improved simulated log loss while classification favored simpler geometric references. Independent longitudinal validation should retain the fixed label budget and component contrasts before selecting an update policy.</w:t>
-      </w:r>
-    </w:p>
-    <w:bookmarkEnd w:id="55"/>
-    <w:bookmarkStart w:id="56" w:name="data-and-code-availability"/>
+        <w:t xml:space="preserve">Matched-label analysis identified different useful spatial operations across two datasets. In the original Kumar primary cohort, full refitting added 5.47 BA points beyond classifier-only recalibration and supplied 73.7% of the total mean gain over freezing. In BNCI2014-001, full refitting was close to classifier-only recalibration, while support-only EA added 5.65 points beyond full refitting and improved all nine participants. Short-run recalibration should therefore compare the spatial update itself under identical labels. Fixed source normalization reduced single-class neural predictions at the 20-label cap; complete budget profiles and strong geometric references delimit the additional mechanism results.</w:t>
+      </w:r>
+    </w:p>
+    <w:bookmarkEnd w:id="60"/>
+    <w:bookmarkStart w:id="61" w:name="data-and-code-availability"/>
     <w:p>
       <w:pPr>
         <w:pStyle w:val="Heading2"/>
@@ -2830,7 +2989,7 @@
         <w:t xml:space="preserve">[17]</w:t>
       </w:r>
       <w:r>
-        <w:t xml:space="preserve">. Code, configurations, original results and saved extension predictions are available at https://github.com/jackzhu119/few-shot-mi-eeg, research branch</w:t>
+        <w:t xml:space="preserve">. BNCI2014-001 original MAT files are available through the official BNCI directory, with versioned file hashes in NEMAR nm000139/v1.0.3; their CC BY-ND 4.0 terms are retained. Code, configurations, original results, saved external predictions and saved extension predictions are available at https://github.com/jackzhu119/few-shot-mi-eeg, research branch</w:t>
       </w:r>
       <w:r>
         <w:t xml:space="preserve"> </w:t>
@@ -2845,8 +3004,8 @@
         <w:t xml:space="preserve">. The supplement identifies the fixed V3 packet and reproduction inputs. Original software uses MIT; manuscript, figures and derived results use CC BY 4.0 within the scope defined in LICENSING.md. Source-data and third-party terms are retained.</w:t>
       </w:r>
     </w:p>
-    <w:bookmarkEnd w:id="56"/>
-    <w:bookmarkStart w:id="57" w:name="acknowledgments"/>
+    <w:bookmarkEnd w:id="61"/>
+    <w:bookmarkStart w:id="62" w:name="acknowledgments"/>
     <w:p>
       <w:pPr>
         <w:pStyle w:val="Heading2"/>
@@ -2860,11 +3019,11 @@
         <w:pStyle w:val="FirstParagraph"/>
       </w:pPr>
       <w:r>
-        <w:t xml:space="preserve">The author thanks the researchers who released Kumar2024. OpenAI ChatGPT/Codex assisted with grammar and language revision, GitHub file organization and uploading, manuscript formatting, and verification of saved results. This work included assistance with analysis and plotting code, statistical reconstruction, and manuscript drafting and revision. The author is responsible for the content and interpretation.</w:t>
-      </w:r>
-    </w:p>
-    <w:bookmarkEnd w:id="57"/>
-    <w:bookmarkStart w:id="105" w:name="references"/>
+        <w:t xml:space="preserve">The author thanks the researchers who released Kumar2024 and BCI Competition IV 2a. OpenAI ChatGPT/Codex assisted with grammar and language revision, GitHub file organization and uploading, manuscript formatting, and verification of saved results. This work included assistance with analysis and plotting code, statistical reconstruction, and manuscript drafting and revision. The author is responsible for the content and interpretation.</w:t>
+      </w:r>
+    </w:p>
+    <w:bookmarkEnd w:id="62"/>
+    <w:bookmarkStart w:id="112" w:name="references"/>
     <w:p>
       <w:pPr>
         <w:pStyle w:val="Heading2"/>
@@ -2873,8 +3032,8 @@
         <w:t xml:space="preserve">References</w:t>
       </w:r>
     </w:p>
-    <w:bookmarkStart w:id="104" w:name="refs"/>
-    <w:bookmarkStart w:id="59" w:name="ref-lotte2018"/>
+    <w:bookmarkStart w:id="111" w:name="refs"/>
+    <w:bookmarkStart w:id="64" w:name="ref-lotte2018"/>
     <w:p>
       <w:pPr>
         <w:pStyle w:val="Bibliography"/>
@@ -2900,7 +3059,7 @@
       <w:r>
         <w:t xml:space="preserve">. J Neural Eng 2018;15:031005. doi:</w:t>
       </w:r>
-      <w:hyperlink r:id="rId58">
+      <w:hyperlink r:id="rId63">
         <w:r>
           <w:rPr>
             <w:rStyle w:val="Hyperlink"/>
@@ -2909,8 +3068,8 @@
         </w:r>
       </w:hyperlink>
     </w:p>
-    <w:bookmarkEnd w:id="59"/>
-    <w:bookmarkStart w:id="61" w:name="ref-ramoser2000"/>
+    <w:bookmarkEnd w:id="64"/>
+    <w:bookmarkStart w:id="66" w:name="ref-ramoser2000"/>
     <w:p>
       <w:pPr>
         <w:pStyle w:val="Bibliography"/>
@@ -2936,7 +3095,7 @@
       <w:r>
         <w:t xml:space="preserve">. IEEE Trans Rehabil Eng 2000;8:441–446. doi:</w:t>
       </w:r>
-      <w:hyperlink r:id="rId60">
+      <w:hyperlink r:id="rId65">
         <w:r>
           <w:rPr>
             <w:rStyle w:val="Hyperlink"/>
@@ -2945,8 +3104,8 @@
         </w:r>
       </w:hyperlink>
     </w:p>
-    <w:bookmarkEnd w:id="61"/>
-    <w:bookmarkStart w:id="63" w:name="ref-blankertz2008"/>
+    <w:bookmarkEnd w:id="66"/>
+    <w:bookmarkStart w:id="68" w:name="ref-blankertz2008"/>
     <w:p>
       <w:pPr>
         <w:pStyle w:val="Bibliography"/>
@@ -2972,7 +3131,7 @@
       <w:r>
         <w:t xml:space="preserve">. IEEE Signal Process Mag 2008;25:41–56. doi:</w:t>
       </w:r>
-      <w:hyperlink r:id="rId62">
+      <w:hyperlink r:id="rId67">
         <w:r>
           <w:rPr>
             <w:rStyle w:val="Hyperlink"/>
@@ -2981,8 +3140,8 @@
         </w:r>
       </w:hyperlink>
     </w:p>
-    <w:bookmarkEnd w:id="63"/>
-    <w:bookmarkStart w:id="65" w:name="ref-vidaurre2011lda"/>
+    <w:bookmarkEnd w:id="68"/>
+    <w:bookmarkStart w:id="70" w:name="ref-vidaurre2011lda"/>
     <w:p>
       <w:pPr>
         <w:pStyle w:val="Bibliography"/>
@@ -3008,7 +3167,7 @@
       <w:r>
         <w:t xml:space="preserve">. IEEE Trans Biomed Eng 2011;58:587–597. doi:</w:t>
       </w:r>
-      <w:hyperlink r:id="rId64">
+      <w:hyperlink r:id="rId69">
         <w:r>
           <w:rPr>
             <w:rStyle w:val="Hyperlink"/>
@@ -3017,8 +3176,8 @@
         </w:r>
       </w:hyperlink>
     </w:p>
-    <w:bookmarkEnd w:id="65"/>
-    <w:bookmarkStart w:id="67" w:name="ref-arvaneh2013dsa"/>
+    <w:bookmarkEnd w:id="70"/>
+    <w:bookmarkStart w:id="72" w:name="ref-arvaneh2013dsa"/>
     <w:p>
       <w:pPr>
         <w:pStyle w:val="Bibliography"/>
@@ -3044,7 +3203,7 @@
       <w:r>
         <w:t xml:space="preserve">. Neural Comput 2013;25:2146–2171. doi:</w:t>
       </w:r>
-      <w:hyperlink r:id="rId66">
+      <w:hyperlink r:id="rId71">
         <w:r>
           <w:rPr>
             <w:rStyle w:val="Hyperlink"/>
@@ -3053,8 +3212,8 @@
         </w:r>
       </w:hyperlink>
     </w:p>
-    <w:bookmarkEnd w:id="67"/>
-    <w:bookmarkStart w:id="69" w:name="ref-song2015acsp"/>
+    <w:bookmarkEnd w:id="72"/>
+    <w:bookmarkStart w:id="74" w:name="ref-song2015acsp"/>
     <w:p>
       <w:pPr>
         <w:pStyle w:val="Bibliography"/>
@@ -3080,7 +3239,7 @@
       <w:r>
         <w:t xml:space="preserve">. Comput Biol Med 2015;61:150–160. doi:</w:t>
       </w:r>
-      <w:hyperlink r:id="rId68">
+      <w:hyperlink r:id="rId73">
         <w:r>
           <w:rPr>
             <w:rStyle w:val="Hyperlink"/>
@@ -3089,8 +3248,8 @@
         </w:r>
       </w:hyperlink>
     </w:p>
-    <w:bookmarkEnd w:id="69"/>
-    <w:bookmarkStart w:id="71" w:name="ref-he2020alignment"/>
+    <w:bookmarkEnd w:id="74"/>
+    <w:bookmarkStart w:id="76" w:name="ref-he2020alignment"/>
     <w:p>
       <w:pPr>
         <w:pStyle w:val="Bibliography"/>
@@ -3116,7 +3275,7 @@
       <w:r>
         <w:t xml:space="preserve">. IEEE Trans Biomed Eng 2020;67:399–410. doi:</w:t>
       </w:r>
-      <w:hyperlink r:id="rId70">
+      <w:hyperlink r:id="rId75">
         <w:r>
           <w:rPr>
             <w:rStyle w:val="Hyperlink"/>
@@ -3125,8 +3284,8 @@
         </w:r>
       </w:hyperlink>
     </w:p>
-    <w:bookmarkEnd w:id="71"/>
-    <w:bookmarkStart w:id="73" w:name="ref-zanini2018alignment"/>
+    <w:bookmarkEnd w:id="76"/>
+    <w:bookmarkStart w:id="78" w:name="ref-zanini2018alignment"/>
     <w:p>
       <w:pPr>
         <w:pStyle w:val="Bibliography"/>
@@ -3152,7 +3311,7 @@
       <w:r>
         <w:t xml:space="preserve">. IEEE Trans Biomed Eng 2018;65:1107–1116. doi:</w:t>
       </w:r>
-      <w:hyperlink r:id="rId72">
+      <w:hyperlink r:id="rId77">
         <w:r>
           <w:rPr>
             <w:rStyle w:val="Hyperlink"/>
@@ -3161,8 +3320,8 @@
         </w:r>
       </w:hyperlink>
     </w:p>
-    <w:bookmarkEnd w:id="73"/>
-    <w:bookmarkStart w:id="75" w:name="ref-kumar2024"/>
+    <w:bookmarkEnd w:id="78"/>
+    <w:bookmarkStart w:id="80" w:name="ref-kumar2024"/>
     <w:p>
       <w:pPr>
         <w:pStyle w:val="Bibliography"/>
@@ -3188,7 +3347,7 @@
       <w:r>
         <w:t xml:space="preserve">. PNAS Nexus 2024;3:pgae076. doi:</w:t>
       </w:r>
-      <w:hyperlink r:id="rId74">
+      <w:hyperlink r:id="rId79">
         <w:r>
           <w:rPr>
             <w:rStyle w:val="Hyperlink"/>
@@ -3197,8 +3356,8 @@
         </w:r>
       </w:hyperlink>
     </w:p>
-    <w:bookmarkEnd w:id="75"/>
-    <w:bookmarkStart w:id="77" w:name="ref-kumar2024correction"/>
+    <w:bookmarkEnd w:id="80"/>
+    <w:bookmarkStart w:id="82" w:name="ref-kumar2024correction"/>
     <w:p>
       <w:pPr>
         <w:pStyle w:val="Bibliography"/>
@@ -3218,7 +3377,7 @@
       <w:r>
         <w:t xml:space="preserve">. PNAS Nexus 2024;3:pgae137. doi:</w:t>
       </w:r>
-      <w:hyperlink r:id="rId76">
+      <w:hyperlink r:id="rId81">
         <w:r>
           <w:rPr>
             <w:rStyle w:val="Hyperlink"/>
@@ -3227,8 +3386,8 @@
         </w:r>
       </w:hyperlink>
     </w:p>
-    <w:bookmarkEnd w:id="77"/>
-    <w:bookmarkStart w:id="79" w:name="ref-kozyrskiy2026updates"/>
+    <w:bookmarkEnd w:id="82"/>
+    <w:bookmarkStart w:id="84" w:name="ref-kozyrskiy2026updates"/>
     <w:p>
       <w:pPr>
         <w:pStyle w:val="Bibliography"/>
@@ -3257,7 +3416,7 @@
       <w:r>
         <w:t xml:space="preserve"> </w:t>
       </w:r>
-      <w:hyperlink r:id="rId78">
+      <w:hyperlink r:id="rId83">
         <w:r>
           <w:rPr>
             <w:rStyle w:val="Hyperlink"/>
@@ -3266,8 +3425,8 @@
         </w:r>
       </w:hyperlink>
     </w:p>
-    <w:bookmarkEnd w:id="79"/>
-    <w:bookmarkStart w:id="81" w:name="ref-adabn2016"/>
+    <w:bookmarkEnd w:id="84"/>
+    <w:bookmarkStart w:id="86" w:name="ref-adabn2016"/>
     <w:p>
       <w:pPr>
         <w:pStyle w:val="Bibliography"/>
@@ -3296,7 +3455,7 @@
       <w:r>
         <w:t xml:space="preserve"> </w:t>
       </w:r>
-      <w:hyperlink r:id="rId80">
+      <w:hyperlink r:id="rId85">
         <w:r>
           <w:rPr>
             <w:rStyle w:val="Hyperlink"/>
@@ -3305,8 +3464,8 @@
         </w:r>
       </w:hyperlink>
     </w:p>
-    <w:bookmarkEnd w:id="81"/>
-    <w:bookmarkStart w:id="83" w:name="ref-wimpff2025continual"/>
+    <w:bookmarkEnd w:id="86"/>
+    <w:bookmarkStart w:id="88" w:name="ref-wimpff2025continual"/>
     <w:p>
       <w:pPr>
         <w:pStyle w:val="Bibliography"/>
@@ -3344,7 +3503,7 @@
       <w:r>
         <w:t xml:space="preserve">IEEE; 2025. pp. 1–7. doi:</w:t>
       </w:r>
-      <w:hyperlink r:id="rId82">
+      <w:hyperlink r:id="rId87">
         <w:r>
           <w:rPr>
             <w:rStyle w:val="Hyperlink"/>
@@ -3353,8 +3512,8 @@
         </w:r>
       </w:hyperlink>
     </w:p>
-    <w:bookmarkEnd w:id="83"/>
-    <w:bookmarkStart w:id="85" w:name="ref-l2sp2018"/>
+    <w:bookmarkEnd w:id="88"/>
+    <w:bookmarkStart w:id="90" w:name="ref-l2sp2018"/>
     <w:p>
       <w:pPr>
         <w:pStyle w:val="Bibliography"/>
@@ -3383,7 +3542,7 @@
       <w:r>
         <w:t xml:space="preserve"> </w:t>
       </w:r>
-      <w:hyperlink r:id="rId84">
+      <w:hyperlink r:id="rId89">
         <w:r>
           <w:rPr>
             <w:rStyle w:val="Hyperlink"/>
@@ -3392,8 +3551,8 @@
         </w:r>
       </w:hyperlink>
     </w:p>
-    <w:bookmarkEnd w:id="85"/>
-    <w:bookmarkStart w:id="87" w:name="ref-lwf2016"/>
+    <w:bookmarkEnd w:id="90"/>
+    <w:bookmarkStart w:id="92" w:name="ref-lwf2016"/>
     <w:p>
       <w:pPr>
         <w:pStyle w:val="Bibliography"/>
@@ -3422,7 +3581,7 @@
       <w:r>
         <w:t xml:space="preserve"> </w:t>
       </w:r>
-      <w:hyperlink r:id="rId86">
+      <w:hyperlink r:id="rId91">
         <w:r>
           <w:rPr>
             <w:rStyle w:val="Hyperlink"/>
@@ -3431,8 +3590,8 @@
         </w:r>
       </w:hyperlink>
     </w:p>
-    <w:bookmarkEnd w:id="87"/>
-    <w:bookmarkStart w:id="89" w:name="ref-trpo2015"/>
+    <w:bookmarkEnd w:id="92"/>
+    <w:bookmarkStart w:id="94" w:name="ref-trpo2015"/>
     <w:p>
       <w:pPr>
         <w:pStyle w:val="Bibliography"/>
@@ -3461,7 +3620,7 @@
       <w:r>
         <w:t xml:space="preserve"> </w:t>
       </w:r>
-      <w:hyperlink r:id="rId88">
+      <w:hyperlink r:id="rId93">
         <w:r>
           <w:rPr>
             <w:rStyle w:val="Hyperlink"/>
@@ -3470,8 +3629,8 @@
         </w:r>
       </w:hyperlink>
     </w:p>
-    <w:bookmarkEnd w:id="89"/>
-    <w:bookmarkStart w:id="91" w:name="ref-nemar177"/>
+    <w:bookmarkEnd w:id="94"/>
+    <w:bookmarkStart w:id="96" w:name="ref-nemar177"/>
     <w:p>
       <w:pPr>
         <w:pStyle w:val="Bibliography"/>
@@ -3497,7 +3656,7 @@
       <w:r>
         <w:t xml:space="preserve">. NEMAR (Neuroelectromagnetic Data Archive; Tools Resource); 2026. doi:</w:t>
       </w:r>
-      <w:hyperlink r:id="rId90">
+      <w:hyperlink r:id="rId95">
         <w:r>
           <w:rPr>
             <w:rStyle w:val="Hyperlink"/>
@@ -3506,8 +3665,8 @@
         </w:r>
       </w:hyperlink>
     </w:p>
-    <w:bookmarkEnd w:id="91"/>
-    <w:bookmarkStart w:id="93" w:name="ref-china2023ethics"/>
+    <w:bookmarkEnd w:id="96"/>
+    <w:bookmarkStart w:id="98" w:name="ref-tangermann2012competition"/>
     <w:p>
       <w:pPr>
         <w:pStyle w:val="Bibliography"/>
@@ -3522,6 +3681,54 @@
         <w:t xml:space="preserve">	</w:t>
       </w:r>
       <w:r>
+        <w:t xml:space="preserve">Tangermann M, Müller K-R, Aertsen A, Birbaumer N, Braun C, Brunner C, et al. Review of the</w:t>
+      </w:r>
+      <w:r>
+        <w:t xml:space="preserve"> </w:t>
+      </w:r>
+      <w:r>
+        <w:t xml:space="preserve">BCI</w:t>
+      </w:r>
+      <w:r>
+        <w:t xml:space="preserve"> </w:t>
+      </w:r>
+      <w:r>
+        <w:t xml:space="preserve">competition</w:t>
+      </w:r>
+      <w:r>
+        <w:t xml:space="preserve"> </w:t>
+      </w:r>
+      <w:r>
+        <w:t xml:space="preserve">IV</w:t>
+      </w:r>
+      <w:r>
+        <w:t xml:space="preserve">. Frontiers in Neuroscience 2012;6:55. doi:</w:t>
+      </w:r>
+      <w:hyperlink r:id="rId97">
+        <w:r>
+          <w:rPr>
+            <w:rStyle w:val="Hyperlink"/>
+          </w:rPr>
+          <w:t xml:space="preserve">10.3389/fnins.2012.00055</w:t>
+        </w:r>
+      </w:hyperlink>
+    </w:p>
+    <w:bookmarkEnd w:id="98"/>
+    <w:bookmarkStart w:id="100" w:name="ref-china2023ethics"/>
+    <w:p>
+      <w:pPr>
+        <w:pStyle w:val="Bibliography"/>
+      </w:pPr>
+      <w:r>
+        <w:t xml:space="preserve">19.</w:t>
+      </w:r>
+      <w:r>
+        <w:t xml:space="preserve"> </w:t>
+      </w:r>
+      <w:r>
+        <w:t xml:space="preserve">	</w:t>
+      </w:r>
+      <w:r>
         <w:t xml:space="preserve">National Health Commission of the People’s Republic of China, Ministry of Education of the People’s Republic of China, Ministry of Science and Technology of the People’s Republic of China, National Administration of Traditional Chinese Medicine.</w:t>
       </w:r>
       <w:r>
@@ -3536,7 +3743,7 @@
       <w:r>
         <w:t xml:space="preserve"> </w:t>
       </w:r>
-      <w:hyperlink r:id="rId92">
+      <w:hyperlink r:id="rId99">
         <w:r>
           <w:rPr>
             <w:rStyle w:val="Hyperlink"/>
@@ -3545,14 +3752,14 @@
         </w:r>
       </w:hyperlink>
     </w:p>
-    <w:bookmarkEnd w:id="93"/>
-    <w:bookmarkStart w:id="95" w:name="ref-kumarcodebook"/>
+    <w:bookmarkEnd w:id="100"/>
+    <w:bookmarkStart w:id="102" w:name="ref-kumarcodebook"/>
     <w:p>
       <w:pPr>
         <w:pStyle w:val="Bibliography"/>
       </w:pPr>
       <w:r>
-        <w:t xml:space="preserve">19.</w:t>
+        <w:t xml:space="preserve">20.</w:t>
       </w:r>
       <w:r>
         <w:t xml:space="preserve"> </w:t>
@@ -3581,7 +3788,7 @@
       <w:r>
         <w:t xml:space="preserve"> </w:t>
       </w:r>
-      <w:hyperlink r:id="rId94">
+      <w:hyperlink r:id="rId101">
         <w:r>
           <w:rPr>
             <w:rStyle w:val="Hyperlink"/>
@@ -3590,14 +3797,14 @@
         </w:r>
       </w:hyperlink>
     </w:p>
-    <w:bookmarkEnd w:id="95"/>
-    <w:bookmarkStart w:id="97" w:name="ref-jayaram2018"/>
+    <w:bookmarkEnd w:id="102"/>
+    <w:bookmarkStart w:id="104" w:name="ref-jayaram2018"/>
     <w:p>
       <w:pPr>
         <w:pStyle w:val="Bibliography"/>
       </w:pPr>
       <w:r>
-        <w:t xml:space="preserve">20.</w:t>
+        <w:t xml:space="preserve">21.</w:t>
       </w:r>
       <w:r>
         <w:t xml:space="preserve"> </w:t>
@@ -3617,7 +3824,7 @@
       <w:r>
         <w:t xml:space="preserve">. J Neural Eng 2018;15:066011. doi:</w:t>
       </w:r>
-      <w:hyperlink r:id="rId96">
+      <w:hyperlink r:id="rId103">
         <w:r>
           <w:rPr>
             <w:rStyle w:val="Hyperlink"/>
@@ -3626,14 +3833,14 @@
         </w:r>
       </w:hyperlink>
     </w:p>
-    <w:bookmarkEnd w:id="97"/>
-    <w:bookmarkStart w:id="99" w:name="ref-ledoit2004"/>
+    <w:bookmarkEnd w:id="104"/>
+    <w:bookmarkStart w:id="106" w:name="ref-ledoit2004"/>
     <w:p>
       <w:pPr>
         <w:pStyle w:val="Bibliography"/>
       </w:pPr>
       <w:r>
-        <w:t xml:space="preserve">21.</w:t>
+        <w:t xml:space="preserve">22.</w:t>
       </w:r>
       <w:r>
         <w:t xml:space="preserve"> </w:t>
@@ -3653,7 +3860,7 @@
       <w:r>
         <w:t xml:space="preserve">. J Multivar Anal 2004;88:365–411. doi:</w:t>
       </w:r>
-      <w:hyperlink r:id="rId98">
+      <w:hyperlink r:id="rId105">
         <w:r>
           <w:rPr>
             <w:rStyle w:val="Hyperlink"/>
@@ -3662,14 +3869,14 @@
         </w:r>
       </w:hyperlink>
     </w:p>
-    <w:bookmarkEnd w:id="99"/>
-    <w:bookmarkStart w:id="101" w:name="ref-lawhern2018"/>
+    <w:bookmarkEnd w:id="106"/>
+    <w:bookmarkStart w:id="108" w:name="ref-lawhern2018"/>
     <w:p>
       <w:pPr>
         <w:pStyle w:val="Bibliography"/>
       </w:pPr>
       <w:r>
-        <w:t xml:space="preserve">22.</w:t>
+        <w:t xml:space="preserve">23.</w:t>
       </w:r>
       <w:r>
         <w:t xml:space="preserve"> </w:t>
@@ -3689,7 +3896,7 @@
       <w:r>
         <w:t xml:space="preserve">. J Neural Eng 2018;15:056013. doi:</w:t>
       </w:r>
-      <w:hyperlink r:id="rId100">
+      <w:hyperlink r:id="rId107">
         <w:r>
           <w:rPr>
             <w:rStyle w:val="Hyperlink"/>
@@ -3698,14 +3905,14 @@
         </w:r>
       </w:hyperlink>
     </w:p>
-    <w:bookmarkEnd w:id="101"/>
-    <w:bookmarkStart w:id="103" w:name="ref-schirrmeister2017"/>
+    <w:bookmarkEnd w:id="108"/>
+    <w:bookmarkStart w:id="110" w:name="ref-schirrmeister2017"/>
     <w:p>
       <w:pPr>
         <w:pStyle w:val="Bibliography"/>
       </w:pPr>
       <w:r>
-        <w:t xml:space="preserve">23.</w:t>
+        <w:t xml:space="preserve">24.</w:t>
       </w:r>
       <w:r>
         <w:t xml:space="preserve"> </w:t>
@@ -3725,7 +3932,7 @@
       <w:r>
         <w:t xml:space="preserve">. Hum Brain Mapp 2017;38:5391–5420. doi:</w:t>
       </w:r>
-      <w:hyperlink r:id="rId102">
+      <w:hyperlink r:id="rId109">
         <w:r>
           <w:rPr>
             <w:rStyle w:val="Hyperlink"/>
@@ -3734,10 +3941,10 @@
         </w:r>
       </w:hyperlink>
     </w:p>
-    <w:bookmarkEnd w:id="103"/>
-    <w:bookmarkEnd w:id="104"/>
-    <w:bookmarkEnd w:id="105"/>
-    <w:bookmarkStart w:id="106" w:name="supporting-information-captions"/>
+    <w:bookmarkEnd w:id="110"/>
+    <w:bookmarkEnd w:id="111"/>
+    <w:bookmarkEnd w:id="112"/>
+    <w:bookmarkStart w:id="113" w:name="supporting-information-captions"/>
     <w:p>
       <w:pPr>
         <w:pStyle w:val="Heading2"/>
@@ -3764,8 +3971,8 @@
         <w:t xml:space="preserve">Complete component definitions, mathematical assumptions, all methods/budgets/seeds, participant and scenario tables, original sensitivity analyses, prediction identities, provenance and saved-output reproduction instructions.</w:t>
       </w:r>
     </w:p>
-    <w:bookmarkEnd w:id="106"/>
-    <w:bookmarkEnd w:id="107"/>
+    <w:bookmarkEnd w:id="113"/>
+    <w:bookmarkEnd w:id="114"/>
     <w:sectPr>
       <w:footerReference w:type="default" r:id="rId9"/>
       <w:pgSz w:w="11906" w:h="16838"/>

</xml_diff>

<commit_message>
Tighten contribution-led prose and remove repetitive editorial caveats
</commit_message>
<xml_diff>
--- a/manuscript/discovery_revision_20261027/BMT_Manuscript_Review.docx
+++ b/manuscript/discovery_revision_20261027/BMT_Manuscript_Review.docx
@@ -148,7 +148,7 @@
         <w:t xml:space="preserve"> </w:t>
       </w:r>
       <w:r>
-        <w:t xml:space="preserve">In Kumar2024, full refitting achieved 65.36% balanced accuracy, 7.42 percentage points above freezing (95% participant-bootstrap interval 2.49–12.48). The secondary full-minus-classifier-only gain was 5.47 points (2.17–8.91), accounting for 73.7% of the mean total gain. In BNCI, full-minus-classifier-only was 0.19 points (−1.85 to 2.13). EA-CSP achieved 77.50%, improving on full refitting by 5.65 points (3.15–8.70; Holm-adjusted p=0.01172), with gains in all nine participants. Fixed source normalization also reduced single-class neural predictions at the 20-label cap.</w:t>
+        <w:t xml:space="preserve">In Kumar2024, full refitting achieved 65.36% balanced accuracy, 7.42 percentage points above freezing (95% participant-bootstrap interval 2.49–12.48). The secondary full-minus-classifier-only gain was 5.47 points (2.17–8.91), accounting for 73.7% of the mean total gain. In BNCI, EA-CSP achieved 77.50%, improving on full refitting by 5.65 points in the secondary comparison (3.15–8.70; Holm-adjusted p=0.01172), with gains in all nine participants. Full-minus-classifier-only was 0.19 points (−1.85 to 2.13). Fixed source normalization also reduced single-class neural predictions at the 20-label cap.</w:t>
       </w:r>
     </w:p>
     <w:p>
@@ -166,7 +166,7 @@
         <w:t xml:space="preserve"> </w:t>
       </w:r>
       <w:r>
-        <w:t xml:space="preserve">Matched-label comparisons distinguish the contributions of spatial refitting and support-only alignment. Their different effects across datasets make the update operation central to limited-label recalibration.</w:t>
+        <w:t xml:space="preserve">Matched-label comparisons quantify distinct gains from spatial refitting and support-only alignment, providing a direct way to compare decoder updates with limited calibration labels.</w:t>
       </w:r>
     </w:p>
     <w:p>
@@ -202,7 +202,7 @@
         <w:pStyle w:val="FirstParagraph"/>
       </w:pPr>
       <w:r>
-        <w:t xml:space="preserve">A decoder trained in the first Kumar2024 session must serve five later sessions. At the start of each later session, a short calibration run supplies only 19 or 20 complete labeled trials. Should these labels recalibrate the classifier, relearn its spatial filters, or update both? This practical choice links longitudinal motor-imagery brain–computer interfaces (BCIs) to the limited-sample estimation problem: each updated component must be learned from the available new observations</w:t>
+        <w:t xml:space="preserve">Recalibrating a motor-imagery brain–computer interface (BCI) from a short labeled run requires deciding which decoder components to update</w:t>
       </w:r>
       <w:r>
         <w:t xml:space="preserve"> </w:t>
@@ -211,7 +211,7 @@
         <w:t xml:space="preserve">[1]</w:t>
       </w:r>
       <w:r>
-        <w:t xml:space="preserve">.</w:t>
+        <w:t xml:space="preserve">. In Kumar2024, a decoder trained in the first session serves five later sessions, each with 19 or 20 complete calibration trials. We compare classifier-only recalibration with refitting both the spatial filters and classifier using the same labels, alongside frozen and aligned decoders.</w:t>
       </w:r>
     </w:p>
     <w:p>
@@ -228,7 +228,7 @@
         <w:t xml:space="preserve">[2, 3]</w:t>
       </w:r>
       <w:r>
-        <w:t xml:space="preserve">. CSP extracts class-discriminative spatial power features; LDA maps them to decisions. Re-estimating LDA changes classification in the source feature space. Refitting both stages also changes that space. Giving the two updates identical labels isolates the added spatial update within the evaluated pipeline. The distinction matters for the broader instruction to adapt a representation: supervised spatial-filter refitting and repeated neural normalization are different operations with different estimation demands.</w:t>
+        <w:t xml:space="preserve">. CSP extracts class-discriminative spatial power features; LDA maps them to decisions. Re-estimating LDA changes classification in the source feature space. Refitting both stages also changes that space. Using identical labels makes their difference a measure of the added spatial update.</w:t>
       </w:r>
     </w:p>
     <w:p>
@@ -254,7 +254,7 @@
         <w:t xml:space="preserve">[9, 10]</w:t>
       </w:r>
       <w:r>
-        <w:t xml:space="preserve">. These precedents motivate a quantitative question: how much does relearning spatial filters add when classifier recalibration already receives the same new labels?</w:t>
+        <w:t xml:space="preserve">. We quantify the additional gain from relearning spatial filters after classifier recalibration has received those same labels.</w:t>
       </w:r>
     </w:p>
     <w:p>
@@ -271,7 +271,7 @@
         <w:t xml:space="preserve">[11]</w:t>
       </w:r>
       <w:r>
-        <w:t xml:space="preserve">. Their prequential procedure predicts a trial, reveals its label, then refits CSP or Riemannian pipelines using expanding, rolling or cold-start histories. Here, each later session is recalibrated from the source-training set and a fixed current-session support run, and full CSP/LDA refitting is compared directly with LDA-only recalibration using identical trial identities. The online benchmark evaluates how revealed label histories support continuing updates; our fixed-budget comparison measures the additional spatial component.</w:t>
+        <w:t xml:space="preserve">. Their prequential procedure predicts a trial, reveals its label, then refits CSP or Riemannian pipelines using expanding, rolling or cold-start histories. Here, each later session is recalibrated from the source-training set and a fixed current-session support run, and full CSP/LDA refitting is compared directly with LDA-only recalibration using identical trial identities. Our comparison measures the additional spatial component at a fixed current-session label budget.</w:t>
       </w:r>
     </w:p>
     <w:p>
@@ -313,24 +313,18 @@
       <w:pPr>
         <w:pStyle w:val="BodyText"/>
       </w:pPr>
-      <w:r>
-        <w:t xml:space="preserve">We use</w:t>
-      </w:r>
-      <w:r>
-        <w:t xml:space="preserve"> </w:t>
-      </w:r>
       <w:r>
         <w:rPr>
           <w:b/>
           <w:bCs/>
         </w:rPr>
-        <w:t xml:space="preserve">matched-label component analysis</w:t>
-      </w:r>
-      <w:r>
-        <w:t xml:space="preserve"> </w:t>
-      </w:r>
-      <w:r>
-        <w:t xml:space="preserve">to connect three contributions:</w:t>
+        <w:t xml:space="preserve">Matched-label component analysis</w:t>
+      </w:r>
+      <w:r>
+        <w:t xml:space="preserve"> </w:t>
+      </w:r>
+      <w:r>
+        <w:t xml:space="preserve">provides three contributions:</w:t>
       </w:r>
     </w:p>
     <w:p>
@@ -374,7 +368,7 @@
         <w:t xml:space="preserve"> </w:t>
       </w:r>
       <w:r>
-        <w:t xml:space="preserve">Corrected and newly introduced errors reconstruct the component gain, while class recalls, target-session profiles and participant-deletion summaries locate that gain across the longitudinal data. The original full-minus-frozen comparison remains primary and full-minus-LDA-only secondary.</w:t>
+        <w:t xml:space="preserve">Corrected and newly introduced errors reconstruct the component gain, while class recalls, target-session profiles and participant-deletion summaries locate that gain across the longitudinal data.</w:t>
       </w:r>
     </w:p>
     <w:p>
@@ -680,7 +674,7 @@
         <w:pStyle w:val="BodyText"/>
       </w:pPr>
       <w:r>
-        <w:t xml:space="preserve">The existing V2 implementation used four CSP components and fixed covariance/LDA shrinkage of 0.1. This differs from the original Kumar MNE/Ledoit–Wolf implementation and its 40-label source budget. The external protocol fixed methods, inputs and endpoints before its predictions were generated; it performed no parameter search. BNCI had previously been used in the first-paper project; this is an independent-data replication of the component question. Supplementary Section S12 gives all partitions and the fixed execution version.</w:t>
+        <w:t xml:space="preserve">The existing V2 implementation used four CSP components and fixed covariance/LDA shrinkage of 0.1. This differs from the original Kumar MNE/Ledoit–Wolf implementation and its 40-label source budget. Methods, inputs and endpoints were fixed before external prediction generation. Supplementary Section S12 gives all partitions and the fixed execution version.</w:t>
       </w:r>
     </w:p>
     <w:bookmarkEnd w:id="26"/>
@@ -1418,7 +1412,7 @@
         <w:pStyle w:val="BodyText"/>
       </w:pPr>
       <w:r>
-        <w:t xml:space="preserve">BA, balanced accuracy; pp, percentage points. The two updating methods used the same source-training/current-support union. Values average five sessions within participants. Full refitting versus freezing in the 12-participant cohort was the predefined primary comparison; full versus LDA-only was secondary. The six-person development row remains separate from the primary cohort and includes its negative component mean.</w:t>
+        <w:t xml:space="preserve">BA, balanced accuracy; pp, percentage points. The two updating methods used the same source-training/current-support union. Values average five sessions within participants. Full refitting versus freezing in the 12-participant cohort was the predefined primary comparison; full versus LDA-only was secondary. Development and primary-cohort estimates are reported separately.</w:t>
       </w:r>
     </w:p>
     <w:p>
@@ -1493,13 +1487,13 @@
           <w:b/>
           <w:bCs/>
         </w:rPr>
-        <w:t xml:space="preserve">Figure 1. Spatial-component evidence and strong-reference context.</w:t>
-      </w:r>
-      <w:r>
-        <w:t xml:space="preserve"> </w:t>
-      </w:r>
-      <w:r>
-        <w:t xml:space="preserve">Original primary-cohort component and total contrasts are displayed separately from the six-participant V2 budget profiles. Participant values, cohort means and participant-bootstrap intervals retain their original denominators and endpoint hierarchy. The original full-minus-LDA-only result compares matched labels; the V2 profiles compare separately versioned methods within the discovery cohort.</w:t>
+        <w:t xml:space="preserve">Figure 1. Spatial-component effects and calibration budgets.</w:t>
+      </w:r>
+      <w:r>
+        <w:t xml:space="preserve"> </w:t>
+      </w:r>
+      <w:r>
+        <w:t xml:space="preserve">Panels show paired component and total effects in the original primary cohort, followed by V2 budget profiles in the six development participants. Points, cohort means and participant-bootstrap intervals show the distribution of effects. Full-minus-LDA-only compares updates using identical labels.</w:t>
       </w:r>
     </w:p>
     <w:bookmarkEnd w:id="34"/>
@@ -1517,7 +1511,7 @@
         <w:pStyle w:val="FirstParagraph"/>
       </w:pPr>
       <w:r>
-        <w:t xml:space="preserve">In the six-participant V2 extension at the 20-label cap, frozen classical decoding achieved 62.15% BA, LDA-only 67.30%, full CSP/LDA 68.65% and EA-CSP 70.37%. The covariance-mixture candidate achieved 69.24%. Its gain over frozen decoding was +7.09 points (4.12–11.55), but its prespecified comparison with EA-CSP was −1.14 points (−3.52–1.14). EA-CSP therefore provided the stronger conventional reference for the next experiment.</w:t>
+        <w:t xml:space="preserve">In the six-participant V2 extension at the 20-label cap, frozen classical decoding achieved 62.15% BA, LDA-only 67.30%, full CSP/LDA 68.65% and EA-CSP 70.37%. The covariance-mixture candidate achieved 69.24%. The candidate improved on frozen decoding by +7.09 points (4.12–11.55). Its prespecified comparison with EA-CSP was −1.14 points (−3.52–1.14). EA-CSP therefore provided the stronger conventional reference for the next experiment.</w:t>
       </w:r>
     </w:p>
     <w:p>
@@ -1543,7 +1537,7 @@
         <w:pStyle w:val="FirstParagraph"/>
       </w:pPr>
       <w:r>
-        <w:t xml:space="preserve">At the cap of 20 labels, the geometric candidate achieved 64.68% BA, versus 67.01% for ordinary tangent refitting and 70.37% for saved EA-CSP. Its prespecified primary contrast was −2.33 points (−4.41 to −0.24), and its strong-reference contrast was −5.69 points (−9.30 to −2.22; Table 2). Five of six participant differences were negative in both comparisons. All five support-cap mean contrasts versus tangent refitting were negative (Figure 2).</w:t>
+        <w:t xml:space="preserve">At the cap of 20 labels, EA-CSP achieved 70.37% BA and ordinary tangent refitting 67.01%, compared with 64.68% for the geometric candidate. Its prespecified primary contrast was −2.33 points (−4.41 to −0.24), and its strong-reference contrast was −5.69 points (−9.30 to −2.22; Table 2). Both reference methods had higher BA in five of six participants. Ordinary tangent refitting had higher cohort-mean BA at all five support caps (Figure 2).</w:t>
       </w:r>
     </w:p>
     <w:p>
@@ -2555,15 +2549,15 @@
         <w:pStyle w:val="FirstParagraph"/>
       </w:pPr>
       <w:r>
-        <w:t xml:space="preserve">Frozen individual-source models achieved 56.74% target BA, compared with 55.26% for pooled-source models, a pooled-minus-individual difference of −1.48 points (−2.90 to −0.20). Source-query BA was 56.11% and 57.78%, respectively. Weak source discrimination was already present before target-session transfer. The pooled-source target mean was lower in this architecture and training regime.</w:t>
-      </w:r>
-    </w:p>
-    <w:p>
-      <w:pPr>
-        <w:pStyle w:val="BodyText"/>
-      </w:pPr>
-      <w:r>
-        <w:t xml:space="preserve">The three pooled models selected epochs 14, 20 and 17 by validation loss. Their final training losses were approximately 0.20–0.22, while final validation losses were 0.91–0.96, above the selected validation losses near 0.68. These histories show training-loss reduction alongside weak held-out generalization within the source domain.</w:t>
+        <w:t xml:space="preserve">Frozen individual-source models achieved 56.74% target BA, compared with 55.26% for pooled-source models, a pooled-minus-individual difference of −1.48 points (−2.90 to −0.20). Source-query BA was 56.11% and 57.78%, respectively. Source-query measurements provide the within-domain reference for interpreting target performance.</w:t>
+      </w:r>
+    </w:p>
+    <w:p>
+      <w:pPr>
+        <w:pStyle w:val="BodyText"/>
+      </w:pPr>
+      <w:r>
+        <w:t xml:space="preserve">The three pooled models selected epochs 14, 20 and 17 by validation loss. Their final training losses were approximately 0.20–0.22, while final validation losses were 0.91–0.96, above the selected validation losses near 0.68. Training and validation loss diverged after the validation-selected epochs.</w:t>
       </w:r>
     </w:p>
     <w:p>
@@ -2672,15 +2666,15 @@
         <w:pStyle w:val="FirstParagraph"/>
       </w:pPr>
       <w:r>
+        <w:t xml:space="preserve">In the secondary comparison, EA-CSP improved on full refitting by 5.65 points (3.15–8.70; exact p=0.00391; Holm p=0.01172). All nine participant differences were positive, ranging from +0.83 to +15.83 points. The leave-one-participant-out mean ranged from +4.38 to +6.25 points. All five query-run cohort means favored EA over full refitting. These methods used the same 20 target labels and 120 query trials per participant; target alignment statistics came only from those support trials. Supplementary Section S12 reports every participant and contrast.</w:t>
+      </w:r>
+    </w:p>
+    <w:p>
+      <w:pPr>
+        <w:pStyle w:val="BodyText"/>
+      </w:pPr>
+      <w:r>
         <w:t xml:space="preserve">In BNCI2014-001, mean BA was 70.56% for frozen CSP/LDA, 71.67% for LDA-only, 71.85% for full refitting and 77.50% for EA-CSP (Figure 5). The fixed primary full-minus-LDA-only contrast was +0.19 points (95% interval −1.85 to 2.13; exact p=0.96875): three participants improved, three decreased and three were unchanged. Full-minus-frozen was +1.30 points (−1.76 to 3.98; Holm p=0.68750), while LDA-only-minus-frozen was +1.11 points (−0.46 to 2.96; Holm p=0.68750).</w:t>
-      </w:r>
-    </w:p>
-    <w:p>
-      <w:pPr>
-        <w:pStyle w:val="BodyText"/>
-      </w:pPr>
-      <w:r>
-        <w:t xml:space="preserve">EA-CSP improved on full refitting by 5.65 points (3.15–8.70; exact p=0.00391; Holm p=0.01172). All nine participant differences were positive, ranging from +0.83 to +15.83 points. The leave-one-participant-out mean ranged from +4.38 to +6.25 points. All five query-run cohort means favored EA over full refitting. These methods used the same 20 target labels and 120 query trials per participant; target alignment statistics came only from those support trials. Supplementary Section S12 reports every participant and contrast.</w:t>
       </w:r>
     </w:p>
     <w:p>
@@ -2773,31 +2767,31 @@
         <w:pStyle w:val="FirstParagraph"/>
       </w:pPr>
       <w:r>
-        <w:t xml:space="preserve">The matched-label comparison identifies a substantial spatial-component gain. Full CSP/LDA refitting added 5.47 BA points beyond classifier-only recalibration in the original primary cohort and supplied 73.7% of the mean total improvement over freezing. Holding the fitting examples constant gives this result a clearer interpretation than an updated-versus-frozen comparison alone: the available labels supported a useful change in the spatial representation as well as in the class decision rule.</w:t>
-      </w:r>
-    </w:p>
-    <w:p>
-      <w:pPr>
-        <w:pStyle w:val="BodyText"/>
-      </w:pPr>
-      <w:r>
-        <w:t xml:space="preserve">The external experiment separates spatial refitting from alignment. With the same 20 current labels, ordinary full refitting was close to classifier-only recalibration, whereas support-only EA improved on full refitting in all nine participants. This places the original 5.47-point gain in context: its magnitude did not recur under the external data and implementation. An operation-level comparison, rather than a blanket instruction to update spatial filters, captures both findings. Acquisition, source budget, referencing and covariance estimators differed between datasets, so their individual contributions to this difference remain unresolved.</w:t>
-      </w:r>
-    </w:p>
-    <w:p>
-      <w:pPr>
-        <w:pStyle w:val="BodyText"/>
-      </w:pPr>
-      <w:r>
-        <w:t xml:space="preserve">The neural extension adds a complementary observation. At the final support cap, fixed-source BN during full weight adaptation outperformed adaptive BN in both initialization regimes, with fewer collapsed seed/session predictions. This contrasts with the successful CSP spatial update. The component analysis distinguishes a supervised spatial estimator from repeated normalization updates, making the observed gain attributable to a specific pipeline operation.</w:t>
-      </w:r>
-    </w:p>
-    <w:p>
-      <w:pPr>
-        <w:pStyle w:val="BodyText"/>
-      </w:pPr>
-      <w:r>
-        <w:t xml:space="preserve">The principal conventional result also has a direct trial-level explanation. The added spatial update corrected more class-balanced errors than it introduced, and its mean benefit involved both labels. Positive session means and participant-deletion summaries show that its cohort average was not supplied by a single participant or only one point in the session sequence. The participant and development-cohort results document variation around this positive primary-cohort mean.</w:t>
+        <w:t xml:space="preserve">Matching source and current-session labels locates recalibration gains in specific decoder components. Full CSP/LDA refitting added 5.47 BA points beyond classifier-only recalibration in the original primary cohort and supplied 73.7% of the mean improvement over freezing. The comparison measures the value of relearning the spatial representation after the classifier has received the same calibration labels.</w:t>
+      </w:r>
+    </w:p>
+    <w:p>
+      <w:pPr>
+        <w:pStyle w:val="BodyText"/>
+      </w:pPr>
+      <w:r>
+        <w:t xml:space="preserve">The external experiment identifies support-only alignment as a useful additional operation. With the same 20 current labels, EA improved on full refitting in all nine participants, while full refitting and classifier-only recalibration gave similar cohort means. Together, the two datasets quantify the contributions of spatial refitting and alignment within their respective implementations.</w:t>
+      </w:r>
+    </w:p>
+    <w:p>
+      <w:pPr>
+        <w:pStyle w:val="BodyText"/>
+      </w:pPr>
+      <w:r>
+        <w:t xml:space="preserve">The neural extension separates another component choice. At the final support cap, fixed-source BN during full weight adaptation produced higher BA and fewer single-class seed/session predictions than adaptive BN in both initialization regimes. Supervised spatial-filter refitting and repeated neural normalization therefore had different effects under the evaluated support schedules.</w:t>
+      </w:r>
+    </w:p>
+    <w:p>
+      <w:pPr>
+        <w:pStyle w:val="BodyText"/>
+      </w:pPr>
+      <w:r>
+        <w:t xml:space="preserve">Prediction transitions explain the spatial gain: refitting corrected more class-balanced errors than it introduced, with improvement in both labels. The gain remained positive in every target-session mean and after every single-participant deletion.</w:t>
       </w:r>
     </w:p>
     <w:bookmarkEnd w:id="54"/>
@@ -2831,7 +2825,7 @@
         <w:pStyle w:val="BodyText"/>
       </w:pPr>
       <w:r>
-        <w:t xml:space="preserve">These details distinguish our information regime from reports using abundant target-domain statistics or continuous online adaptation</w:t>
+        <w:t xml:space="preserve">Reports using abundant target-domain statistics or continuous online adaptation address different information regimes</w:t>
       </w:r>
       <w:r>
         <w:t xml:space="preserve"> </w:t>
@@ -2840,7 +2834,7 @@
         <w:t xml:space="preserve">[12, 13]</w:t>
       </w:r>
       <w:r>
-        <w:t xml:space="preserve">. They also give a focused next hypothesis: when adaptation repeatedly revisits a short support run, normalization mode and exposure count should be controlled independently of label count. A follow-up can vary the BN update schedule while preserving the trained sources, support identities and comparison hierarchy.</w:t>
+        <w:t xml:space="preserve">. Here, repeated passes through a short support run link normalization mode to its update schedule. A follow-up can vary the number of BN updates while holding labels, minibatches and trained sources fixed.</w:t>
       </w:r>
     </w:p>
     <w:bookmarkEnd w:id="55"/>
@@ -2901,7 +2895,7 @@
         <w:pStyle w:val="FirstParagraph"/>
       </w:pPr>
       <w:r>
-        <w:t xml:space="preserve">Original primary-cohort EEGNet BA was 52.92% on source query and 51.58% on target sessions. The extension’s sources likewise showed weak held-out discrimination despite falling training losses. Source generalization therefore contributes to interpreting target performance alongside session transfer.</w:t>
+        <w:t xml:space="preserve">Original primary-cohort EEGNet BA was 52.92% on source query and 51.58% on target sessions. Reporting both endpoints separates source generalization from session transfer. The extension training histories likewise show why source-query performance should accompany target adaptation scores.</w:t>
       </w:r>
     </w:p>
     <w:p>
@@ -2927,15 +2921,15 @@
         <w:pStyle w:val="FirstParagraph"/>
       </w:pPr>
       <w:r>
-        <w:t xml:space="preserve">The study uses Kumar2024 and the independent BNCI2014-001 acquisition. The external dataset provides two days, whereas Kumar provides six sessions. The original primary hierarchy is retained; V2/V3, prediction transitions and sensitivity analyses used previously exposed data. The extension estimates are exploratory, conditional on the recorded source models and support schedules. Pooled teachers share participants and change source-label budgets; the independent sample remains the participant cohort.</w:t>
-      </w:r>
-    </w:p>
-    <w:p>
-      <w:pPr>
-        <w:pStyle w:val="BodyText"/>
-      </w:pPr>
-      <w:r>
-        <w:t xml:space="preserve">Kumar cue-anchored windows may contain cue, imagery, feedback or post-task activity. Phase-specific decoding requires original marker-level reconstruction. Amplitude-restricted queries retained positive spatial gains in eligible participants, while training/support artifacts and other query artifacts remain possible. Zero-phase filtering makes the present endpoint offline.</w:t>
+        <w:t xml:space="preserve">Kumar2024 provides six sessions per participant and BNCI2014-001 two recording days. V2/V3, prediction transitions and sensitivity analyses used previously exposed data and are exploratory. BNCI had historical use in the first-paper project. The external comparison also changed the source-label budget, reference and covariance implementation; separating these factors requires a controlled follow-up. Pooled-source intervals are conditional on the shared teachers, with participants as the independent units.</w:t>
+      </w:r>
+    </w:p>
+    <w:p>
+      <w:pPr>
+        <w:pStyle w:val="BodyText"/>
+      </w:pPr>
+      <w:r>
+        <w:t xml:space="preserve">Kumar cue-anchored windows may contain cue, imagery, feedback or post-task activity. Phase-specific decoding requires original marker-level reconstruction. Amplitude-restricted query analysis retained positive spatial gains in eligible participants; it assessed query sensitivity while leaving training and support signals unchanged. Zero-phase filtering makes the present endpoint offline.</w:t>
       </w:r>
     </w:p>
     <w:p>
@@ -2962,7 +2956,7 @@
         <w:pStyle w:val="FirstParagraph"/>
       </w:pPr>
       <w:r>
-        <w:t xml:space="preserve">Matched-label analysis identified different useful spatial operations across two datasets. In the original Kumar primary cohort, full refitting added 5.47 BA points beyond classifier-only recalibration and supplied 73.7% of the total mean gain over freezing. In BNCI2014-001, full refitting was close to classifier-only recalibration, while support-only EA added 5.65 points beyond full refitting and improved all nine participants. Short-run recalibration should therefore compare the spatial update itself under identical labels. Fixed source normalization reduced single-class neural predictions at the 20-label cap; complete budget profiles and strong geometric references delimit the additional mechanism results.</w:t>
+        <w:t xml:space="preserve">Matched-label analysis quantified gains from two spatial operations during short-run recalibration. In the original Kumar primary cohort, full refitting added 5.47 BA points beyond classifier-only recalibration and supplied 73.7% of the mean total gain over freezing. In BNCI2014-001, support-only EA added 5.65 points beyond full refitting, with improvement in all nine participants; full refitting and classifier-only recalibration gave similar cohort means. Fixed source normalization reduced single-class neural predictions at the 20-label cap. These component comparisons provide a direct way to evaluate how a short calibration run should update the decoder.</w:t>
       </w:r>
     </w:p>
     <w:bookmarkEnd w:id="60"/>

</xml_diff>

<commit_message>
Refine final BMT prose and synchronize reviewed manuscript files
Review the author-selected 97ff9a5 manuscript for repetitive framework claims, process narration and ambiguous cohort attribution. Clarify the fixed label budget and secondary external comparison, preserve all result values, tables, equations, figures and declarations, and update synchronized Word/PDF files, package and verification records.
</commit_message>
<xml_diff>
--- a/manuscript/discovery_revision_20261027/BMT_Manuscript_Review.docx
+++ b/manuscript/discovery_revision_20261027/BMT_Manuscript_Review.docx
@@ -5,9 +5,18 @@
     <w:bookmarkStart w:id="114" w:name="X49b58c788bf15f9a3c20fb3281ba874051f6f74"/>
     <w:p>
       <w:pPr>
-        <w:pStyle w:val="Heading1"/>
-      </w:pPr>
-      <w:r>
+        <w:pStyle w:val="Title"/>
+        <w:keepNext/>
+        <w:keepLines/>
+        <w:spacing w:before="480" w:after="0"/>
+      </w:pPr>
+      <w:r>
+        <w:rPr>
+          <w:rFonts w:ascii="Calibri" w:hAnsi="Calibri"/>
+          <w:b/>
+          <w:color w:val="000000"/>
+          <w:sz w:val="32"/>
+        </w:rPr>
         <w:t xml:space="preserve">Matched-label analysis identifies spatial refitting and alignment gains in motor-imagery EEG</w:t>
       </w:r>
     </w:p>
@@ -112,7 +121,7 @@
         <w:t xml:space="preserve"> </w:t>
       </w:r>
       <w:r>
-        <w:t xml:space="preserve">To determine which spatial update adds value beyond classifier recalibration with 20 current-session labels.</w:t>
+        <w:t xml:space="preserve">To quantify gains from spatial refitting and alignment with up to 20 current-session calibration labels.</w:t>
       </w:r>
     </w:p>
     <w:p>
@@ -130,7 +139,7 @@
         <w:t xml:space="preserve"> </w:t>
       </w:r>
       <w:r>
-        <w:t xml:space="preserve">We compared frozen common spatial patterns and linear discriminant analysis (CSP/LDA), classifier-only recalibration and full refitting in 18 Kumar2024 participants across six sessions. The original primary cohort contained 12 participants. A fixed four-method replication added nine BNCI2014-001 participants and support-only Euclidean alignment (EA-CSP). Updating methods received identical labels within each dataset.</w:t>
+        <w:t xml:space="preserve">We compared frozen common spatial patterns and linear discriminant analysis (CSP/LDA), classifier-only recalibration and full refitting in Kumar2024 (18 participants, six sessions; 12-participant primary cohort). A fixed-budget external comparison in nine BNCI2014-001 participants added support-only Euclidean alignment (EA-CSP). Updating methods received identical labels within each dataset.</w:t>
       </w:r>
     </w:p>
     <w:p>
@@ -148,7 +157,7 @@
         <w:t xml:space="preserve"> </w:t>
       </w:r>
       <w:r>
-        <w:t xml:space="preserve">In Kumar2024, full refitting achieved 65.36% balanced accuracy, 7.42 percentage points above freezing (95% participant-bootstrap interval 2.49–12.48). The secondary full-minus-classifier-only gain was 5.47 points (2.17–8.91), accounting for 73.7% of the mean total gain. In BNCI, EA-CSP achieved 77.50%, improving on full refitting by 5.65 points in the secondary comparison (3.15–8.70; Holm-adjusted p=0.01172), with gains in all nine participants. Full-minus-classifier-only was 0.19 points (−1.85 to 2.13). Fixed source normalization also reduced single-class neural predictions at the 20-label cap.</w:t>
+        <w:t xml:space="preserve">In the Kumar2024 primary cohort, full refitting achieved 65.36% balanced accuracy, 7.42 percentage points above freezing (95% participant-bootstrap interval 2.49–12.48). The secondary full-minus-classifier-only gain was 5.47 points (2.17–8.91), accounting for 73.7% of the mean total gain. In BNCI, EA-CSP achieved 77.50%, improving on full refitting by 5.65 points in the secondary comparison (3.15–8.70; Holm-adjusted p=0.01172), with gains in all nine participants. Full-minus-classifier-only was 0.19 points (−1.85 to 2.13). Fixed source normalization also reduced single-class neural predictions at the 20-label cap.</w:t>
       </w:r>
     </w:p>
     <w:p>
@@ -166,7 +175,7 @@
         <w:t xml:space="preserve"> </w:t>
       </w:r>
       <w:r>
-        <w:t xml:space="preserve">Matched-label comparisons quantify distinct gains from spatial refitting and support-only alignment, providing a direct way to compare decoder updates with limited calibration labels.</w:t>
+        <w:t xml:space="preserve">Spatial refitting in Kumar2024 and support-only alignment in BNCI2014-001 improved recalibration under matched labels.</w:t>
       </w:r>
     </w:p>
     <w:p>
@@ -271,7 +280,7 @@
         <w:t xml:space="preserve">[11]</w:t>
       </w:r>
       <w:r>
-        <w:t xml:space="preserve">. Their prequential procedure predicts a trial, reveals its label, then refits CSP or Riemannian pipelines using expanding, rolling or cold-start histories. Here, each later session is recalibrated from the source-training set and a fixed current-session support run, and full CSP/LDA refitting is compared directly with LDA-only recalibration using identical trial identities. Our comparison measures the additional spatial component at a fixed current-session label budget.</w:t>
+        <w:t xml:space="preserve">. Their prequential procedure predicts a trial, reveals its label, then refits CSP or Riemannian pipelines using expanding, rolling or cold-start histories. Here, each later session is recalibrated from the source-training set and a fixed current-session support run, and full CSP/LDA refitting is compared directly with LDA-only recalibration using identical trial identities.</w:t>
       </w:r>
     </w:p>
     <w:p>
@@ -306,7 +315,7 @@
         <w:t xml:space="preserve">[14–16]</w:t>
       </w:r>
       <w:r>
-        <w:t xml:space="preserve">. Explicitly separating these actions helps explain the resulting predictions.</w:t>
+        <w:t xml:space="preserve">. We compare normalization modes during weight adaptation and test a constraint on source predictions.</w:t>
       </w:r>
     </w:p>
     <w:p>
@@ -315,16 +324,22 @@
       </w:pPr>
       <w:r>
         <w:rPr>
-          <w:b/>
+          <w:b w:val="0"/>
           <w:bCs/>
         </w:rPr>
-        <w:t xml:space="preserve">Matched-label component analysis</w:t>
-      </w:r>
-      <w:r>
-        <w:t xml:space="preserve"> </w:t>
-      </w:r>
-      <w:r>
-        <w:t xml:space="preserve">provides three contributions:</w:t>
+        <w:t xml:space="preserve">The study combines</w:t>
+      </w:r>
+      <w:r>
+        <w:rPr>
+          <w:b w:val="0"/>
+        </w:rPr>
+        <w:t xml:space="preserve"/>
+      </w:r>
+      <w:r>
+        <w:rPr>
+          <w:b w:val="0"/>
+        </w:rPr>
+        <w:t xml:space="preserve"> three analyses:</w:t>
       </w:r>
     </w:p>
     <w:p>
@@ -362,13 +377,13 @@
           <w:b/>
           <w:bCs/>
         </w:rPr>
-        <w:t xml:space="preserve">Prediction-level and longitudinal attribution.</w:t>
-      </w:r>
-      <w:r>
-        <w:t xml:space="preserve"> </w:t>
-      </w:r>
-      <w:r>
-        <w:t xml:space="preserve">Corrected and newly introduced errors reconstruct the component gain, while class recalls, target-session profiles and participant-deletion summaries locate that gain across the longitudinal data.</w:t>
+        <w:t xml:space="preserve">Prediction-level decomposition across sessions and participants.</w:t>
+      </w:r>
+      <w:r>
+        <w:t xml:space="preserve"> </w:t>
+      </w:r>
+      <w:r>
+        <w:t xml:space="preserve">Corrected and newly introduced errors reconstruct the component gain. Class recalls, target-session means and participant-deletion summaries show how the gain is distributed across labels, sessions and participants.</w:t>
       </w:r>
     </w:p>
     <w:p>
@@ -384,13 +399,13 @@
           <w:b/>
           <w:bCs/>
         </w:rPr>
-        <w:t xml:space="preserve">An external comparison of update operations.</w:t>
-      </w:r>
-      <w:r>
-        <w:t xml:space="preserve"> </w:t>
-      </w:r>
-      <w:r>
-        <w:t xml:space="preserve">A fixed nine-participant BNCI2014-001 replication compares the same component contrast with support-only EA-CSP under exactly 20 target labels. Neural normalization and geometric controls locate further operation-specific effects in the development cohort.</w:t>
+        <w:t xml:space="preserve">An external comparison of spatial updates.</w:t>
+      </w:r>
+      <w:r>
+        <w:t xml:space="preserve"> </w:t>
+      </w:r>
+      <w:r>
+        <w:t xml:space="preserve">A fixed nine-participant BNCI2014-001 comparison evaluates LDA-only recalibration, full refitting and support-only EA-CSP with exactly 20 target labels. Development-cohort experiments examine neural normalization and geometric estimation across support budgets.</w:t>
       </w:r>
     </w:p>
     <w:bookmarkEnd w:id="21"/>
@@ -641,7 +656,7 @@
         <w:pStyle w:val="Heading3"/>
       </w:pPr>
       <w:r>
-        <w:t xml:space="preserve">External fixed-budget replication</w:t>
+        <w:t xml:space="preserve">External comparison with a fixed calibration budget</w:t>
       </w:r>
     </w:p>
     <w:p>
@@ -871,15 +886,15 @@
         <w:pStyle w:val="BodyText"/>
       </w:pPr>
       <w:r>
-        <w:t xml:space="preserve">The external replication had one fixed primary contrast, full CSP/LDA minus LDA-only. Its two-sided exact sign-flip test enumerated 512 sign assignments with the observed difference magnitudes. Three secondary contrasts (full minus frozen, LDA-only minus frozen, EA minus full) formed a separate Holm family. Paired participant-bootstrap intervals used 10,000 draws, seed 20261027 and participant order 1–9. Dataset cohorts were analyzed separately.</w:t>
-      </w:r>
-    </w:p>
-    <w:p>
-      <w:pPr>
-        <w:pStyle w:val="BodyText"/>
-      </w:pPr>
-      <w:r>
-        <w:t xml:space="preserve">Saved trial identities, labels and metrics were checked before aggregation. Kumar analyses reused predictions and histories; the external replication generated its own four-method predictions. All external BA values were independently reconstructed from the saved predictions without another model evaluation.</w:t>
+        <w:t xml:space="preserve">The external comparison had one fixed primary contrast, full CSP/LDA minus LDA-only. Its two-sided exact sign-flip test enumerated 512 sign assignments with the observed difference magnitudes. Three secondary contrasts (full minus frozen, LDA-only minus frozen, EA minus full) formed a separate Holm family. Paired participant-bootstrap intervals used 10,000 draws, seed 20261027 and participant order 1–9. Dataset cohorts were analyzed separately.</w:t>
+      </w:r>
+    </w:p>
+    <w:p>
+      <w:pPr>
+        <w:pStyle w:val="BodyText"/>
+      </w:pPr>
+      <w:r>
+        <w:t xml:space="preserve">Saved trial identities, labels and metrics were checked before aggregation. Kumar analyses reused predictions and histories; the external comparison generated its own four-method predictions. All external BA values were independently reconstructed from the saved predictions without another model evaluation.</w:t>
       </w:r>
     </w:p>
     <w:bookmarkEnd w:id="29"/>
@@ -949,6 +964,8 @@
           <w:p>
             <w:pPr>
               <w:pStyle w:val="Compact"/>
+              <w:keepNext/>
+              <w:keepLines/>
               <w:spacing w:after="80"/>
               <w:jc w:val="left"/>
             </w:pPr>
@@ -966,6 +983,8 @@
           <w:p>
             <w:pPr>
               <w:pStyle w:val="Compact"/>
+              <w:keepNext/>
+              <w:keepLines/>
               <w:spacing w:after="80"/>
               <w:jc w:val="right"/>
             </w:pPr>
@@ -983,6 +1002,8 @@
           <w:p>
             <w:pPr>
               <w:pStyle w:val="Compact"/>
+              <w:keepNext/>
+              <w:keepLines/>
               <w:spacing w:after="80"/>
               <w:jc w:val="right"/>
             </w:pPr>
@@ -1000,6 +1021,8 @@
           <w:p>
             <w:pPr>
               <w:pStyle w:val="Compact"/>
+              <w:keepNext/>
+              <w:keepLines/>
               <w:spacing w:after="80"/>
               <w:jc w:val="right"/>
             </w:pPr>
@@ -1017,6 +1040,8 @@
           <w:p>
             <w:pPr>
               <w:pStyle w:val="Compact"/>
+              <w:keepNext/>
+              <w:keepLines/>
               <w:spacing w:after="80"/>
               <w:jc w:val="right"/>
             </w:pPr>
@@ -1034,6 +1059,8 @@
           <w:p>
             <w:pPr>
               <w:pStyle w:val="Compact"/>
+              <w:keepNext/>
+              <w:keepLines/>
               <w:spacing w:after="80"/>
               <w:jc w:val="right"/>
             </w:pPr>
@@ -1051,6 +1078,8 @@
           <w:p>
             <w:pPr>
               <w:pStyle w:val="Compact"/>
+              <w:keepNext/>
+              <w:keepLines/>
               <w:spacing w:after="80"/>
               <w:jc w:val="right"/>
             </w:pPr>
@@ -1070,6 +1099,8 @@
           <w:p>
             <w:pPr>
               <w:pStyle w:val="Compact"/>
+              <w:keepNext/>
+              <w:keepLines/>
               <w:spacing w:after="80"/>
               <w:jc w:val="left"/>
             </w:pPr>
@@ -1086,6 +1117,8 @@
           <w:p>
             <w:pPr>
               <w:pStyle w:val="Compact"/>
+              <w:keepNext/>
+              <w:keepLines/>
               <w:spacing w:after="80"/>
               <w:jc w:val="right"/>
             </w:pPr>
@@ -1102,6 +1135,8 @@
           <w:p>
             <w:pPr>
               <w:pStyle w:val="Compact"/>
+              <w:keepNext/>
+              <w:keepLines/>
               <w:spacing w:after="80"/>
               <w:jc w:val="right"/>
             </w:pPr>
@@ -1118,6 +1153,8 @@
           <w:p>
             <w:pPr>
               <w:pStyle w:val="Compact"/>
+              <w:keepNext/>
+              <w:keepLines/>
               <w:spacing w:after="80"/>
               <w:jc w:val="right"/>
             </w:pPr>
@@ -1134,6 +1171,8 @@
           <w:p>
             <w:pPr>
               <w:pStyle w:val="Compact"/>
+              <w:keepNext/>
+              <w:keepLines/>
               <w:spacing w:after="80"/>
               <w:jc w:val="right"/>
             </w:pPr>
@@ -1150,6 +1189,8 @@
           <w:p>
             <w:pPr>
               <w:pStyle w:val="Compact"/>
+              <w:keepNext/>
+              <w:keepLines/>
               <w:spacing w:after="80"/>
               <w:jc w:val="right"/>
             </w:pPr>
@@ -1166,6 +1207,8 @@
           <w:p>
             <w:pPr>
               <w:pStyle w:val="Compact"/>
+              <w:keepNext/>
+              <w:keepLines/>
               <w:spacing w:after="80"/>
               <w:jc w:val="right"/>
             </w:pPr>
@@ -1184,6 +1227,8 @@
           <w:p>
             <w:pPr>
               <w:pStyle w:val="Compact"/>
+              <w:keepNext/>
+              <w:keepLines/>
               <w:spacing w:after="80"/>
               <w:jc w:val="left"/>
             </w:pPr>
@@ -1200,6 +1245,8 @@
           <w:p>
             <w:pPr>
               <w:pStyle w:val="Compact"/>
+              <w:keepNext/>
+              <w:keepLines/>
               <w:spacing w:after="80"/>
               <w:jc w:val="right"/>
             </w:pPr>
@@ -1216,6 +1263,8 @@
           <w:p>
             <w:pPr>
               <w:pStyle w:val="Compact"/>
+              <w:keepNext/>
+              <w:keepLines/>
               <w:spacing w:after="80"/>
               <w:jc w:val="right"/>
             </w:pPr>
@@ -1232,6 +1281,8 @@
           <w:p>
             <w:pPr>
               <w:pStyle w:val="Compact"/>
+              <w:keepNext/>
+              <w:keepLines/>
               <w:spacing w:after="80"/>
               <w:jc w:val="right"/>
             </w:pPr>
@@ -1248,6 +1299,8 @@
           <w:p>
             <w:pPr>
               <w:pStyle w:val="Compact"/>
+              <w:keepNext/>
+              <w:keepLines/>
               <w:spacing w:after="80"/>
               <w:jc w:val="right"/>
             </w:pPr>
@@ -1264,6 +1317,8 @@
           <w:p>
             <w:pPr>
               <w:pStyle w:val="Compact"/>
+              <w:keepNext/>
+              <w:keepLines/>
               <w:spacing w:after="80"/>
               <w:jc w:val="right"/>
             </w:pPr>
@@ -1280,6 +1335,8 @@
           <w:p>
             <w:pPr>
               <w:pStyle w:val="Compact"/>
+              <w:keepNext/>
+              <w:keepLines/>
               <w:spacing w:after="80"/>
               <w:jc w:val="right"/>
             </w:pPr>
@@ -1298,6 +1355,8 @@
           <w:p>
             <w:pPr>
               <w:pStyle w:val="Compact"/>
+              <w:keepNext w:val="0"/>
+              <w:keepLines/>
               <w:spacing w:after="80"/>
               <w:jc w:val="left"/>
             </w:pPr>
@@ -1314,6 +1373,8 @@
           <w:p>
             <w:pPr>
               <w:pStyle w:val="Compact"/>
+              <w:keepNext w:val="0"/>
+              <w:keepLines/>
               <w:spacing w:after="80"/>
               <w:jc w:val="right"/>
             </w:pPr>
@@ -1330,6 +1391,8 @@
           <w:p>
             <w:pPr>
               <w:pStyle w:val="Compact"/>
+              <w:keepNext w:val="0"/>
+              <w:keepLines/>
               <w:spacing w:after="80"/>
               <w:jc w:val="right"/>
             </w:pPr>
@@ -1346,6 +1409,8 @@
           <w:p>
             <w:pPr>
               <w:pStyle w:val="Compact"/>
+              <w:keepNext w:val="0"/>
+              <w:keepLines/>
               <w:spacing w:after="80"/>
               <w:jc w:val="right"/>
             </w:pPr>
@@ -1362,6 +1427,8 @@
           <w:p>
             <w:pPr>
               <w:pStyle w:val="Compact"/>
+              <w:keepNext w:val="0"/>
+              <w:keepLines/>
               <w:spacing w:after="80"/>
               <w:jc w:val="right"/>
             </w:pPr>
@@ -1378,6 +1445,8 @@
           <w:p>
             <w:pPr>
               <w:pStyle w:val="Compact"/>
+              <w:keepNext w:val="0"/>
+              <w:keepLines/>
               <w:spacing w:after="80"/>
               <w:jc w:val="right"/>
             </w:pPr>
@@ -1394,6 +1463,8 @@
           <w:p>
             <w:pPr>
               <w:pStyle w:val="Compact"/>
+              <w:keepNext w:val="0"/>
+              <w:keepLines/>
               <w:spacing w:after="80"/>
               <w:jc w:val="right"/>
             </w:pPr>
@@ -1420,7 +1491,7 @@
         <w:pStyle w:val="BodyText"/>
       </w:pPr>
       <w:r>
-        <w:t xml:space="preserve">The component gain reflected 16.04 BA points of corrected errors against 10.57 points of newly introduced errors on the same query trials. Mean left- and right-class recall increased by 6.16 and 4.78 points, respectively. These recall intervals individually included zero; their class-balanced mean gives the observed component endpoint. The added spatial update was positive in ten of 12 participant averages and every target-session cohort average: +3.52, +5.20, +4.13, +4.18 and +10.33 points. Every single-participant deletion mean remained positive, between +4.39 and +6.28 points.</w:t>
+        <w:t xml:space="preserve">The component gain reflected 16.04 BA points of corrected errors against 10.57 points of newly introduced errors on the same query trials. Mean left- and right-class recall changes were +6.16 and +4.78 points, respectively, with both class-specific intervals including zero. Their class-balanced mean gives the observed component endpoint. The added spatial update was positive in ten of 12 participant averages and every target-session cohort average: +3.52, +5.20, +4.13, +4.18 and +10.33 points. Every single-participant deletion mean remained positive, between +4.39 and +6.28 points.</w:t>
       </w:r>
     </w:p>
     <w:p>
@@ -1434,6 +1505,7 @@
     <w:p>
       <w:pPr>
         <w:pStyle w:val="BodyText"/>
+        <w:keepNext/>
       </w:pPr>
       <w:r>
         <w:drawing>
@@ -1481,6 +1553,7 @@
     <w:p>
       <w:pPr>
         <w:pStyle w:val="BodyText"/>
+        <w:keepLines/>
       </w:pPr>
       <w:r>
         <w:rPr>
@@ -1503,7 +1576,7 @@
         <w:pStyle w:val="Heading3"/>
       </w:pPr>
       <w:r>
-        <w:t xml:space="preserve">EA-CSP provided a strong conventional reference</w:t>
+        <w:t xml:space="preserve">Covariance mixing and EA-CSP under matched labels</w:t>
       </w:r>
     </w:p>
     <w:p>
@@ -1511,15 +1584,7 @@
         <w:pStyle w:val="FirstParagraph"/>
       </w:pPr>
       <w:r>
-        <w:t xml:space="preserve">In the six-participant V2 extension at the 20-label cap, frozen classical decoding achieved 62.15% BA, LDA-only 67.30%, full CSP/LDA 68.65% and EA-CSP 70.37%. The covariance-mixture candidate achieved 69.24%. The candidate improved on frozen decoding by +7.09 points (4.12–11.55). Its prespecified comparison with EA-CSP was −1.14 points (−3.52–1.14). EA-CSP therefore provided the stronger conventional reference for the next experiment.</w:t>
-      </w:r>
-    </w:p>
-    <w:p>
-      <w:pPr>
-        <w:pStyle w:val="BodyText"/>
-      </w:pPr>
-      <w:r>
-        <w:t xml:space="preserve">These results motivated the source-fixed feature and component controls in V3.</w:t>
+        <w:t xml:space="preserve">In the six-participant V2 extension at the 20-label cap, frozen classical decoding achieved 62.15% BA, LDA-only 67.30%, full CSP/LDA 68.65% and EA-CSP 70.37%. The covariance-mixture candidate achieved 69.24%. The candidate improved on frozen decoding by +7.09 points (4.12–11.55). Its prespecified comparison with EA-CSP was −1.14 points (−3.52–1.14).</w:t>
       </w:r>
     </w:p>
     <w:bookmarkEnd w:id="35"/>
@@ -1529,7 +1594,7 @@
         <w:pStyle w:val="Heading3"/>
       </w:pPr>
       <w:r>
-        <w:t xml:space="preserve">Tangent refitting and EA-CSP gave higher geometric-decoder accuracy</w:t>
+        <w:t xml:space="preserve">Geometric estimation in a fixed tangent feature space</w:t>
       </w:r>
     </w:p>
     <w:p>
@@ -1942,6 +2007,7 @@
     <w:p>
       <w:pPr>
         <w:pStyle w:val="BodyText"/>
+        <w:keepNext/>
       </w:pPr>
       <w:r>
         <w:drawing>
@@ -1989,6 +2055,7 @@
     <w:p>
       <w:pPr>
         <w:pStyle w:val="BodyText"/>
+        <w:keepLines/>
       </w:pPr>
       <w:r>
         <w:rPr>
@@ -2001,7 +2068,7 @@
         <w:t xml:space="preserve"> </w:t>
       </w:r>
       <w:r>
-        <w:t xml:space="preserve">Full support-budget profiles and cap-20 paired contrasts retain ordinary tangent refitting and EA-CSP as strong references. Ablations separate posterior mean estimation, prediction covariance, source-mean noise and common/contrast variation scales. All candidate-versus-ablation and strong-reference contrasts are displayed together; intervals use participant-bootstrap resampling.</w:t>
+        <w:t xml:space="preserve">Curves show BA across support budgets; paired cap-20 contrasts compare the candidate with tangent refitting, EA-CSP and matched ablations. Ablations vary posterior mean estimation, predictive covariance, source-mean noise and common/contrast shift scales. Intervals are participant-bootstrap summaries.</w:t>
       </w:r>
     </w:p>
     <w:bookmarkEnd w:id="39"/>
@@ -2019,7 +2086,7 @@
         <w:pStyle w:val="FirstParagraph"/>
       </w:pPr>
       <w:r>
-        <w:t xml:space="preserve">At the 20-label cap, fixed-BN full updates produced eight single-class query predictions among 90 nested participant-by-seed-by-session outcomes, compared with 16 under adaptive BN. Pooled-source counts were zero and 18, respectively. Fixed-BN BA was 57.51%, versus 56.01% for adaptive BN with individual sources, a difference of 1.50 points (0.33–2.74). Pooled-source values were 56.22% and 54.31%, a difference of 1.91 points (0.76–3.24; Table 3). Five of six participant differences favored fixed BN in each regime; the remaining difference was negative for individual sources and approximately zero for pooled sources. All participant-deletion mean contrasts stayed positive at this cap.</w:t>
+        <w:t xml:space="preserve">At the 20-label cap, fixed-BN full updates predicted a single class in eight of 90 participant-by-seed-by-session query sets, compared with 16 for adaptive BN. Pooled-source counts were zero and 18, respectively. Fixed-BN BA was 57.51%, versus 56.01% for adaptive BN with individual sources, a difference of 1.50 points (0.33–2.74). Pooled-source values were 56.22% and 54.31%, a difference of 1.91 points (0.76–3.24; Table 3). Five of six participant differences favored fixed BN in each regime; the remaining difference was negative for individual sources and approximately zero for pooled sources. All participant-deletion mean contrasts stayed positive at this cap.</w:t>
       </w:r>
     </w:p>
     <w:p>
@@ -2472,6 +2539,7 @@
     <w:p>
       <w:pPr>
         <w:pStyle w:val="BodyText"/>
+        <w:keepNext/>
       </w:pPr>
       <w:r>
         <w:drawing>
@@ -2519,6 +2587,7 @@
     <w:p>
       <w:pPr>
         <w:pStyle w:val="BodyText"/>
+        <w:keepLines/>
       </w:pPr>
       <w:r>
         <w:rPr>
@@ -2549,15 +2618,15 @@
         <w:pStyle w:val="FirstParagraph"/>
       </w:pPr>
       <w:r>
-        <w:t xml:space="preserve">Frozen individual-source models achieved 56.74% target BA, compared with 55.26% for pooled-source models, a pooled-minus-individual difference of −1.48 points (−2.90 to −0.20). Source-query BA was 56.11% and 57.78%, respectively. Source-query measurements provide the within-domain reference for interpreting target performance.</w:t>
-      </w:r>
-    </w:p>
-    <w:p>
-      <w:pPr>
-        <w:pStyle w:val="BodyText"/>
-      </w:pPr>
-      <w:r>
-        <w:t xml:space="preserve">The three pooled models selected epochs 14, 20 and 17 by validation loss. Their final training losses were approximately 0.20–0.22, while final validation losses were 0.91–0.96, above the selected validation losses near 0.68. Training and validation loss diverged after the validation-selected epochs.</w:t>
+        <w:t xml:space="preserve">Frozen individual-source models achieved 56.74% target BA, compared with 55.26% for pooled-source models, a pooled-minus-individual difference of −1.48 points (−2.90 to −0.20). Source-query BA was 56.11% and 57.78%, respectively.</w:t>
+      </w:r>
+    </w:p>
+    <w:p>
+      <w:pPr>
+        <w:pStyle w:val="BodyText"/>
+      </w:pPr>
+      <w:r>
+        <w:t xml:space="preserve">The three pooled models selected epochs 14, 20 and 17 by validation loss. Their final training losses were approximately 0.20–0.22, while final validation losses were 0.91–0.96, above the selected validation losses near 0.68.</w:t>
       </w:r>
     </w:p>
     <w:p>
@@ -2583,12 +2652,13 @@
         <w:pStyle w:val="FirstParagraph"/>
       </w:pPr>
       <w:r>
-        <w:t xml:space="preserve">The full synthetic grid contained 172,800 numeric method-by-condition-by-repetition results. Equal-grid BA was 70.36% for the candidate and 76.19% for tangent refitting, a difference of −5.83 points; 376 of 384 scenario means favored refitting. Candidate feature-mean squared error was also larger. Adding posterior covariance to identical candidate means reduced mean cross entropy by 0.341 but changed BA by −0.04 points. Thus, the probability-score improvement and classification endpoint moved differently (Figure 4).</w:t>
-      </w:r>
-    </w:p>
-    <w:p>
-      <w:pPr>
-        <w:pStyle w:val="BodyText"/>
+        <w:t xml:space="preserve">The full synthetic grid contained 172,800 numeric method-by-condition-by-repetition results. Equal-grid BA was 70.36% for the candidate and 76.19% for tangent refitting, a difference of −5.83 points; 376 of 384 scenario means favored refitting. Candidate feature-mean squared error was also larger. Adding posterior covariance to identical candidate means reduced mean cross entropy by 0.341 but changed BA by −0.04 points. Posterior covariance improved log loss for the same estimated means, with little change in classification accuracy (Figure 4).</w:t>
+      </w:r>
+    </w:p>
+    <w:p>
+      <w:pPr>
+        <w:pStyle w:val="BodyText"/>
+        <w:keepNext/>
       </w:pPr>
       <w:r>
         <w:drawing>
@@ -2636,6 +2706,7 @@
     <w:p>
       <w:pPr>
         <w:pStyle w:val="BodyText"/>
+        <w:keepLines/>
       </w:pPr>
       <w:r>
         <w:rPr>
@@ -2680,6 +2751,7 @@
     <w:p>
       <w:pPr>
         <w:pStyle w:val="BodyText"/>
+        <w:keepNext/>
       </w:pPr>
       <w:r>
         <w:drawing>
@@ -2727,6 +2799,7 @@
     <w:p>
       <w:pPr>
         <w:pStyle w:val="BodyText"/>
+        <w:keepLines/>
       </w:pPr>
       <w:r>
         <w:rPr>
@@ -2759,7 +2832,7 @@
         <w:pStyle w:val="Heading3"/>
       </w:pPr>
       <w:r>
-        <w:t xml:space="preserve">Matched-label analysis identifies the spatial contribution</w:t>
+        <w:t xml:space="preserve">Gains from spatial refitting and alignment</w:t>
       </w:r>
     </w:p>
     <w:p>
@@ -2767,23 +2840,23 @@
         <w:pStyle w:val="FirstParagraph"/>
       </w:pPr>
       <w:r>
-        <w:t xml:space="preserve">Matching source and current-session labels locates recalibration gains in specific decoder components. Full CSP/LDA refitting added 5.47 BA points beyond classifier-only recalibration in the original primary cohort and supplied 73.7% of the mean improvement over freezing. The comparison measures the value of relearning the spatial representation after the classifier has received the same calibration labels.</w:t>
-      </w:r>
-    </w:p>
-    <w:p>
-      <w:pPr>
-        <w:pStyle w:val="BodyText"/>
-      </w:pPr>
-      <w:r>
-        <w:t xml:space="preserve">The external experiment identifies support-only alignment as a useful additional operation. With the same 20 current labels, EA improved on full refitting in all nine participants, while full refitting and classifier-only recalibration gave similar cohort means. Together, the two datasets quantify the contributions of spatial refitting and alignment within their respective implementations.</w:t>
-      </w:r>
-    </w:p>
-    <w:p>
-      <w:pPr>
-        <w:pStyle w:val="BodyText"/>
-      </w:pPr>
-      <w:r>
-        <w:t xml:space="preserve">The neural extension separates another component choice. At the final support cap, fixed-source BN during full weight adaptation produced higher BA and fewer single-class seed/session predictions than adaptive BN in both initialization regimes. Supervised spatial-filter refitting and repeated neural normalization therefore had different effects under the evaluated support schedules.</w:t>
+        <w:t xml:space="preserve">Full CSP/LDA refitting added 5.47 BA points beyond classifier-only recalibration in the original primary cohort and supplied 73.7% of the mean improvement over freezing. Because both updates used identical source and support trials, this contrast measures the gain from relearning the spatial representation together with the classifier.</w:t>
+      </w:r>
+    </w:p>
+    <w:p>
+      <w:pPr>
+        <w:pStyle w:val="BodyText"/>
+      </w:pPr>
+      <w:r>
+        <w:t xml:space="preserve">In BNCI2014-001, EA improved on full refitting in all nine participants using the same 20 current labels, while full refitting and classifier-only recalibration gave similar cohort means. The two comparisons measure separate additions to recalibration: spatial refitting beyond LDA-only in Kumar2024, and alignment beyond full refitting in BNCI2014-001.</w:t>
+      </w:r>
+    </w:p>
+    <w:p>
+      <w:pPr>
+        <w:pStyle w:val="BodyText"/>
+      </w:pPr>
+      <w:r>
+        <w:t xml:space="preserve">At the 20-label cap, fixed-source BN during full weight adaptation produced higher BA and fewer single-class seed/session predictions than adaptive BN in both initialization regimes.</w:t>
       </w:r>
     </w:p>
     <w:p>
@@ -2834,7 +2907,7 @@
         <w:t xml:space="preserve">[12, 13]</w:t>
       </w:r>
       <w:r>
-        <w:t xml:space="preserve">. Here, repeated passes through a short support run link normalization mode to its update schedule. A follow-up can vary the number of BN updates while holding labels, minibatches and trained sources fixed.</w:t>
+        <w:t xml:space="preserve">. Here, repeated passes through a short support run link normalization mode to its update schedule.</w:t>
       </w:r>
     </w:p>
     <w:bookmarkEnd w:id="55"/>
@@ -2844,7 +2917,7 @@
         <w:pStyle w:val="Heading3"/>
       </w:pPr>
       <w:r>
-        <w:t xml:space="preserve">Strong references guide estimator comparisons</w:t>
+        <w:t xml:space="preserve">Spatial alignment and predictive covariance</w:t>
       </w:r>
     </w:p>
     <w:p>
@@ -2852,7 +2925,7 @@
         <w:pStyle w:val="FirstParagraph"/>
       </w:pPr>
       <w:r>
-        <w:t xml:space="preserve">EA-CSP had higher mean BA than the V2 covariance-mixture candidate and the V3 uncertainty-aware candidate. Ordinary tangent refitting also had higher BA in the candidate’s own feature family. EA-CSP and tangent refitting therefore provide practical references for evaluating additional adaptation machinery on these data.</w:t>
+        <w:t xml:space="preserve">EA-CSP had higher mean BA than the V2 covariance-mixture candidate and the V3 uncertainty-aware candidate. Ordinary tangent refitting also achieved higher BA within the same tangent feature space. These comparisons place the candidate’s mean and covariance updates against EA-CSP and tangent refitting.</w:t>
       </w:r>
     </w:p>
     <w:p>
@@ -2877,7 +2950,7 @@
         <w:t xml:space="preserve">[7, 14–16]</w:t>
       </w:r>
       <w:r>
-        <w:t xml:space="preserve">. The present evidence identifies their value through explicit information budgets and matched component comparisons.</w:t>
+        <w:t xml:space="preserve">.</w:t>
       </w:r>
     </w:p>
     <w:bookmarkEnd w:id="56"/>
@@ -2895,7 +2968,7 @@
         <w:pStyle w:val="FirstParagraph"/>
       </w:pPr>
       <w:r>
-        <w:t xml:space="preserve">Original primary-cohort EEGNet BA was 52.92% on source query and 51.58% on target sessions. Reporting both endpoints separates source generalization from session transfer. The extension training histories likewise show why source-query performance should accompany target adaptation scores.</w:t>
+        <w:t xml:space="preserve">Original primary-cohort EEGNet BA was 52.92% on source query and 51.58% on target sessions. The source-query endpoint gives the reference accuracy before session transfer. In the extension, validation loss increased after the selected epochs despite continued training-loss reduction.</w:t>
       </w:r>
     </w:p>
     <w:p>
@@ -2956,7 +3029,7 @@
         <w:pStyle w:val="FirstParagraph"/>
       </w:pPr>
       <w:r>
-        <w:t xml:space="preserve">Matched-label analysis quantified gains from two spatial operations during short-run recalibration. In the original Kumar primary cohort, full refitting added 5.47 BA points beyond classifier-only recalibration and supplied 73.7% of the mean total gain over freezing. In BNCI2014-001, support-only EA added 5.65 points beyond full refitting, with improvement in all nine participants; full refitting and classifier-only recalibration gave similar cohort means. Fixed source normalization reduced single-class neural predictions at the 20-label cap. These component comparisons provide a direct way to evaluate how a short calibration run should update the decoder.</w:t>
+        <w:t xml:space="preserve">In the original Kumar primary cohort, full refitting added 5.47 BA points beyond classifier-only recalibration and supplied 73.7% of the mean total gain over freezing. In BNCI2014-001, support-only EA added 5.65 points beyond full refitting, with improvement in all nine participants; full refitting and classifier-only recalibration gave similar cohort means. Fixed source normalization reduced single-class neural predictions at the 20-label cap. These results support evaluating spatial refitting and alignment separately under a fixed calibration budget.</w:t>
       </w:r>
     </w:p>
     <w:bookmarkEnd w:id="60"/>

</xml_diff>